<commit_message>
Update kravspecific and kravanalyse
</commit_message>
<xml_diff>
--- a/documentation/KravSpec/Bilag1_Kravanalyse.docx
+++ b/documentation/KravSpec/Bilag1_Kravanalyse.docx
@@ -253,18 +253,29 @@
           <w:p>
             <w:pPr>
               <w:pStyle w:val="TableContents"/>
-              <w:spacing w:before="0" w:after="160"/>
-              <w:rPr>
-                <w:rFonts w:ascii="Liberation Sans" w:hAnsi="Liberation Sans" w:eastAsia="DejaVu Sans" w:cs="DejaVu Sans"/>
-                <w:sz w:val="24"/>
-                <w:szCs w:val="24"/>
-              </w:rPr>
-            </w:pPr>
-            <w:r>
-              <w:rPr>
-                <w:rFonts w:eastAsia="DejaVu Sans" w:cs="DejaVu Sans" w:ascii="Liberation Sans" w:hAnsi="Liberation Sans"/>
-                <w:sz w:val="24"/>
-                <w:szCs w:val="24"/>
+              <w:suppressAutoHyphens w:val="true"/>
+              <w:bidi w:val="0"/>
+              <w:spacing w:lineRule="auto" w:line="259" w:before="0" w:after="160"/>
+              <w:jc w:val="start"/>
+              <w:rPr>
+                <w:rFonts w:ascii="Liberation Sans" w:hAnsi="Liberation Sans" w:eastAsia="DejaVu Sans" w:cs="DejaVu Sans"/>
+                <w:color w:val="auto"/>
+                <w:kern w:val="2"/>
+                <w:sz w:val="24"/>
+                <w:szCs w:val="24"/>
+                <w:lang w:val="da-DK" w:eastAsia="en-US" w:bidi="ar-SA"/>
+                <w14:ligatures w14:val="standardContextual"/>
+              </w:rPr>
+            </w:pPr>
+            <w:r>
+              <w:rPr>
+                <w:rFonts w:eastAsia="DejaVu Sans" w:cs="DejaVu Sans" w:ascii="Liberation Sans" w:hAnsi="Liberation Sans"/>
+                <w:color w:val="auto"/>
+                <w:kern w:val="2"/>
+                <w:sz w:val="24"/>
+                <w:szCs w:val="24"/>
+                <w:lang w:val="da-DK" w:eastAsia="en-US" w:bidi="ar-SA"/>
+                <w14:ligatures w14:val="standardContextual"/>
               </w:rPr>
               <w:t>K-001</w:t>
             </w:r>
@@ -281,19 +292,29 @@
           <w:p>
             <w:pPr>
               <w:pStyle w:val="TableContents"/>
-              <w:bidi w:val="0"/>
-              <w:spacing w:lineRule="auto" w:line="259" w:before="0" w:after="160"/>
-              <w:rPr>
-                <w:rFonts w:ascii="Liberation Sans" w:hAnsi="Liberation Sans" w:eastAsia="DejaVu Sans" w:cs="DejaVu Sans"/>
-                <w:sz w:val="24"/>
-                <w:szCs w:val="24"/>
-              </w:rPr>
-            </w:pPr>
-            <w:r>
-              <w:rPr>
-                <w:rFonts w:eastAsia="DejaVu Sans" w:cs="DejaVu Sans" w:ascii="Liberation Sans" w:hAnsi="Liberation Sans"/>
-                <w:sz w:val="24"/>
-                <w:szCs w:val="24"/>
+              <w:suppressAutoHyphens w:val="true"/>
+              <w:bidi w:val="0"/>
+              <w:spacing w:lineRule="auto" w:line="259" w:before="0" w:after="160"/>
+              <w:jc w:val="start"/>
+              <w:rPr>
+                <w:rFonts w:ascii="Liberation Sans" w:hAnsi="Liberation Sans" w:eastAsia="DejaVu Sans" w:cs="DejaVu Sans"/>
+                <w:color w:val="auto"/>
+                <w:kern w:val="2"/>
+                <w:sz w:val="24"/>
+                <w:szCs w:val="24"/>
+                <w:lang w:val="da-DK" w:eastAsia="en-US" w:bidi="ar-SA"/>
+                <w14:ligatures w14:val="standardContextual"/>
+              </w:rPr>
+            </w:pPr>
+            <w:r>
+              <w:rPr>
+                <w:rFonts w:eastAsia="DejaVu Sans" w:cs="DejaVu Sans" w:ascii="Liberation Sans" w:hAnsi="Liberation Sans"/>
+                <w:color w:val="auto"/>
+                <w:kern w:val="2"/>
+                <w:sz w:val="24"/>
+                <w:szCs w:val="24"/>
+                <w:lang w:val="da-DK" w:eastAsia="en-US" w:bidi="ar-SA"/>
+                <w14:ligatures w14:val="standardContextual"/>
               </w:rPr>
               <w:t>Måling</w:t>
             </w:r>
@@ -310,26 +331,34 @@
           <w:p>
             <w:pPr>
               <w:pStyle w:val="TableContents"/>
-              <w:bidi w:val="0"/>
-              <w:spacing w:lineRule="auto" w:line="259" w:before="0" w:after="160"/>
-              <w:rPr>
-                <w:rFonts w:ascii="Liberation Sans" w:hAnsi="Liberation Sans" w:eastAsia="DejaVu Sans" w:cs="DejaVu Sans"/>
-              </w:rPr>
-            </w:pPr>
-            <w:r>
-              <w:rPr>
-                <w:rFonts w:eastAsia="DejaVu Sans" w:cs="DejaVu Sans" w:ascii="Nimbus Sans" w:hAnsi="Nimbus Sans"/>
-                <w:sz w:val="24"/>
-                <w:szCs w:val="24"/>
+              <w:suppressAutoHyphens w:val="true"/>
+              <w:bidi w:val="0"/>
+              <w:spacing w:lineRule="auto" w:line="259" w:before="0" w:after="160"/>
+              <w:jc w:val="start"/>
+              <w:rPr/>
+            </w:pPr>
+            <w:r>
+              <w:rPr>
+                <w:rFonts w:eastAsia="DejaVu Sans" w:cs="DejaVu Sans" w:ascii="Liberation Sans" w:hAnsi="Liberation Sans"/>
+                <w:color w:val="auto"/>
+                <w:kern w:val="2"/>
+                <w:sz w:val="24"/>
+                <w:szCs w:val="24"/>
+                <w:lang w:val="da-DK" w:eastAsia="en-US" w:bidi="ar-SA"/>
+                <w14:ligatures w14:val="standardContextual"/>
               </w:rPr>
               <w:t>L</w:t>
             </w:r>
             <w:r>
               <w:rPr>
                 <w:rStyle w:val="SourceText"/>
-                <w:rFonts w:ascii="Nimbus Sans" w:hAnsi="Nimbus Sans"/>
-                <w:sz w:val="24"/>
-                <w:szCs w:val="24"/>
+                <w:rFonts w:eastAsia="DejaVu Sans" w:cs="DejaVu Sans" w:ascii="Liberation Sans" w:hAnsi="Liberation Sans"/>
+                <w:color w:val="auto"/>
+                <w:kern w:val="2"/>
+                <w:sz w:val="24"/>
+                <w:szCs w:val="24"/>
+                <w:lang w:val="da-DK" w:eastAsia="en-US" w:bidi="ar-SA"/>
+                <w14:ligatures w14:val="standardContextual"/>
               </w:rPr>
               <w:t>uftfugtigheden måles og anvendes som grundlag for styring</w:t>
             </w:r>
@@ -346,18 +375,29 @@
           <w:p>
             <w:pPr>
               <w:pStyle w:val="TableContents"/>
-              <w:spacing w:before="0" w:after="160"/>
-              <w:rPr>
-                <w:rFonts w:ascii="Liberation Sans" w:hAnsi="Liberation Sans" w:eastAsia="DejaVu Sans" w:cs="DejaVu Sans"/>
-                <w:sz w:val="24"/>
-                <w:szCs w:val="24"/>
-              </w:rPr>
-            </w:pPr>
-            <w:r>
-              <w:rPr>
-                <w:rFonts w:eastAsia="DejaVu Sans" w:cs="DejaVu Sans" w:ascii="Liberation Sans" w:hAnsi="Liberation Sans"/>
-                <w:sz w:val="24"/>
-                <w:szCs w:val="24"/>
+              <w:suppressAutoHyphens w:val="true"/>
+              <w:bidi w:val="0"/>
+              <w:spacing w:lineRule="auto" w:line="259" w:before="0" w:after="160"/>
+              <w:jc w:val="start"/>
+              <w:rPr>
+                <w:rFonts w:ascii="Liberation Sans" w:hAnsi="Liberation Sans" w:eastAsia="DejaVu Sans" w:cs="DejaVu Sans"/>
+                <w:color w:val="auto"/>
+                <w:kern w:val="2"/>
+                <w:sz w:val="24"/>
+                <w:szCs w:val="24"/>
+                <w:lang w:val="da-DK" w:eastAsia="en-US" w:bidi="ar-SA"/>
+                <w14:ligatures w14:val="standardContextual"/>
+              </w:rPr>
+            </w:pPr>
+            <w:r>
+              <w:rPr>
+                <w:rFonts w:eastAsia="DejaVu Sans" w:cs="DejaVu Sans" w:ascii="Liberation Sans" w:hAnsi="Liberation Sans"/>
+                <w:color w:val="auto"/>
+                <w:kern w:val="2"/>
+                <w:sz w:val="24"/>
+                <w:szCs w:val="24"/>
+                <w:lang w:val="da-DK" w:eastAsia="en-US" w:bidi="ar-SA"/>
+                <w14:ligatures w14:val="standardContextual"/>
               </w:rPr>
               <w:t>Funktionelt</w:t>
             </w:r>
@@ -374,20 +414,31 @@
           <w:p>
             <w:pPr>
               <w:pStyle w:val="TableContents"/>
-              <w:spacing w:before="0" w:after="160"/>
-              <w:rPr>
-                <w:rFonts w:ascii="Liberation Sans" w:hAnsi="Liberation Sans" w:eastAsia="DejaVu Sans" w:cs="DejaVu Sans"/>
-                <w:sz w:val="24"/>
-                <w:szCs w:val="24"/>
-              </w:rPr>
-            </w:pPr>
-            <w:r>
-              <w:rPr>
-                <w:rFonts w:eastAsia="DejaVu Sans" w:cs="DejaVu Sans" w:ascii="Liberation Sans" w:hAnsi="Liberation Sans"/>
-                <w:sz w:val="24"/>
-                <w:szCs w:val="24"/>
-              </w:rPr>
-              <w:t>Systemet skal måle luftfugtigheden med et fast interval.</w:t>
+              <w:suppressAutoHyphens w:val="true"/>
+              <w:bidi w:val="0"/>
+              <w:spacing w:lineRule="auto" w:line="259" w:before="0" w:after="160"/>
+              <w:jc w:val="start"/>
+              <w:rPr>
+                <w:rFonts w:ascii="Liberation Sans" w:hAnsi="Liberation Sans" w:eastAsia="DejaVu Sans" w:cs="DejaVu Sans"/>
+                <w:color w:val="auto"/>
+                <w:kern w:val="2"/>
+                <w:sz w:val="24"/>
+                <w:szCs w:val="24"/>
+                <w:lang w:val="da-DK" w:eastAsia="en-US" w:bidi="ar-SA"/>
+                <w14:ligatures w14:val="standardContextual"/>
+              </w:rPr>
+            </w:pPr>
+            <w:r>
+              <w:rPr>
+                <w:rFonts w:eastAsia="DejaVu Sans" w:cs="DejaVu Sans" w:ascii="Liberation Sans" w:hAnsi="Liberation Sans"/>
+                <w:color w:val="auto"/>
+                <w:kern w:val="2"/>
+                <w:sz w:val="24"/>
+                <w:szCs w:val="24"/>
+                <w:lang w:val="da-DK" w:eastAsia="en-US" w:bidi="ar-SA"/>
+                <w14:ligatures w14:val="standardContextual"/>
+              </w:rPr>
+              <w:t>Systemet skal måle luftfugtigheden mindst hvert [60.] sekund</w:t>
             </w:r>
           </w:p>
         </w:tc>
@@ -402,18 +453,29 @@
           <w:p>
             <w:pPr>
               <w:pStyle w:val="TableContents"/>
-              <w:spacing w:before="0" w:after="160"/>
-              <w:rPr>
-                <w:rFonts w:ascii="Liberation Sans" w:hAnsi="Liberation Sans" w:eastAsia="DejaVu Sans" w:cs="DejaVu Sans"/>
-                <w:sz w:val="24"/>
-                <w:szCs w:val="24"/>
-              </w:rPr>
-            </w:pPr>
-            <w:r>
-              <w:rPr>
-                <w:rFonts w:eastAsia="DejaVu Sans" w:cs="DejaVu Sans" w:ascii="Liberation Sans" w:hAnsi="Liberation Sans"/>
-                <w:sz w:val="24"/>
-                <w:szCs w:val="24"/>
+              <w:suppressAutoHyphens w:val="true"/>
+              <w:bidi w:val="0"/>
+              <w:spacing w:lineRule="auto" w:line="259" w:before="0" w:after="160"/>
+              <w:jc w:val="start"/>
+              <w:rPr>
+                <w:rFonts w:ascii="Liberation Sans" w:hAnsi="Liberation Sans" w:eastAsia="DejaVu Sans" w:cs="DejaVu Sans"/>
+                <w:color w:val="auto"/>
+                <w:kern w:val="2"/>
+                <w:sz w:val="24"/>
+                <w:szCs w:val="24"/>
+                <w:lang w:val="da-DK" w:eastAsia="en-US" w:bidi="ar-SA"/>
+                <w14:ligatures w14:val="standardContextual"/>
+              </w:rPr>
+            </w:pPr>
+            <w:r>
+              <w:rPr>
+                <w:rFonts w:eastAsia="DejaVu Sans" w:cs="DejaVu Sans" w:ascii="Liberation Sans" w:hAnsi="Liberation Sans"/>
+                <w:color w:val="auto"/>
+                <w:kern w:val="2"/>
+                <w:sz w:val="24"/>
+                <w:szCs w:val="24"/>
+                <w:lang w:val="da-DK" w:eastAsia="en-US" w:bidi="ar-SA"/>
+                <w14:ligatures w14:val="standardContextual"/>
               </w:rPr>
               <w:t>Hvor ofte?Hvilken sensortype? Placering?</w:t>
             </w:r>
@@ -433,18 +495,29 @@
           <w:p>
             <w:pPr>
               <w:pStyle w:val="TableContents"/>
-              <w:spacing w:before="0" w:after="160"/>
-              <w:rPr>
-                <w:rFonts w:ascii="Liberation Sans" w:hAnsi="Liberation Sans" w:eastAsia="DejaVu Sans" w:cs="DejaVu Sans"/>
-                <w:sz w:val="24"/>
-                <w:szCs w:val="24"/>
-              </w:rPr>
-            </w:pPr>
-            <w:r>
-              <w:rPr>
-                <w:rFonts w:eastAsia="DejaVu Sans" w:cs="DejaVu Sans" w:ascii="Liberation Sans" w:hAnsi="Liberation Sans"/>
-                <w:sz w:val="24"/>
-                <w:szCs w:val="24"/>
+              <w:suppressAutoHyphens w:val="true"/>
+              <w:bidi w:val="0"/>
+              <w:spacing w:lineRule="auto" w:line="259" w:before="0" w:after="160"/>
+              <w:jc w:val="start"/>
+              <w:rPr>
+                <w:rFonts w:ascii="Liberation Sans" w:hAnsi="Liberation Sans" w:eastAsia="DejaVu Sans" w:cs="DejaVu Sans"/>
+                <w:color w:val="auto"/>
+                <w:kern w:val="2"/>
+                <w:sz w:val="24"/>
+                <w:szCs w:val="24"/>
+                <w:lang w:val="da-DK" w:eastAsia="en-US" w:bidi="ar-SA"/>
+                <w14:ligatures w14:val="standardContextual"/>
+              </w:rPr>
+            </w:pPr>
+            <w:r>
+              <w:rPr>
+                <w:rFonts w:eastAsia="DejaVu Sans" w:cs="DejaVu Sans" w:ascii="Liberation Sans" w:hAnsi="Liberation Sans"/>
+                <w:color w:val="auto"/>
+                <w:kern w:val="2"/>
+                <w:sz w:val="24"/>
+                <w:szCs w:val="24"/>
+                <w:lang w:val="da-DK" w:eastAsia="en-US" w:bidi="ar-SA"/>
+                <w14:ligatures w14:val="standardContextual"/>
               </w:rPr>
               <w:t>K-002</w:t>
             </w:r>
@@ -461,18 +534,29 @@
           <w:p>
             <w:pPr>
               <w:pStyle w:val="TableContents"/>
-              <w:spacing w:before="0" w:after="160"/>
-              <w:rPr>
-                <w:rFonts w:ascii="Liberation Sans" w:hAnsi="Liberation Sans" w:eastAsia="DejaVu Sans" w:cs="DejaVu Sans"/>
-                <w:sz w:val="24"/>
-                <w:szCs w:val="24"/>
-              </w:rPr>
-            </w:pPr>
-            <w:r>
-              <w:rPr>
-                <w:rFonts w:eastAsia="DejaVu Sans" w:cs="DejaVu Sans" w:ascii="Liberation Sans" w:hAnsi="Liberation Sans"/>
-                <w:sz w:val="24"/>
-                <w:szCs w:val="24"/>
+              <w:suppressAutoHyphens w:val="true"/>
+              <w:bidi w:val="0"/>
+              <w:spacing w:lineRule="auto" w:line="259" w:before="0" w:after="160"/>
+              <w:jc w:val="start"/>
+              <w:rPr>
+                <w:rFonts w:ascii="Liberation Sans" w:hAnsi="Liberation Sans" w:eastAsia="DejaVu Sans" w:cs="DejaVu Sans"/>
+                <w:color w:val="auto"/>
+                <w:kern w:val="2"/>
+                <w:sz w:val="24"/>
+                <w:szCs w:val="24"/>
+                <w:lang w:val="da-DK" w:eastAsia="en-US" w:bidi="ar-SA"/>
+                <w14:ligatures w14:val="standardContextual"/>
+              </w:rPr>
+            </w:pPr>
+            <w:r>
+              <w:rPr>
+                <w:rFonts w:eastAsia="DejaVu Sans" w:cs="DejaVu Sans" w:ascii="Liberation Sans" w:hAnsi="Liberation Sans"/>
+                <w:color w:val="auto"/>
+                <w:kern w:val="2"/>
+                <w:sz w:val="24"/>
+                <w:szCs w:val="24"/>
+                <w:lang w:val="da-DK" w:eastAsia="en-US" w:bidi="ar-SA"/>
+                <w14:ligatures w14:val="standardContextual"/>
               </w:rPr>
               <w:t>Elpris</w:t>
             </w:r>
@@ -489,20 +573,31 @@
           <w:p>
             <w:pPr>
               <w:pStyle w:val="TableContents"/>
-              <w:spacing w:before="0" w:after="160"/>
-              <w:rPr>
-                <w:rFonts w:ascii="Liberation Sans" w:hAnsi="Liberation Sans" w:eastAsia="DejaVu Sans" w:cs="DejaVu Sans"/>
-                <w:sz w:val="24"/>
-                <w:szCs w:val="24"/>
-              </w:rPr>
-            </w:pPr>
-            <w:r>
-              <w:rPr>
-                <w:rFonts w:eastAsia="DejaVu Sans" w:cs="DejaVu Sans" w:ascii="Liberation Sans" w:hAnsi="Liberation Sans"/>
-                <w:sz w:val="24"/>
-                <w:szCs w:val="24"/>
-              </w:rPr>
-              <w:t>Aktuelle elpriser anvendes til at afgøre, hvornår det er billigst</w:t>
+              <w:suppressAutoHyphens w:val="true"/>
+              <w:bidi w:val="0"/>
+              <w:spacing w:lineRule="auto" w:line="259" w:before="0" w:after="160"/>
+              <w:jc w:val="start"/>
+              <w:rPr>
+                <w:rFonts w:ascii="Liberation Sans" w:hAnsi="Liberation Sans" w:eastAsia="DejaVu Sans" w:cs="DejaVu Sans"/>
+                <w:color w:val="auto"/>
+                <w:kern w:val="2"/>
+                <w:sz w:val="24"/>
+                <w:szCs w:val="24"/>
+                <w:lang w:val="da-DK" w:eastAsia="en-US" w:bidi="ar-SA"/>
+                <w14:ligatures w14:val="standardContextual"/>
+              </w:rPr>
+            </w:pPr>
+            <w:r>
+              <w:rPr>
+                <w:rFonts w:eastAsia="DejaVu Sans" w:cs="DejaVu Sans" w:ascii="Liberation Sans" w:hAnsi="Liberation Sans"/>
+                <w:color w:val="auto"/>
+                <w:kern w:val="2"/>
+                <w:sz w:val="24"/>
+                <w:szCs w:val="24"/>
+                <w:lang w:val="da-DK" w:eastAsia="en-US" w:bidi="ar-SA"/>
+                <w14:ligatures w14:val="standardContextual"/>
+              </w:rPr>
+              <w:t>Strømforbruget placeres i dagens billigste kvarterer</w:t>
             </w:r>
           </w:p>
         </w:tc>
@@ -517,18 +612,29 @@
           <w:p>
             <w:pPr>
               <w:pStyle w:val="TableContents"/>
-              <w:spacing w:before="0" w:after="160"/>
-              <w:rPr>
-                <w:rFonts w:ascii="Liberation Sans" w:hAnsi="Liberation Sans" w:eastAsia="DejaVu Sans" w:cs="DejaVu Sans"/>
-                <w:sz w:val="24"/>
-                <w:szCs w:val="24"/>
-              </w:rPr>
-            </w:pPr>
-            <w:r>
-              <w:rPr>
-                <w:rFonts w:eastAsia="DejaVu Sans" w:cs="DejaVu Sans" w:ascii="Liberation Sans" w:hAnsi="Liberation Sans"/>
-                <w:sz w:val="24"/>
-                <w:szCs w:val="24"/>
+              <w:suppressAutoHyphens w:val="true"/>
+              <w:bidi w:val="0"/>
+              <w:spacing w:lineRule="auto" w:line="259" w:before="0" w:after="160"/>
+              <w:jc w:val="start"/>
+              <w:rPr>
+                <w:rFonts w:ascii="Liberation Sans" w:hAnsi="Liberation Sans" w:eastAsia="DejaVu Sans" w:cs="DejaVu Sans"/>
+                <w:color w:val="auto"/>
+                <w:kern w:val="2"/>
+                <w:sz w:val="24"/>
+                <w:szCs w:val="24"/>
+                <w:lang w:val="da-DK" w:eastAsia="en-US" w:bidi="ar-SA"/>
+                <w14:ligatures w14:val="standardContextual"/>
+              </w:rPr>
+            </w:pPr>
+            <w:r>
+              <w:rPr>
+                <w:rFonts w:eastAsia="DejaVu Sans" w:cs="DejaVu Sans" w:ascii="Liberation Sans" w:hAnsi="Liberation Sans"/>
+                <w:color w:val="auto"/>
+                <w:kern w:val="2"/>
+                <w:sz w:val="24"/>
+                <w:szCs w:val="24"/>
+                <w:lang w:val="da-DK" w:eastAsia="en-US" w:bidi="ar-SA"/>
+                <w14:ligatures w14:val="standardContextual"/>
               </w:rPr>
               <w:t>Funktionelt</w:t>
             </w:r>
@@ -545,22 +651,31 @@
           <w:p>
             <w:pPr>
               <w:pStyle w:val="TableContents"/>
-              <w:bidi w:val="0"/>
-              <w:spacing w:lineRule="auto" w:line="259" w:before="0" w:after="160"/>
-              <w:jc w:val="start"/>
-              <w:rPr>
-                <w:rFonts w:ascii="Liberation Sans" w:hAnsi="Liberation Sans" w:eastAsia="DejaVu Sans" w:cs="DejaVu Sans"/>
-                <w:sz w:val="24"/>
-                <w:szCs w:val="24"/>
-              </w:rPr>
-            </w:pPr>
-            <w:r>
-              <w:rPr>
-                <w:rFonts w:eastAsia="DejaVu Sans" w:cs="DejaVu Sans" w:ascii="Liberation Sans" w:hAnsi="Liberation Sans"/>
-                <w:sz w:val="24"/>
-                <w:szCs w:val="24"/>
-              </w:rPr>
-              <w:t>Systemet skal ud fra dagens timepriser udpege den billigste sammenhængende period på [4] timer.</w:t>
+              <w:suppressAutoHyphens w:val="true"/>
+              <w:bidi w:val="0"/>
+              <w:spacing w:lineRule="auto" w:line="259" w:before="0" w:after="160"/>
+              <w:jc w:val="start"/>
+              <w:rPr>
+                <w:rFonts w:ascii="Liberation Sans" w:hAnsi="Liberation Sans" w:eastAsia="DejaVu Sans" w:cs="DejaVu Sans"/>
+                <w:color w:val="auto"/>
+                <w:kern w:val="2"/>
+                <w:sz w:val="24"/>
+                <w:szCs w:val="24"/>
+                <w:lang w:val="da-DK" w:eastAsia="en-US" w:bidi="ar-SA"/>
+                <w14:ligatures w14:val="standardContextual"/>
+              </w:rPr>
+            </w:pPr>
+            <w:r>
+              <w:rPr>
+                <w:rFonts w:eastAsia="DejaVu Sans" w:cs="DejaVu Sans" w:ascii="Liberation Sans" w:hAnsi="Liberation Sans"/>
+                <w:color w:val="auto"/>
+                <w:kern w:val="2"/>
+                <w:sz w:val="24"/>
+                <w:szCs w:val="24"/>
+                <w:lang w:val="da-DK" w:eastAsia="en-US" w:bidi="ar-SA"/>
+                <w14:ligatures w14:val="standardContextual"/>
+              </w:rPr>
+              <w:t>Systemet skal ud fra dagens timepriser udpege den prisgrænse ud fra 96 kvarterpriser, billigste 25 % (24 kvarterer)</w:t>
             </w:r>
           </w:p>
         </w:tc>
@@ -575,22 +690,30 @@
           <w:p>
             <w:pPr>
               <w:pStyle w:val="TableContents"/>
-              <w:bidi w:val="0"/>
-              <w:spacing w:lineRule="auto" w:line="259" w:before="0" w:after="160"/>
-              <w:jc w:val="start"/>
-              <w:rPr>
-                <w:rFonts w:ascii="Liberation Sans" w:hAnsi="Liberation Sans" w:eastAsia="DejaVu Sans" w:cs="DejaVu Sans"/>
-                <w:sz w:val="24"/>
-                <w:szCs w:val="24"/>
-              </w:rPr>
-            </w:pPr>
-            <w:r>
-              <w:rPr>
-                <w:rFonts w:eastAsia="DejaVu Sans" w:cs="DejaVu Sans" w:ascii="Liberation Sans" w:hAnsi="Liberation Sans"/>
-                <w:sz w:val="24"/>
-                <w:szCs w:val="24"/>
-              </w:rPr>
-              <w:t>Er [4] timer nok til at holde luftfugtigheden nede?</w:t>
+              <w:suppressAutoHyphens w:val="true"/>
+              <w:bidi w:val="0"/>
+              <w:spacing w:lineRule="auto" w:line="259" w:before="0" w:after="160"/>
+              <w:jc w:val="start"/>
+              <w:rPr>
+                <w:rFonts w:ascii="Liberation Sans" w:hAnsi="Liberation Sans" w:eastAsia="DejaVu Sans" w:cs="DejaVu Sans"/>
+                <w:color w:val="auto"/>
+                <w:kern w:val="2"/>
+                <w:sz w:val="24"/>
+                <w:szCs w:val="24"/>
+                <w:lang w:val="da-DK" w:eastAsia="en-US" w:bidi="ar-SA"/>
+                <w14:ligatures w14:val="standardContextual"/>
+              </w:rPr>
+            </w:pPr>
+            <w:r>
+              <w:rPr>
+                <w:rFonts w:eastAsia="DejaVu Sans" w:cs="DejaVu Sans" w:ascii="Liberation Sans" w:hAnsi="Liberation Sans"/>
+                <w:color w:val="auto"/>
+                <w:kern w:val="2"/>
+                <w:sz w:val="24"/>
+                <w:szCs w:val="24"/>
+                <w:lang w:val="da-DK" w:eastAsia="en-US" w:bidi="ar-SA"/>
+                <w14:ligatures w14:val="standardContextual"/>
+              </w:rPr>
             </w:r>
           </w:p>
         </w:tc>
@@ -610,18 +733,29 @@
           <w:p>
             <w:pPr>
               <w:pStyle w:val="TableContents"/>
-              <w:spacing w:before="0" w:after="160"/>
-              <w:rPr>
-                <w:rFonts w:ascii="Liberation Sans" w:hAnsi="Liberation Sans" w:eastAsia="DejaVu Sans" w:cs="DejaVu Sans"/>
-                <w:sz w:val="24"/>
-                <w:szCs w:val="24"/>
-              </w:rPr>
-            </w:pPr>
-            <w:r>
-              <w:rPr>
-                <w:rFonts w:eastAsia="DejaVu Sans" w:cs="DejaVu Sans" w:ascii="Liberation Sans" w:hAnsi="Liberation Sans"/>
-                <w:sz w:val="24"/>
-                <w:szCs w:val="24"/>
+              <w:suppressAutoHyphens w:val="true"/>
+              <w:bidi w:val="0"/>
+              <w:spacing w:lineRule="auto" w:line="259" w:before="0" w:after="160"/>
+              <w:jc w:val="start"/>
+              <w:rPr>
+                <w:rFonts w:ascii="Liberation Sans" w:hAnsi="Liberation Sans" w:eastAsia="DejaVu Sans" w:cs="DejaVu Sans"/>
+                <w:color w:val="auto"/>
+                <w:kern w:val="2"/>
+                <w:sz w:val="24"/>
+                <w:szCs w:val="24"/>
+                <w:lang w:val="da-DK" w:eastAsia="en-US" w:bidi="ar-SA"/>
+                <w14:ligatures w14:val="standardContextual"/>
+              </w:rPr>
+            </w:pPr>
+            <w:r>
+              <w:rPr>
+                <w:rFonts w:eastAsia="DejaVu Sans" w:cs="DejaVu Sans" w:ascii="Liberation Sans" w:hAnsi="Liberation Sans"/>
+                <w:color w:val="auto"/>
+                <w:kern w:val="2"/>
+                <w:sz w:val="24"/>
+                <w:szCs w:val="24"/>
+                <w:lang w:val="da-DK" w:eastAsia="en-US" w:bidi="ar-SA"/>
+                <w14:ligatures w14:val="standardContextual"/>
               </w:rPr>
               <w:t>K-003</w:t>
             </w:r>
@@ -638,18 +772,29 @@
           <w:p>
             <w:pPr>
               <w:pStyle w:val="TableContents"/>
-              <w:spacing w:before="0" w:after="160"/>
-              <w:rPr>
-                <w:rFonts w:ascii="Liberation Sans" w:hAnsi="Liberation Sans" w:eastAsia="DejaVu Sans" w:cs="DejaVu Sans"/>
-                <w:sz w:val="24"/>
-                <w:szCs w:val="24"/>
-              </w:rPr>
-            </w:pPr>
-            <w:r>
-              <w:rPr>
-                <w:rFonts w:eastAsia="DejaVu Sans" w:cs="DejaVu Sans" w:ascii="Liberation Sans" w:hAnsi="Liberation Sans"/>
-                <w:sz w:val="24"/>
-                <w:szCs w:val="24"/>
+              <w:suppressAutoHyphens w:val="true"/>
+              <w:bidi w:val="0"/>
+              <w:spacing w:lineRule="auto" w:line="259" w:before="0" w:after="160"/>
+              <w:jc w:val="start"/>
+              <w:rPr>
+                <w:rFonts w:ascii="Liberation Sans" w:hAnsi="Liberation Sans" w:eastAsia="DejaVu Sans" w:cs="DejaVu Sans"/>
+                <w:color w:val="auto"/>
+                <w:kern w:val="2"/>
+                <w:sz w:val="24"/>
+                <w:szCs w:val="24"/>
+                <w:lang w:val="da-DK" w:eastAsia="en-US" w:bidi="ar-SA"/>
+                <w14:ligatures w14:val="standardContextual"/>
+              </w:rPr>
+            </w:pPr>
+            <w:r>
+              <w:rPr>
+                <w:rFonts w:eastAsia="DejaVu Sans" w:cs="DejaVu Sans" w:ascii="Liberation Sans" w:hAnsi="Liberation Sans"/>
+                <w:color w:val="auto"/>
+                <w:kern w:val="2"/>
+                <w:sz w:val="24"/>
+                <w:szCs w:val="24"/>
+                <w:lang w:val="da-DK" w:eastAsia="en-US" w:bidi="ar-SA"/>
+                <w14:ligatures w14:val="standardContextual"/>
               </w:rPr>
               <w:t>Elpris</w:t>
             </w:r>
@@ -666,18 +811,29 @@
           <w:p>
             <w:pPr>
               <w:pStyle w:val="TableContents"/>
-              <w:spacing w:before="0" w:after="160"/>
-              <w:rPr>
-                <w:rFonts w:ascii="Liberation Sans" w:hAnsi="Liberation Sans" w:eastAsia="DejaVu Sans" w:cs="DejaVu Sans"/>
-                <w:sz w:val="24"/>
-                <w:szCs w:val="24"/>
-              </w:rPr>
-            </w:pPr>
-            <w:r>
-              <w:rPr>
-                <w:rFonts w:eastAsia="DejaVu Sans" w:cs="DejaVu Sans" w:ascii="Liberation Sans" w:hAnsi="Liberation Sans"/>
-                <w:sz w:val="24"/>
-                <w:szCs w:val="24"/>
+              <w:suppressAutoHyphens w:val="true"/>
+              <w:bidi w:val="0"/>
+              <w:spacing w:lineRule="auto" w:line="259" w:before="0" w:after="160"/>
+              <w:jc w:val="start"/>
+              <w:rPr>
+                <w:rFonts w:ascii="Liberation Sans" w:hAnsi="Liberation Sans" w:eastAsia="DejaVu Sans" w:cs="DejaVu Sans"/>
+                <w:color w:val="auto"/>
+                <w:kern w:val="2"/>
+                <w:sz w:val="24"/>
+                <w:szCs w:val="24"/>
+                <w:lang w:val="da-DK" w:eastAsia="en-US" w:bidi="ar-SA"/>
+                <w14:ligatures w14:val="standardContextual"/>
+              </w:rPr>
+            </w:pPr>
+            <w:r>
+              <w:rPr>
+                <w:rFonts w:eastAsia="DejaVu Sans" w:cs="DejaVu Sans" w:ascii="Liberation Sans" w:hAnsi="Liberation Sans"/>
+                <w:color w:val="auto"/>
+                <w:kern w:val="2"/>
+                <w:sz w:val="24"/>
+                <w:szCs w:val="24"/>
+                <w:lang w:val="da-DK" w:eastAsia="en-US" w:bidi="ar-SA"/>
+                <w14:ligatures w14:val="standardContextual"/>
               </w:rPr>
               <w:t>Aktuelle elpriser indhentes</w:t>
             </w:r>
@@ -694,18 +850,29 @@
           <w:p>
             <w:pPr>
               <w:pStyle w:val="TableContents"/>
-              <w:spacing w:before="0" w:after="160"/>
-              <w:rPr>
-                <w:rFonts w:ascii="Liberation Sans" w:hAnsi="Liberation Sans" w:eastAsia="DejaVu Sans" w:cs="DejaVu Sans"/>
-                <w:sz w:val="24"/>
-                <w:szCs w:val="24"/>
-              </w:rPr>
-            </w:pPr>
-            <w:r>
-              <w:rPr>
-                <w:rFonts w:eastAsia="DejaVu Sans" w:cs="DejaVu Sans" w:ascii="Liberation Sans" w:hAnsi="Liberation Sans"/>
-                <w:sz w:val="24"/>
-                <w:szCs w:val="24"/>
+              <w:suppressAutoHyphens w:val="true"/>
+              <w:bidi w:val="0"/>
+              <w:spacing w:lineRule="auto" w:line="259" w:before="0" w:after="160"/>
+              <w:jc w:val="start"/>
+              <w:rPr>
+                <w:rFonts w:ascii="Liberation Sans" w:hAnsi="Liberation Sans" w:eastAsia="DejaVu Sans" w:cs="DejaVu Sans"/>
+                <w:color w:val="auto"/>
+                <w:kern w:val="2"/>
+                <w:sz w:val="24"/>
+                <w:szCs w:val="24"/>
+                <w:lang w:val="da-DK" w:eastAsia="en-US" w:bidi="ar-SA"/>
+                <w14:ligatures w14:val="standardContextual"/>
+              </w:rPr>
+            </w:pPr>
+            <w:r>
+              <w:rPr>
+                <w:rFonts w:eastAsia="DejaVu Sans" w:cs="DejaVu Sans" w:ascii="Liberation Sans" w:hAnsi="Liberation Sans"/>
+                <w:color w:val="auto"/>
+                <w:kern w:val="2"/>
+                <w:sz w:val="24"/>
+                <w:szCs w:val="24"/>
+                <w:lang w:val="da-DK" w:eastAsia="en-US" w:bidi="ar-SA"/>
+                <w14:ligatures w14:val="standardContextual"/>
               </w:rPr>
               <w:t>Integration</w:t>
             </w:r>
@@ -722,22 +889,31 @@
           <w:p>
             <w:pPr>
               <w:pStyle w:val="TableContents"/>
-              <w:bidi w:val="0"/>
-              <w:spacing w:lineRule="auto" w:line="259" w:before="0" w:after="160"/>
-              <w:jc w:val="start"/>
-              <w:rPr>
-                <w:rFonts w:ascii="Liberation Sans" w:hAnsi="Liberation Sans" w:eastAsia="DejaVu Sans" w:cs="DejaVu Sans"/>
-                <w:sz w:val="24"/>
-                <w:szCs w:val="24"/>
-              </w:rPr>
-            </w:pPr>
-            <w:r>
-              <w:rPr>
-                <w:rFonts w:eastAsia="DejaVu Sans" w:cs="DejaVu Sans" w:ascii="Liberation Sans" w:hAnsi="Liberation Sans"/>
-                <w:sz w:val="24"/>
-                <w:szCs w:val="24"/>
-              </w:rPr>
-              <w:t>Systemet skal hente timepriser fra en ekstern API.</w:t>
+              <w:suppressAutoHyphens w:val="true"/>
+              <w:bidi w:val="0"/>
+              <w:spacing w:lineRule="auto" w:line="259" w:before="0" w:after="160"/>
+              <w:jc w:val="start"/>
+              <w:rPr>
+                <w:rFonts w:ascii="Liberation Sans" w:hAnsi="Liberation Sans" w:eastAsia="DejaVu Sans" w:cs="DejaVu Sans"/>
+                <w:color w:val="auto"/>
+                <w:kern w:val="2"/>
+                <w:sz w:val="24"/>
+                <w:szCs w:val="24"/>
+                <w:lang w:val="da-DK" w:eastAsia="en-US" w:bidi="ar-SA"/>
+                <w14:ligatures w14:val="standardContextual"/>
+              </w:rPr>
+            </w:pPr>
+            <w:r>
+              <w:rPr>
+                <w:rFonts w:eastAsia="DejaVu Sans" w:cs="DejaVu Sans" w:ascii="Liberation Sans" w:hAnsi="Liberation Sans"/>
+                <w:color w:val="auto"/>
+                <w:kern w:val="2"/>
+                <w:sz w:val="24"/>
+                <w:szCs w:val="24"/>
+                <w:lang w:val="da-DK" w:eastAsia="en-US" w:bidi="ar-SA"/>
+                <w14:ligatures w14:val="standardContextual"/>
+              </w:rPr>
+              <w:t>Systemet skal hente kvarterpriser fra en ekstern API.</w:t>
             </w:r>
           </w:p>
         </w:tc>
@@ -752,18 +928,31 @@
           <w:p>
             <w:pPr>
               <w:pStyle w:val="TableContents"/>
-              <w:bidi w:val="0"/>
-              <w:spacing w:lineRule="auto" w:line="259" w:before="0" w:after="160"/>
-              <w:jc w:val="start"/>
-              <w:rPr/>
-            </w:pPr>
-            <w:r>
-              <w:rPr>
-                <w:rFonts w:eastAsia="DejaVu Sans" w:cs="DejaVu Sans" w:ascii="Liberation Sans" w:hAnsi="Liberation Sans"/>
-                <w:sz w:val="24"/>
-                <w:szCs w:val="24"/>
-              </w:rPr>
-              <w:t>Er API'en stabil og gratis? Hvilket prisområde (DK1/DK2)</w:t>
+              <w:suppressAutoHyphens w:val="true"/>
+              <w:bidi w:val="0"/>
+              <w:spacing w:lineRule="auto" w:line="259" w:before="0" w:after="160"/>
+              <w:jc w:val="start"/>
+              <w:rPr>
+                <w:rFonts w:ascii="Liberation Sans" w:hAnsi="Liberation Sans" w:eastAsia="DejaVu Sans" w:cs="DejaVu Sans"/>
+                <w:color w:val="auto"/>
+                <w:kern w:val="2"/>
+                <w:sz w:val="24"/>
+                <w:szCs w:val="24"/>
+                <w:lang w:val="da-DK" w:eastAsia="en-US" w:bidi="ar-SA"/>
+                <w14:ligatures w14:val="standardContextual"/>
+              </w:rPr>
+            </w:pPr>
+            <w:r>
+              <w:rPr>
+                <w:rFonts w:eastAsia="DejaVu Sans" w:cs="DejaVu Sans" w:ascii="Liberation Sans" w:hAnsi="Liberation Sans"/>
+                <w:color w:val="auto"/>
+                <w:kern w:val="2"/>
+                <w:sz w:val="24"/>
+                <w:szCs w:val="24"/>
+                <w:lang w:val="da-DK" w:eastAsia="en-US" w:bidi="ar-SA"/>
+                <w14:ligatures w14:val="standardContextual"/>
+              </w:rPr>
+              <w:t>Afklaret: Energi Data Service, DK1</w:t>
             </w:r>
           </w:p>
         </w:tc>
@@ -781,18 +970,29 @@
           <w:p>
             <w:pPr>
               <w:pStyle w:val="TableContents"/>
-              <w:spacing w:before="0" w:after="160"/>
-              <w:rPr>
-                <w:rFonts w:ascii="Liberation Sans" w:hAnsi="Liberation Sans" w:eastAsia="DejaVu Sans" w:cs="DejaVu Sans"/>
-                <w:sz w:val="24"/>
-                <w:szCs w:val="24"/>
-              </w:rPr>
-            </w:pPr>
-            <w:r>
-              <w:rPr>
-                <w:rFonts w:eastAsia="DejaVu Sans" w:cs="DejaVu Sans" w:ascii="Liberation Sans" w:hAnsi="Liberation Sans"/>
-                <w:sz w:val="24"/>
-                <w:szCs w:val="24"/>
+              <w:suppressAutoHyphens w:val="true"/>
+              <w:bidi w:val="0"/>
+              <w:spacing w:lineRule="auto" w:line="259" w:before="0" w:after="160"/>
+              <w:jc w:val="start"/>
+              <w:rPr>
+                <w:rFonts w:ascii="Liberation Sans" w:hAnsi="Liberation Sans" w:eastAsia="DejaVu Sans" w:cs="DejaVu Sans"/>
+                <w:color w:val="auto"/>
+                <w:kern w:val="2"/>
+                <w:sz w:val="24"/>
+                <w:szCs w:val="24"/>
+                <w:lang w:val="da-DK" w:eastAsia="en-US" w:bidi="ar-SA"/>
+                <w14:ligatures w14:val="standardContextual"/>
+              </w:rPr>
+            </w:pPr>
+            <w:r>
+              <w:rPr>
+                <w:rFonts w:eastAsia="DejaVu Sans" w:cs="DejaVu Sans" w:ascii="Liberation Sans" w:hAnsi="Liberation Sans"/>
+                <w:color w:val="auto"/>
+                <w:kern w:val="2"/>
+                <w:sz w:val="24"/>
+                <w:szCs w:val="24"/>
+                <w:lang w:val="da-DK" w:eastAsia="en-US" w:bidi="ar-SA"/>
+                <w14:ligatures w14:val="standardContextual"/>
               </w:rPr>
               <w:t>K-004</w:t>
             </w:r>
@@ -809,21 +1009,29 @@
           <w:p>
             <w:pPr>
               <w:pStyle w:val="TableContents"/>
-              <w:spacing w:before="0" w:after="160"/>
-              <w:rPr>
-                <w:rFonts w:ascii="Liberation Sans" w:hAnsi="Liberation Sans" w:eastAsia="DejaVu Sans" w:cs="DejaVu Sans"/>
-                <w:sz w:val="24"/>
-                <w:szCs w:val="24"/>
-                <w:highlight w:val="none"/>
-                <w:shd w:fill="auto" w:val="clear"/>
-              </w:rPr>
-            </w:pPr>
-            <w:r>
-              <w:rPr>
-                <w:rFonts w:eastAsia="DejaVu Sans" w:cs="DejaVu Sans" w:ascii="Liberation Sans" w:hAnsi="Liberation Sans"/>
-                <w:sz w:val="24"/>
-                <w:szCs w:val="24"/>
-                <w:shd w:fill="auto" w:val="clear"/>
+              <w:suppressAutoHyphens w:val="true"/>
+              <w:bidi w:val="0"/>
+              <w:spacing w:lineRule="auto" w:line="259" w:before="0" w:after="160"/>
+              <w:jc w:val="start"/>
+              <w:rPr>
+                <w:rFonts w:ascii="Liberation Sans" w:hAnsi="Liberation Sans" w:eastAsia="DejaVu Sans" w:cs="DejaVu Sans"/>
+                <w:color w:val="auto"/>
+                <w:kern w:val="2"/>
+                <w:sz w:val="24"/>
+                <w:szCs w:val="24"/>
+                <w:lang w:val="da-DK" w:eastAsia="en-US" w:bidi="ar-SA"/>
+                <w14:ligatures w14:val="standardContextual"/>
+              </w:rPr>
+            </w:pPr>
+            <w:r>
+              <w:rPr>
+                <w:rFonts w:eastAsia="DejaVu Sans" w:cs="DejaVu Sans" w:ascii="Liberation Sans" w:hAnsi="Liberation Sans"/>
+                <w:color w:val="auto"/>
+                <w:kern w:val="2"/>
+                <w:sz w:val="24"/>
+                <w:szCs w:val="24"/>
+                <w:lang w:val="da-DK" w:eastAsia="en-US" w:bidi="ar-SA"/>
+                <w14:ligatures w14:val="standardContextual"/>
               </w:rPr>
               <w:t>Styring</w:t>
             </w:r>
@@ -839,23 +1047,25 @@
           </w:tcPr>
           <w:p>
             <w:pPr>
-              <w:pStyle w:val="PreformattedText"/>
-              <w:spacing w:before="0" w:after="160"/>
-              <w:rPr>
-                <w:rFonts w:ascii="Liberation Sans" w:hAnsi="Liberation Sans" w:eastAsia="DejaVu Sans" w:cs="DejaVu Sans"/>
-              </w:rPr>
+              <w:pStyle w:val="TableContents"/>
+              <w:suppressAutoHyphens w:val="true"/>
+              <w:bidi w:val="0"/>
+              <w:spacing w:lineRule="auto" w:line="259" w:before="0" w:after="160"/>
+              <w:jc w:val="start"/>
+              <w:rPr/>
             </w:pPr>
             <w:r>
               <w:rPr>
                 <w:rStyle w:val="SourceText"/>
-                <w:rFonts w:ascii="Nimbus Sans" w:hAnsi="Nimbus Sans"/>
-                <w:b w:val="false"/>
-                <w:bCs w:val="false"/>
-                <w:sz w:val="24"/>
-                <w:szCs w:val="24"/>
-                <w:shd w:fill="auto" w:val="clear"/>
-              </w:rPr>
-              <w:t>Strømforbrug placeres i de billigste perioder</w:t>
+                <w:rFonts w:eastAsia="DejaVu Sans" w:cs="DejaVu Sans" w:ascii="Liberation Sans" w:hAnsi="Liberation Sans"/>
+                <w:color w:val="auto"/>
+                <w:kern w:val="2"/>
+                <w:sz w:val="24"/>
+                <w:szCs w:val="24"/>
+                <w:lang w:val="da-DK" w:eastAsia="en-US" w:bidi="ar-SA"/>
+                <w14:ligatures w14:val="standardContextual"/>
+              </w:rPr>
+              <w:t>Strømforbrug placeres i billige kvarterer</w:t>
             </w:r>
           </w:p>
         </w:tc>
@@ -870,18 +1080,29 @@
           <w:p>
             <w:pPr>
               <w:pStyle w:val="TableContents"/>
-              <w:spacing w:before="0" w:after="160"/>
-              <w:rPr>
-                <w:rFonts w:ascii="Liberation Sans" w:hAnsi="Liberation Sans" w:eastAsia="DejaVu Sans" w:cs="DejaVu Sans"/>
-                <w:sz w:val="24"/>
-                <w:szCs w:val="24"/>
-              </w:rPr>
-            </w:pPr>
-            <w:r>
-              <w:rPr>
-                <w:rFonts w:eastAsia="DejaVu Sans" w:cs="DejaVu Sans" w:ascii="Liberation Sans" w:hAnsi="Liberation Sans"/>
-                <w:sz w:val="24"/>
-                <w:szCs w:val="24"/>
+              <w:suppressAutoHyphens w:val="true"/>
+              <w:bidi w:val="0"/>
+              <w:spacing w:lineRule="auto" w:line="259" w:before="0" w:after="160"/>
+              <w:jc w:val="start"/>
+              <w:rPr>
+                <w:rFonts w:ascii="Liberation Sans" w:hAnsi="Liberation Sans" w:eastAsia="DejaVu Sans" w:cs="DejaVu Sans"/>
+                <w:color w:val="auto"/>
+                <w:kern w:val="2"/>
+                <w:sz w:val="24"/>
+                <w:szCs w:val="24"/>
+                <w:lang w:val="da-DK" w:eastAsia="en-US" w:bidi="ar-SA"/>
+                <w14:ligatures w14:val="standardContextual"/>
+              </w:rPr>
+            </w:pPr>
+            <w:r>
+              <w:rPr>
+                <w:rFonts w:eastAsia="DejaVu Sans" w:cs="DejaVu Sans" w:ascii="Liberation Sans" w:hAnsi="Liberation Sans"/>
+                <w:color w:val="auto"/>
+                <w:kern w:val="2"/>
+                <w:sz w:val="24"/>
+                <w:szCs w:val="24"/>
+                <w:lang w:val="da-DK" w:eastAsia="en-US" w:bidi="ar-SA"/>
+                <w14:ligatures w14:val="standardContextual"/>
               </w:rPr>
               <w:t>Funktionelt</w:t>
             </w:r>
@@ -898,6 +1119,7 @@
           <w:p>
             <w:pPr>
               <w:pStyle w:val="TableContents"/>
+              <w:suppressAutoHyphens w:val="true"/>
               <w:bidi w:val="0"/>
               <w:spacing w:lineRule="auto" w:line="259" w:before="0" w:after="160"/>
               <w:jc w:val="start"/>
@@ -907,10 +1129,14 @@
               <w:rPr>
                 <w:rStyle w:val="SourceText"/>
                 <w:rFonts w:eastAsia="DejaVu Sans" w:cs="DejaVu Sans" w:ascii="Liberation Sans" w:hAnsi="Liberation Sans"/>
-                <w:sz w:val="24"/>
-                <w:szCs w:val="24"/>
-              </w:rPr>
-              <w:t>Affugteren skal tændes, når luftfugtigheden overstiger tændgrænsen, og den aktuelle time ligger i den billigste periode (se K-002). En tændt affugter skal køre videre, indtil luftfugtigheden er under slukgrænsen, eller den billigste periode slutter. Under slukgrænsen skal affugteren være slukket, medmindre K-005 gælder.</w:t>
+                <w:color w:val="auto"/>
+                <w:kern w:val="2"/>
+                <w:sz w:val="24"/>
+                <w:szCs w:val="24"/>
+                <w:lang w:val="da-DK" w:eastAsia="en-US" w:bidi="ar-SA"/>
+                <w14:ligatures w14:val="standardContextual"/>
+              </w:rPr>
+              <w:t xml:space="preserve">Affugteren skal tændes, når luftfugtigheden overstiger tændgrænsen, og dhvert 15. minut; det aktuelle kvarter er billigt (se K-002). En tændt affugter skal køre videre, indtil luftfugtigheden er under slukgrænsen, eller den billigste periode slutter. </w:t>
             </w:r>
           </w:p>
         </w:tc>
@@ -924,51 +1150,25 @@
           </w:tcPr>
           <w:p>
             <w:pPr>
-              <w:pStyle w:val="PreformattedText"/>
-              <w:spacing w:before="0" w:after="160"/>
-              <w:rPr>
-                <w:rFonts w:ascii="Liberation Sans" w:hAnsi="Liberation Sans" w:eastAsia="DejaVu Sans" w:cs="DejaVu Sans"/>
-                <w:b/>
-                <w:bCs/>
-                <w:sz w:val="32"/>
-                <w:szCs w:val="32"/>
-              </w:rPr>
+              <w:pStyle w:val="TableContents"/>
+              <w:suppressAutoHyphens w:val="true"/>
+              <w:bidi w:val="0"/>
+              <w:spacing w:lineRule="auto" w:line="259" w:before="0" w:after="160"/>
+              <w:jc w:val="start"/>
+              <w:rPr/>
             </w:pPr>
             <w:r>
               <w:rPr>
                 <w:rStyle w:val="SourceText"/>
-                <w:rFonts w:ascii="Nimbus Sans" w:hAnsi="Nimbus Sans"/>
-                <w:b w:val="false"/>
-                <w:bCs w:val="false"/>
-                <w:sz w:val="24"/>
-                <w:szCs w:val="24"/>
-                <w:shd w:fill="auto" w:val="clear"/>
-              </w:rPr>
-              <w:t xml:space="preserve">Hvilke </w:t>
-            </w:r>
-            <w:r>
-              <w:rPr>
-                <w:rStyle w:val="SourceText"/>
-                <w:rFonts w:eastAsia="DejaVu Sans" w:cs="DejaVu Sans" w:ascii="Liberation Sans" w:hAnsi="Liberation Sans"/>
-                <w:b w:val="false"/>
-                <w:bCs w:val="false"/>
-                <w:sz w:val="24"/>
-                <w:szCs w:val="24"/>
-                <w:shd w:fill="auto" w:val="clear"/>
-              </w:rPr>
-              <w:t>tændgrænsen og sluk værdier</w:t>
-            </w:r>
-            <w:r>
-              <w:rPr>
-                <w:rStyle w:val="SourceText"/>
-                <w:rFonts w:ascii="Nimbus Sans" w:hAnsi="Nimbus Sans"/>
-                <w:b w:val="false"/>
-                <w:bCs w:val="false"/>
-                <w:sz w:val="24"/>
-                <w:szCs w:val="24"/>
-                <w:shd w:fill="auto" w:val="clear"/>
-              </w:rPr>
-              <w:t>?</w:t>
+                <w:rFonts w:eastAsia="DejaVu Sans" w:cs="DejaVu Sans" w:ascii="Liberation Sans" w:hAnsi="Liberation Sans"/>
+                <w:color w:val="auto"/>
+                <w:kern w:val="2"/>
+                <w:sz w:val="24"/>
+                <w:szCs w:val="24"/>
+                <w:lang w:val="da-DK" w:eastAsia="en-US" w:bidi="ar-SA"/>
+                <w14:ligatures w14:val="standardContextual"/>
+              </w:rPr>
+              <w:t>Afklaret: slukgrænse 50 %. Åbent: tændgrænse [65] %</w:t>
             </w:r>
           </w:p>
         </w:tc>
@@ -986,18 +1186,29 @@
           <w:p>
             <w:pPr>
               <w:pStyle w:val="TableContents"/>
-              <w:spacing w:before="0" w:after="160"/>
-              <w:rPr>
-                <w:rFonts w:ascii="Liberation Sans" w:hAnsi="Liberation Sans" w:eastAsia="DejaVu Sans" w:cs="DejaVu Sans"/>
-                <w:sz w:val="24"/>
-                <w:szCs w:val="24"/>
-              </w:rPr>
-            </w:pPr>
-            <w:r>
-              <w:rPr>
-                <w:rFonts w:eastAsia="DejaVu Sans" w:cs="DejaVu Sans" w:ascii="Liberation Sans" w:hAnsi="Liberation Sans"/>
-                <w:sz w:val="24"/>
-                <w:szCs w:val="24"/>
+              <w:suppressAutoHyphens w:val="true"/>
+              <w:bidi w:val="0"/>
+              <w:spacing w:lineRule="auto" w:line="259" w:before="0" w:after="160"/>
+              <w:jc w:val="start"/>
+              <w:rPr>
+                <w:rFonts w:ascii="Liberation Sans" w:hAnsi="Liberation Sans" w:eastAsia="DejaVu Sans" w:cs="DejaVu Sans"/>
+                <w:color w:val="auto"/>
+                <w:kern w:val="2"/>
+                <w:sz w:val="24"/>
+                <w:szCs w:val="24"/>
+                <w:lang w:val="da-DK" w:eastAsia="en-US" w:bidi="ar-SA"/>
+                <w14:ligatures w14:val="standardContextual"/>
+              </w:rPr>
+            </w:pPr>
+            <w:r>
+              <w:rPr>
+                <w:rFonts w:eastAsia="DejaVu Sans" w:cs="DejaVu Sans" w:ascii="Liberation Sans" w:hAnsi="Liberation Sans"/>
+                <w:color w:val="auto"/>
+                <w:kern w:val="2"/>
+                <w:sz w:val="24"/>
+                <w:szCs w:val="24"/>
+                <w:lang w:val="da-DK" w:eastAsia="en-US" w:bidi="ar-SA"/>
+                <w14:ligatures w14:val="standardContextual"/>
               </w:rPr>
               <w:t>K-005</w:t>
             </w:r>
@@ -1014,21 +1225,29 @@
           <w:p>
             <w:pPr>
               <w:pStyle w:val="TableContents"/>
-              <w:spacing w:before="0" w:after="160"/>
-              <w:rPr>
-                <w:rFonts w:ascii="Liberation Sans" w:hAnsi="Liberation Sans" w:eastAsia="DejaVu Sans" w:cs="DejaVu Sans"/>
-                <w:sz w:val="24"/>
-                <w:szCs w:val="24"/>
-                <w:highlight w:val="none"/>
-                <w:shd w:fill="auto" w:val="clear"/>
-              </w:rPr>
-            </w:pPr>
-            <w:r>
-              <w:rPr>
-                <w:rFonts w:eastAsia="DejaVu Sans" w:cs="DejaVu Sans" w:ascii="Liberation Sans" w:hAnsi="Liberation Sans"/>
-                <w:sz w:val="24"/>
-                <w:szCs w:val="24"/>
-                <w:shd w:fill="auto" w:val="clear"/>
+              <w:suppressAutoHyphens w:val="true"/>
+              <w:bidi w:val="0"/>
+              <w:spacing w:lineRule="auto" w:line="259" w:before="0" w:after="160"/>
+              <w:jc w:val="start"/>
+              <w:rPr>
+                <w:rFonts w:ascii="Liberation Sans" w:hAnsi="Liberation Sans" w:eastAsia="DejaVu Sans" w:cs="DejaVu Sans"/>
+                <w:color w:val="auto"/>
+                <w:kern w:val="2"/>
+                <w:sz w:val="24"/>
+                <w:szCs w:val="24"/>
+                <w:lang w:val="da-DK" w:eastAsia="en-US" w:bidi="ar-SA"/>
+                <w14:ligatures w14:val="standardContextual"/>
+              </w:rPr>
+            </w:pPr>
+            <w:r>
+              <w:rPr>
+                <w:rFonts w:eastAsia="DejaVu Sans" w:cs="DejaVu Sans" w:ascii="Liberation Sans" w:hAnsi="Liberation Sans"/>
+                <w:color w:val="auto"/>
+                <w:kern w:val="2"/>
+                <w:sz w:val="24"/>
+                <w:szCs w:val="24"/>
+                <w:lang w:val="da-DK" w:eastAsia="en-US" w:bidi="ar-SA"/>
+                <w14:ligatures w14:val="standardContextual"/>
               </w:rPr>
               <w:t>Styring</w:t>
             </w:r>
@@ -1044,21 +1263,23 @@
           </w:tcPr>
           <w:p>
             <w:pPr>
-              <w:pStyle w:val="PreformattedText"/>
-              <w:spacing w:before="0" w:after="160"/>
-              <w:rPr>
-                <w:rFonts w:ascii="Liberation Sans" w:hAnsi="Liberation Sans" w:eastAsia="DejaVu Sans" w:cs="DejaVu Sans"/>
-              </w:rPr>
+              <w:pStyle w:val="TableContents"/>
+              <w:suppressAutoHyphens w:val="true"/>
+              <w:bidi w:val="0"/>
+              <w:spacing w:lineRule="auto" w:line="259" w:before="0" w:after="160"/>
+              <w:jc w:val="start"/>
+              <w:rPr/>
             </w:pPr>
             <w:r>
               <w:rPr>
                 <w:rStyle w:val="SourceText"/>
-                <w:rFonts w:ascii="Nimbus Sans" w:hAnsi="Nimbus Sans"/>
-                <w:b w:val="false"/>
-                <w:bCs w:val="false"/>
-                <w:sz w:val="24"/>
-                <w:szCs w:val="24"/>
-                <w:shd w:fill="auto" w:val="clear"/>
+                <w:rFonts w:eastAsia="DejaVu Sans" w:cs="DejaVu Sans" w:ascii="Liberation Sans" w:hAnsi="Liberation Sans"/>
+                <w:color w:val="auto"/>
+                <w:kern w:val="2"/>
+                <w:sz w:val="24"/>
+                <w:szCs w:val="24"/>
+                <w:lang w:val="da-DK" w:eastAsia="en-US" w:bidi="ar-SA"/>
+                <w14:ligatures w14:val="standardContextual"/>
               </w:rPr>
               <w:t>Prioritere luftfugtigheden over elpris ved kritisk høj fugt</w:t>
             </w:r>
@@ -1075,18 +1296,29 @@
           <w:p>
             <w:pPr>
               <w:pStyle w:val="TableContents"/>
-              <w:spacing w:before="0" w:after="160"/>
-              <w:rPr>
-                <w:rFonts w:ascii="Liberation Sans" w:hAnsi="Liberation Sans" w:eastAsia="DejaVu Sans" w:cs="DejaVu Sans"/>
-                <w:sz w:val="24"/>
-                <w:szCs w:val="24"/>
-              </w:rPr>
-            </w:pPr>
-            <w:r>
-              <w:rPr>
-                <w:rFonts w:eastAsia="DejaVu Sans" w:cs="DejaVu Sans" w:ascii="Liberation Sans" w:hAnsi="Liberation Sans"/>
-                <w:sz w:val="24"/>
-                <w:szCs w:val="24"/>
+              <w:suppressAutoHyphens w:val="true"/>
+              <w:bidi w:val="0"/>
+              <w:spacing w:lineRule="auto" w:line="259" w:before="0" w:after="160"/>
+              <w:jc w:val="start"/>
+              <w:rPr>
+                <w:rFonts w:ascii="Liberation Sans" w:hAnsi="Liberation Sans" w:eastAsia="DejaVu Sans" w:cs="DejaVu Sans"/>
+                <w:color w:val="auto"/>
+                <w:kern w:val="2"/>
+                <w:sz w:val="24"/>
+                <w:szCs w:val="24"/>
+                <w:lang w:val="da-DK" w:eastAsia="en-US" w:bidi="ar-SA"/>
+                <w14:ligatures w14:val="standardContextual"/>
+              </w:rPr>
+            </w:pPr>
+            <w:r>
+              <w:rPr>
+                <w:rFonts w:eastAsia="DejaVu Sans" w:cs="DejaVu Sans" w:ascii="Liberation Sans" w:hAnsi="Liberation Sans"/>
+                <w:color w:val="auto"/>
+                <w:kern w:val="2"/>
+                <w:sz w:val="24"/>
+                <w:szCs w:val="24"/>
+                <w:lang w:val="da-DK" w:eastAsia="en-US" w:bidi="ar-SA"/>
+                <w14:ligatures w14:val="standardContextual"/>
               </w:rPr>
               <w:t>Funktionelt</w:t>
             </w:r>
@@ -1102,27 +1334,25 @@
           </w:tcPr>
           <w:p>
             <w:pPr>
-              <w:pStyle w:val="PreformattedText"/>
-              <w:spacing w:before="0" w:after="160"/>
-              <w:rPr>
-                <w:rFonts w:ascii="Liberation Sans" w:hAnsi="Liberation Sans" w:eastAsia="DejaVu Sans" w:cs="DejaVu Sans"/>
-                <w:b/>
-                <w:bCs/>
-                <w:sz w:val="32"/>
-                <w:szCs w:val="32"/>
-              </w:rPr>
+              <w:pStyle w:val="TableContents"/>
+              <w:suppressAutoHyphens w:val="true"/>
+              <w:bidi w:val="0"/>
+              <w:spacing w:lineRule="auto" w:line="259" w:before="0" w:after="160"/>
+              <w:jc w:val="start"/>
+              <w:rPr/>
             </w:pPr>
             <w:r>
               <w:rPr>
                 <w:rStyle w:val="SourceText"/>
-                <w:rFonts w:ascii="Nimbus Sans" w:hAnsi="Nimbus Sans"/>
-                <w:b w:val="false"/>
-                <w:bCs w:val="false"/>
-                <w:sz w:val="24"/>
-                <w:szCs w:val="24"/>
-                <w:shd w:fill="auto" w:val="clear"/>
-              </w:rPr>
-              <w:t>Når luftfugtigheden overstiger den kritiske eværdi, skal affugteren tændes uanset elpris og køre, indtil luftfugtigheden er under den sluk værdi.</w:t>
+                <w:rFonts w:eastAsia="DejaVu Sans" w:cs="DejaVu Sans" w:ascii="Liberation Sans" w:hAnsi="Liberation Sans"/>
+                <w:color w:val="auto"/>
+                <w:kern w:val="2"/>
+                <w:sz w:val="24"/>
+                <w:szCs w:val="24"/>
+                <w:lang w:val="da-DK" w:eastAsia="en-US" w:bidi="ar-SA"/>
+                <w14:ligatures w14:val="standardContextual"/>
+              </w:rPr>
+              <w:t>Når luftfugtigheden overstiger denkritiske grænse, skal affugteren tændes uanset elpris og køre, indtil luftfugtigheden er under slukgrænsen.Dette gælder ikke i dark time (se K-018)</w:t>
             </w:r>
           </w:p>
         </w:tc>
@@ -1136,27 +1366,25 @@
           </w:tcPr>
           <w:p>
             <w:pPr>
-              <w:pStyle w:val="PreformattedText"/>
-              <w:spacing w:before="0" w:after="160"/>
-              <w:rPr>
-                <w:rFonts w:ascii="Liberation Sans" w:hAnsi="Liberation Sans" w:eastAsia="DejaVu Sans" w:cs="DejaVu Sans"/>
-                <w:b/>
-                <w:bCs/>
-                <w:sz w:val="32"/>
-                <w:szCs w:val="32"/>
-              </w:rPr>
+              <w:pStyle w:val="TableContents"/>
+              <w:suppressAutoHyphens w:val="true"/>
+              <w:bidi w:val="0"/>
+              <w:spacing w:lineRule="auto" w:line="259" w:before="0" w:after="160"/>
+              <w:jc w:val="start"/>
+              <w:rPr/>
             </w:pPr>
             <w:r>
               <w:rPr>
                 <w:rStyle w:val="SourceText"/>
-                <w:rFonts w:ascii="Nimbus Sans" w:hAnsi="Nimbus Sans"/>
-                <w:b w:val="false"/>
-                <w:bCs w:val="false"/>
-                <w:sz w:val="24"/>
-                <w:szCs w:val="24"/>
-                <w:shd w:fill="auto" w:val="clear"/>
-              </w:rPr>
-              <w:t>Hvilken kritisk værdi? Hvornår skal den slukke igen?</w:t>
+                <w:rFonts w:eastAsia="DejaVu Sans" w:cs="DejaVu Sans" w:ascii="Liberation Sans" w:hAnsi="Liberation Sans"/>
+                <w:color w:val="auto"/>
+                <w:kern w:val="2"/>
+                <w:sz w:val="24"/>
+                <w:szCs w:val="24"/>
+                <w:lang w:val="da-DK" w:eastAsia="en-US" w:bidi="ar-SA"/>
+                <w14:ligatures w14:val="standardContextual"/>
+              </w:rPr>
+              <w:t>Åbent: kritisk grænse [68] %</w:t>
             </w:r>
           </w:p>
         </w:tc>
@@ -1174,18 +1402,29 @@
           <w:p>
             <w:pPr>
               <w:pStyle w:val="TableContents"/>
-              <w:spacing w:before="0" w:after="160"/>
-              <w:rPr>
-                <w:rFonts w:ascii="Liberation Sans" w:hAnsi="Liberation Sans" w:eastAsia="DejaVu Sans" w:cs="DejaVu Sans"/>
-                <w:sz w:val="24"/>
-                <w:szCs w:val="24"/>
-              </w:rPr>
-            </w:pPr>
-            <w:r>
-              <w:rPr>
-                <w:rFonts w:eastAsia="DejaVu Sans" w:cs="DejaVu Sans" w:ascii="Liberation Sans" w:hAnsi="Liberation Sans"/>
-                <w:sz w:val="24"/>
-                <w:szCs w:val="24"/>
+              <w:suppressAutoHyphens w:val="true"/>
+              <w:bidi w:val="0"/>
+              <w:spacing w:lineRule="auto" w:line="259" w:before="0" w:after="160"/>
+              <w:jc w:val="start"/>
+              <w:rPr>
+                <w:rFonts w:ascii="Liberation Sans" w:hAnsi="Liberation Sans" w:eastAsia="DejaVu Sans" w:cs="DejaVu Sans"/>
+                <w:color w:val="auto"/>
+                <w:kern w:val="2"/>
+                <w:sz w:val="24"/>
+                <w:szCs w:val="24"/>
+                <w:lang w:val="da-DK" w:eastAsia="en-US" w:bidi="ar-SA"/>
+                <w14:ligatures w14:val="standardContextual"/>
+              </w:rPr>
+            </w:pPr>
+            <w:r>
+              <w:rPr>
+                <w:rFonts w:eastAsia="DejaVu Sans" w:cs="DejaVu Sans" w:ascii="Liberation Sans" w:hAnsi="Liberation Sans"/>
+                <w:color w:val="auto"/>
+                <w:kern w:val="2"/>
+                <w:sz w:val="24"/>
+                <w:szCs w:val="24"/>
+                <w:lang w:val="da-DK" w:eastAsia="en-US" w:bidi="ar-SA"/>
+                <w14:ligatures w14:val="standardContextual"/>
               </w:rPr>
               <w:t>K-006</w:t>
             </w:r>
@@ -1202,21 +1441,29 @@
           <w:p>
             <w:pPr>
               <w:pStyle w:val="TableContents"/>
-              <w:spacing w:before="0" w:after="160"/>
-              <w:rPr>
-                <w:rFonts w:ascii="Liberation Sans" w:hAnsi="Liberation Sans" w:eastAsia="DejaVu Sans" w:cs="DejaVu Sans"/>
-                <w:sz w:val="24"/>
-                <w:szCs w:val="24"/>
-                <w:highlight w:val="none"/>
-                <w:shd w:fill="auto" w:val="clear"/>
-              </w:rPr>
-            </w:pPr>
-            <w:r>
-              <w:rPr>
-                <w:rFonts w:eastAsia="DejaVu Sans" w:cs="DejaVu Sans" w:ascii="Liberation Sans" w:hAnsi="Liberation Sans"/>
-                <w:sz w:val="24"/>
-                <w:szCs w:val="24"/>
-                <w:shd w:fill="auto" w:val="clear"/>
+              <w:suppressAutoHyphens w:val="true"/>
+              <w:bidi w:val="0"/>
+              <w:spacing w:lineRule="auto" w:line="259" w:before="0" w:after="160"/>
+              <w:jc w:val="start"/>
+              <w:rPr>
+                <w:rFonts w:ascii="Liberation Sans" w:hAnsi="Liberation Sans" w:eastAsia="DejaVu Sans" w:cs="DejaVu Sans"/>
+                <w:color w:val="auto"/>
+                <w:kern w:val="2"/>
+                <w:sz w:val="24"/>
+                <w:szCs w:val="24"/>
+                <w:lang w:val="da-DK" w:eastAsia="en-US" w:bidi="ar-SA"/>
+                <w14:ligatures w14:val="standardContextual"/>
+              </w:rPr>
+            </w:pPr>
+            <w:r>
+              <w:rPr>
+                <w:rFonts w:eastAsia="DejaVu Sans" w:cs="DejaVu Sans" w:ascii="Liberation Sans" w:hAnsi="Liberation Sans"/>
+                <w:color w:val="auto"/>
+                <w:kern w:val="2"/>
+                <w:sz w:val="24"/>
+                <w:szCs w:val="24"/>
+                <w:lang w:val="da-DK" w:eastAsia="en-US" w:bidi="ar-SA"/>
+                <w14:ligatures w14:val="standardContextual"/>
               </w:rPr>
               <w:t>Hardware</w:t>
             </w:r>
@@ -1232,25 +1479,23 @@
           </w:tcPr>
           <w:p>
             <w:pPr>
-              <w:pStyle w:val="PreformattedText"/>
-              <w:spacing w:before="0" w:after="160"/>
-              <w:rPr>
-                <w:rFonts w:ascii="Liberation Sans" w:hAnsi="Liberation Sans" w:eastAsia="DejaVu Sans" w:cs="DejaVu Sans"/>
-                <w:b/>
-                <w:bCs/>
-                <w:sz w:val="32"/>
-                <w:szCs w:val="32"/>
-              </w:rPr>
+              <w:pStyle w:val="TableContents"/>
+              <w:suppressAutoHyphens w:val="true"/>
+              <w:bidi w:val="0"/>
+              <w:spacing w:lineRule="auto" w:line="259" w:before="0" w:after="160"/>
+              <w:jc w:val="start"/>
+              <w:rPr/>
             </w:pPr>
             <w:r>
               <w:rPr>
                 <w:rStyle w:val="SourceText"/>
-                <w:rFonts w:ascii="Nimbus Sans" w:hAnsi="Nimbus Sans"/>
-                <w:b w:val="false"/>
-                <w:bCs w:val="false"/>
-                <w:sz w:val="24"/>
-                <w:szCs w:val="24"/>
-                <w:shd w:fill="auto" w:val="clear"/>
+                <w:rFonts w:eastAsia="DejaVu Sans" w:cs="DejaVu Sans" w:ascii="Liberation Sans" w:hAnsi="Liberation Sans"/>
+                <w:color w:val="auto"/>
+                <w:kern w:val="2"/>
+                <w:sz w:val="24"/>
+                <w:szCs w:val="24"/>
+                <w:lang w:val="da-DK" w:eastAsia="en-US" w:bidi="ar-SA"/>
+                <w14:ligatures w14:val="standardContextual"/>
               </w:rPr>
               <w:t xml:space="preserve">Kompressor beskyttes mod hyppig genstart </w:t>
             </w:r>
@@ -1267,18 +1512,29 @@
           <w:p>
             <w:pPr>
               <w:pStyle w:val="TableContents"/>
-              <w:spacing w:before="0" w:after="160"/>
-              <w:rPr>
-                <w:rFonts w:ascii="Liberation Sans" w:hAnsi="Liberation Sans" w:eastAsia="DejaVu Sans" w:cs="DejaVu Sans"/>
-                <w:sz w:val="24"/>
-                <w:szCs w:val="24"/>
-              </w:rPr>
-            </w:pPr>
-            <w:r>
-              <w:rPr>
-                <w:rFonts w:eastAsia="DejaVu Sans" w:cs="DejaVu Sans" w:ascii="Liberation Sans" w:hAnsi="Liberation Sans"/>
-                <w:sz w:val="24"/>
-                <w:szCs w:val="24"/>
+              <w:suppressAutoHyphens w:val="true"/>
+              <w:bidi w:val="0"/>
+              <w:spacing w:lineRule="auto" w:line="259" w:before="0" w:after="160"/>
+              <w:jc w:val="start"/>
+              <w:rPr>
+                <w:rFonts w:ascii="Liberation Sans" w:hAnsi="Liberation Sans" w:eastAsia="DejaVu Sans" w:cs="DejaVu Sans"/>
+                <w:color w:val="auto"/>
+                <w:kern w:val="2"/>
+                <w:sz w:val="24"/>
+                <w:szCs w:val="24"/>
+                <w:lang w:val="da-DK" w:eastAsia="en-US" w:bidi="ar-SA"/>
+                <w14:ligatures w14:val="standardContextual"/>
+              </w:rPr>
+            </w:pPr>
+            <w:r>
+              <w:rPr>
+                <w:rFonts w:eastAsia="DejaVu Sans" w:cs="DejaVu Sans" w:ascii="Liberation Sans" w:hAnsi="Liberation Sans"/>
+                <w:color w:val="auto"/>
+                <w:kern w:val="2"/>
+                <w:sz w:val="24"/>
+                <w:szCs w:val="24"/>
+                <w:lang w:val="da-DK" w:eastAsia="en-US" w:bidi="ar-SA"/>
+                <w14:ligatures w14:val="standardContextual"/>
               </w:rPr>
               <w:t>Funktionelt</w:t>
             </w:r>
@@ -1294,21 +1550,25 @@
           </w:tcPr>
           <w:p>
             <w:pPr>
-              <w:pStyle w:val="PreformattedText"/>
-              <w:spacing w:before="0" w:after="160"/>
+              <w:pStyle w:val="TableContents"/>
+              <w:suppressAutoHyphens w:val="true"/>
+              <w:bidi w:val="0"/>
+              <w:spacing w:lineRule="auto" w:line="259" w:before="0" w:after="160"/>
+              <w:jc w:val="start"/>
               <w:rPr/>
             </w:pPr>
             <w:r>
               <w:rPr>
                 <w:rStyle w:val="SourceText"/>
-                <w:rFonts w:ascii="Nimbus Sans" w:hAnsi="Nimbus Sans"/>
-                <w:b w:val="false"/>
-                <w:bCs w:val="false"/>
-                <w:sz w:val="24"/>
-                <w:szCs w:val="24"/>
-                <w:shd w:fill="auto" w:val="clear"/>
-              </w:rPr>
-              <w:t>Affugteren må ikke tændes igen, før et fastsat minimumsinterval er gået siden sidste slukning. Minimumsintervallet gælder i alle driftstilstande, også ved kritisk luftfugtighed og ved fejl.</w:t>
+                <w:rFonts w:eastAsia="DejaVu Sans" w:cs="DejaVu Sans" w:ascii="Liberation Sans" w:hAnsi="Liberation Sans"/>
+                <w:color w:val="auto"/>
+                <w:kern w:val="2"/>
+                <w:sz w:val="24"/>
+                <w:szCs w:val="24"/>
+                <w:lang w:val="da-DK" w:eastAsia="en-US" w:bidi="ar-SA"/>
+                <w14:ligatures w14:val="standardContextual"/>
+              </w:rPr>
+              <w:t>Affugteren må ikke tændes igen, før mindst 15 minutter er gået siden sidste slukning. Minimumsintervallet gælder i alle driftstilstande, også ved kritisk luftfugtighed og ved fejl.</w:t>
             </w:r>
           </w:p>
         </w:tc>
@@ -1323,27 +1583,34 @@
           <w:p>
             <w:pPr>
               <w:pStyle w:val="TableContents"/>
-              <w:spacing w:before="0" w:after="160"/>
-              <w:rPr>
-                <w:rFonts w:ascii="Liberation Sans" w:hAnsi="Liberation Sans" w:eastAsia="DejaVu Sans" w:cs="DejaVu Sans"/>
-                <w:sz w:val="24"/>
-                <w:szCs w:val="24"/>
-              </w:rPr>
+              <w:suppressAutoHyphens w:val="true"/>
+              <w:bidi w:val="0"/>
+              <w:spacing w:lineRule="auto" w:line="259" w:before="0" w:after="160"/>
+              <w:jc w:val="start"/>
+              <w:rPr/>
             </w:pPr>
             <w:r>
               <w:rPr>
                 <w:rStyle w:val="Strong"/>
                 <w:rFonts w:eastAsia="DejaVu Sans" w:cs="DejaVu Sans" w:ascii="Liberation Sans" w:hAnsi="Liberation Sans"/>
-                <w:sz w:val="24"/>
-                <w:szCs w:val="24"/>
+                <w:color w:val="auto"/>
+                <w:kern w:val="2"/>
+                <w:sz w:val="24"/>
+                <w:szCs w:val="24"/>
+                <w:lang w:val="da-DK" w:eastAsia="en-US" w:bidi="ar-SA"/>
+                <w14:ligatures w14:val="standardContextual"/>
               </w:rPr>
               <w:t>Afklaret:</w:t>
             </w:r>
             <w:r>
               <w:rPr>
                 <w:rFonts w:eastAsia="DejaVu Sans" w:cs="DejaVu Sans" w:ascii="Liberation Sans" w:hAnsi="Liberation Sans"/>
-                <w:sz w:val="24"/>
-                <w:szCs w:val="24"/>
+                <w:color w:val="auto"/>
+                <w:kern w:val="2"/>
+                <w:sz w:val="24"/>
+                <w:szCs w:val="24"/>
+                <w:lang w:val="da-DK" w:eastAsia="en-US" w:bidi="ar-SA"/>
+                <w14:ligatures w14:val="standardContextual"/>
               </w:rPr>
               <w:t xml:space="preserve"> Brugsanvisningen angiver intet interval. Ved normal slukning kører blæseren videre for at fjerne varm luft (bilag 2, s. 9), hvilket ikke sker ved afbrydelse via smart plug. 15 minutter valgt af gruppen.</w:t>
             </w:r>
@@ -1363,18 +1630,29 @@
           <w:p>
             <w:pPr>
               <w:pStyle w:val="TableContents"/>
-              <w:spacing w:before="0" w:after="160"/>
-              <w:rPr>
-                <w:rFonts w:ascii="Liberation Sans" w:hAnsi="Liberation Sans" w:eastAsia="DejaVu Sans" w:cs="DejaVu Sans"/>
-                <w:sz w:val="24"/>
-                <w:szCs w:val="24"/>
-              </w:rPr>
-            </w:pPr>
-            <w:r>
-              <w:rPr>
-                <w:rFonts w:eastAsia="DejaVu Sans" w:cs="DejaVu Sans" w:ascii="Liberation Sans" w:hAnsi="Liberation Sans"/>
-                <w:sz w:val="24"/>
-                <w:szCs w:val="24"/>
+              <w:suppressAutoHyphens w:val="true"/>
+              <w:bidi w:val="0"/>
+              <w:spacing w:lineRule="auto" w:line="259" w:before="0" w:after="160"/>
+              <w:jc w:val="start"/>
+              <w:rPr>
+                <w:rFonts w:ascii="Liberation Sans" w:hAnsi="Liberation Sans" w:eastAsia="DejaVu Sans" w:cs="DejaVu Sans"/>
+                <w:color w:val="auto"/>
+                <w:kern w:val="2"/>
+                <w:sz w:val="24"/>
+                <w:szCs w:val="24"/>
+                <w:lang w:val="da-DK" w:eastAsia="en-US" w:bidi="ar-SA"/>
+                <w14:ligatures w14:val="standardContextual"/>
+              </w:rPr>
+            </w:pPr>
+            <w:r>
+              <w:rPr>
+                <w:rFonts w:eastAsia="DejaVu Sans" w:cs="DejaVu Sans" w:ascii="Liberation Sans" w:hAnsi="Liberation Sans"/>
+                <w:color w:val="auto"/>
+                <w:kern w:val="2"/>
+                <w:sz w:val="24"/>
+                <w:szCs w:val="24"/>
+                <w:lang w:val="da-DK" w:eastAsia="en-US" w:bidi="ar-SA"/>
+                <w14:ligatures w14:val="standardContextual"/>
               </w:rPr>
               <w:t>K-007</w:t>
             </w:r>
@@ -1391,18 +1669,29 @@
           <w:p>
             <w:pPr>
               <w:pStyle w:val="TableContents"/>
-              <w:spacing w:before="0" w:after="160"/>
-              <w:rPr>
-                <w:rFonts w:ascii="Liberation Sans" w:hAnsi="Liberation Sans" w:eastAsia="DejaVu Sans" w:cs="DejaVu Sans"/>
-                <w:sz w:val="24"/>
-                <w:szCs w:val="24"/>
-              </w:rPr>
-            </w:pPr>
-            <w:r>
-              <w:rPr>
-                <w:rFonts w:eastAsia="DejaVu Sans" w:cs="DejaVu Sans" w:ascii="Liberation Sans" w:hAnsi="Liberation Sans"/>
-                <w:sz w:val="24"/>
-                <w:szCs w:val="24"/>
+              <w:suppressAutoHyphens w:val="true"/>
+              <w:bidi w:val="0"/>
+              <w:spacing w:lineRule="auto" w:line="259" w:before="0" w:after="160"/>
+              <w:jc w:val="start"/>
+              <w:rPr>
+                <w:rFonts w:ascii="Liberation Sans" w:hAnsi="Liberation Sans" w:eastAsia="DejaVu Sans" w:cs="DejaVu Sans"/>
+                <w:color w:val="auto"/>
+                <w:kern w:val="2"/>
+                <w:sz w:val="24"/>
+                <w:szCs w:val="24"/>
+                <w:lang w:val="da-DK" w:eastAsia="en-US" w:bidi="ar-SA"/>
+                <w14:ligatures w14:val="standardContextual"/>
+              </w:rPr>
+            </w:pPr>
+            <w:r>
+              <w:rPr>
+                <w:rFonts w:eastAsia="DejaVu Sans" w:cs="DejaVu Sans" w:ascii="Liberation Sans" w:hAnsi="Liberation Sans"/>
+                <w:color w:val="auto"/>
+                <w:kern w:val="2"/>
+                <w:sz w:val="24"/>
+                <w:szCs w:val="24"/>
+                <w:lang w:val="da-DK" w:eastAsia="en-US" w:bidi="ar-SA"/>
+                <w14:ligatures w14:val="standardContextual"/>
               </w:rPr>
               <w:t>Hardware</w:t>
             </w:r>
@@ -1419,18 +1708,29 @@
           <w:p>
             <w:pPr>
               <w:pStyle w:val="TableContents"/>
-              <w:spacing w:before="0" w:after="160"/>
-              <w:rPr>
-                <w:rFonts w:ascii="Liberation Sans" w:hAnsi="Liberation Sans" w:eastAsia="DejaVu Sans" w:cs="DejaVu Sans"/>
-                <w:sz w:val="24"/>
-                <w:szCs w:val="24"/>
-              </w:rPr>
-            </w:pPr>
-            <w:r>
-              <w:rPr>
-                <w:rFonts w:eastAsia="DejaVu Sans" w:cs="DejaVu Sans" w:ascii="Liberation Sans" w:hAnsi="Liberation Sans"/>
-                <w:sz w:val="24"/>
-                <w:szCs w:val="24"/>
+              <w:suppressAutoHyphens w:val="true"/>
+              <w:bidi w:val="0"/>
+              <w:spacing w:lineRule="auto" w:line="259" w:before="0" w:after="160"/>
+              <w:jc w:val="start"/>
+              <w:rPr>
+                <w:rFonts w:ascii="Liberation Sans" w:hAnsi="Liberation Sans" w:eastAsia="DejaVu Sans" w:cs="DejaVu Sans"/>
+                <w:color w:val="auto"/>
+                <w:kern w:val="2"/>
+                <w:sz w:val="24"/>
+                <w:szCs w:val="24"/>
+                <w:lang w:val="da-DK" w:eastAsia="en-US" w:bidi="ar-SA"/>
+                <w14:ligatures w14:val="standardContextual"/>
+              </w:rPr>
+            </w:pPr>
+            <w:r>
+              <w:rPr>
+                <w:rFonts w:eastAsia="DejaVu Sans" w:cs="DejaVu Sans" w:ascii="Liberation Sans" w:hAnsi="Liberation Sans"/>
+                <w:color w:val="auto"/>
+                <w:kern w:val="2"/>
+                <w:sz w:val="24"/>
+                <w:szCs w:val="24"/>
+                <w:lang w:val="da-DK" w:eastAsia="en-US" w:bidi="ar-SA"/>
+                <w14:ligatures w14:val="standardContextual"/>
               </w:rPr>
               <w:t>Styring via smart plug (Shelly)</w:t>
             </w:r>
@@ -1447,18 +1747,29 @@
           <w:p>
             <w:pPr>
               <w:pStyle w:val="TableContents"/>
-              <w:spacing w:before="0" w:after="160"/>
-              <w:rPr>
-                <w:rFonts w:ascii="Liberation Sans" w:hAnsi="Liberation Sans" w:eastAsia="DejaVu Sans" w:cs="DejaVu Sans"/>
-                <w:sz w:val="24"/>
-                <w:szCs w:val="24"/>
-              </w:rPr>
-            </w:pPr>
-            <w:r>
-              <w:rPr>
-                <w:rFonts w:eastAsia="DejaVu Sans" w:cs="DejaVu Sans" w:ascii="Liberation Sans" w:hAnsi="Liberation Sans"/>
-                <w:sz w:val="24"/>
-                <w:szCs w:val="24"/>
+              <w:suppressAutoHyphens w:val="true"/>
+              <w:bidi w:val="0"/>
+              <w:spacing w:lineRule="auto" w:line="259" w:before="0" w:after="160"/>
+              <w:jc w:val="start"/>
+              <w:rPr>
+                <w:rFonts w:ascii="Liberation Sans" w:hAnsi="Liberation Sans" w:eastAsia="DejaVu Sans" w:cs="DejaVu Sans"/>
+                <w:color w:val="auto"/>
+                <w:kern w:val="2"/>
+                <w:sz w:val="24"/>
+                <w:szCs w:val="24"/>
+                <w:lang w:val="da-DK" w:eastAsia="en-US" w:bidi="ar-SA"/>
+                <w14:ligatures w14:val="standardContextual"/>
+              </w:rPr>
+            </w:pPr>
+            <w:r>
+              <w:rPr>
+                <w:rFonts w:eastAsia="DejaVu Sans" w:cs="DejaVu Sans" w:ascii="Liberation Sans" w:hAnsi="Liberation Sans"/>
+                <w:color w:val="auto"/>
+                <w:kern w:val="2"/>
+                <w:sz w:val="24"/>
+                <w:szCs w:val="24"/>
+                <w:lang w:val="da-DK" w:eastAsia="en-US" w:bidi="ar-SA"/>
+                <w14:ligatures w14:val="standardContextual"/>
               </w:rPr>
               <w:t>Integration</w:t>
             </w:r>
@@ -1475,18 +1786,29 @@
           <w:p>
             <w:pPr>
               <w:pStyle w:val="TableContents"/>
-              <w:spacing w:before="0" w:after="160"/>
-              <w:rPr>
-                <w:rFonts w:ascii="Liberation Sans" w:hAnsi="Liberation Sans" w:eastAsia="DejaVu Sans" w:cs="DejaVu Sans"/>
-                <w:sz w:val="24"/>
-                <w:szCs w:val="24"/>
-              </w:rPr>
-            </w:pPr>
-            <w:r>
-              <w:rPr>
-                <w:rFonts w:eastAsia="DejaVu Sans" w:cs="DejaVu Sans" w:ascii="Liberation Sans" w:hAnsi="Liberation Sans"/>
-                <w:sz w:val="24"/>
-                <w:szCs w:val="24"/>
+              <w:suppressAutoHyphens w:val="true"/>
+              <w:bidi w:val="0"/>
+              <w:spacing w:lineRule="auto" w:line="259" w:before="0" w:after="160"/>
+              <w:jc w:val="start"/>
+              <w:rPr>
+                <w:rFonts w:ascii="Liberation Sans" w:hAnsi="Liberation Sans" w:eastAsia="DejaVu Sans" w:cs="DejaVu Sans"/>
+                <w:color w:val="auto"/>
+                <w:kern w:val="2"/>
+                <w:sz w:val="24"/>
+                <w:szCs w:val="24"/>
+                <w:lang w:val="da-DK" w:eastAsia="en-US" w:bidi="ar-SA"/>
+                <w14:ligatures w14:val="standardContextual"/>
+              </w:rPr>
+            </w:pPr>
+            <w:r>
+              <w:rPr>
+                <w:rFonts w:eastAsia="DejaVu Sans" w:cs="DejaVu Sans" w:ascii="Liberation Sans" w:hAnsi="Liberation Sans"/>
+                <w:color w:val="auto"/>
+                <w:kern w:val="2"/>
+                <w:sz w:val="24"/>
+                <w:szCs w:val="24"/>
+                <w:lang w:val="da-DK" w:eastAsia="en-US" w:bidi="ar-SA"/>
+                <w14:ligatures w14:val="standardContextual"/>
               </w:rPr>
               <w:t>Systemet skal tænde og slukke en Shelly smart plug via det lokale netværk.</w:t>
             </w:r>
@@ -1503,20 +1825,31 @@
           <w:p>
             <w:pPr>
               <w:pStyle w:val="TableContents"/>
-              <w:spacing w:before="0" w:after="160"/>
-              <w:rPr>
-                <w:rFonts w:ascii="Liberation Sans" w:hAnsi="Liberation Sans" w:eastAsia="DejaVu Sans" w:cs="DejaVu Sans"/>
-                <w:sz w:val="24"/>
-                <w:szCs w:val="24"/>
-              </w:rPr>
-            </w:pPr>
-            <w:r>
-              <w:rPr>
-                <w:rFonts w:eastAsia="DejaVu Sans" w:cs="DejaVu Sans" w:ascii="Liberation Sans" w:hAnsi="Liberation Sans"/>
-                <w:sz w:val="24"/>
-                <w:szCs w:val="24"/>
-              </w:rPr>
-              <w:t>Hvilken Shelly model? Kan den styres lokalt uden cloud?</w:t>
+              <w:suppressAutoHyphens w:val="true"/>
+              <w:bidi w:val="0"/>
+              <w:spacing w:lineRule="auto" w:line="259" w:before="0" w:after="160"/>
+              <w:jc w:val="start"/>
+              <w:rPr>
+                <w:rFonts w:ascii="Liberation Sans" w:hAnsi="Liberation Sans" w:eastAsia="DejaVu Sans" w:cs="DejaVu Sans"/>
+                <w:color w:val="auto"/>
+                <w:kern w:val="2"/>
+                <w:sz w:val="24"/>
+                <w:szCs w:val="24"/>
+                <w:lang w:val="da-DK" w:eastAsia="en-US" w:bidi="ar-SA"/>
+                <w14:ligatures w14:val="standardContextual"/>
+              </w:rPr>
+            </w:pPr>
+            <w:r>
+              <w:rPr>
+                <w:rFonts w:eastAsia="DejaVu Sans" w:cs="DejaVu Sans" w:ascii="Liberation Sans" w:hAnsi="Liberation Sans"/>
+                <w:color w:val="auto"/>
+                <w:kern w:val="2"/>
+                <w:sz w:val="24"/>
+                <w:szCs w:val="24"/>
+                <w:lang w:val="da-DK" w:eastAsia="en-US" w:bidi="ar-SA"/>
+                <w14:ligatures w14:val="standardContextual"/>
+              </w:rPr>
+              <w:t>Afklaret: Shelly Plug S Gen3, fast IP, lokalt via HTTP</w:t>
             </w:r>
           </w:p>
         </w:tc>
@@ -1534,18 +1867,29 @@
           <w:p>
             <w:pPr>
               <w:pStyle w:val="TableContents"/>
-              <w:spacing w:before="0" w:after="160"/>
-              <w:rPr>
-                <w:rFonts w:ascii="Liberation Sans" w:hAnsi="Liberation Sans" w:eastAsia="DejaVu Sans" w:cs="DejaVu Sans"/>
-                <w:sz w:val="24"/>
-                <w:szCs w:val="24"/>
-              </w:rPr>
-            </w:pPr>
-            <w:r>
-              <w:rPr>
-                <w:rFonts w:eastAsia="DejaVu Sans" w:cs="DejaVu Sans" w:ascii="Liberation Sans" w:hAnsi="Liberation Sans"/>
-                <w:sz w:val="24"/>
-                <w:szCs w:val="24"/>
+              <w:suppressAutoHyphens w:val="true"/>
+              <w:bidi w:val="0"/>
+              <w:spacing w:lineRule="auto" w:line="259" w:before="0" w:after="160"/>
+              <w:jc w:val="start"/>
+              <w:rPr>
+                <w:rFonts w:ascii="Liberation Sans" w:hAnsi="Liberation Sans" w:eastAsia="DejaVu Sans" w:cs="DejaVu Sans"/>
+                <w:color w:val="auto"/>
+                <w:kern w:val="2"/>
+                <w:sz w:val="24"/>
+                <w:szCs w:val="24"/>
+                <w:lang w:val="da-DK" w:eastAsia="en-US" w:bidi="ar-SA"/>
+                <w14:ligatures w14:val="standardContextual"/>
+              </w:rPr>
+            </w:pPr>
+            <w:r>
+              <w:rPr>
+                <w:rFonts w:eastAsia="DejaVu Sans" w:cs="DejaVu Sans" w:ascii="Liberation Sans" w:hAnsi="Liberation Sans"/>
+                <w:color w:val="auto"/>
+                <w:kern w:val="2"/>
+                <w:sz w:val="24"/>
+                <w:szCs w:val="24"/>
+                <w:lang w:val="da-DK" w:eastAsia="en-US" w:bidi="ar-SA"/>
+                <w14:ligatures w14:val="standardContextual"/>
               </w:rPr>
               <w:t>K-008</w:t>
             </w:r>
@@ -1562,18 +1906,29 @@
           <w:p>
             <w:pPr>
               <w:pStyle w:val="TableContents"/>
-              <w:spacing w:before="0" w:after="160"/>
-              <w:rPr>
-                <w:rFonts w:ascii="Liberation Sans" w:hAnsi="Liberation Sans" w:eastAsia="DejaVu Sans" w:cs="DejaVu Sans"/>
-                <w:sz w:val="24"/>
-                <w:szCs w:val="24"/>
-              </w:rPr>
-            </w:pPr>
-            <w:r>
-              <w:rPr>
-                <w:rFonts w:eastAsia="DejaVu Sans" w:cs="DejaVu Sans" w:ascii="Liberation Sans" w:hAnsi="Liberation Sans"/>
-                <w:sz w:val="24"/>
-                <w:szCs w:val="24"/>
+              <w:suppressAutoHyphens w:val="true"/>
+              <w:bidi w:val="0"/>
+              <w:spacing w:lineRule="auto" w:line="259" w:before="0" w:after="160"/>
+              <w:jc w:val="start"/>
+              <w:rPr>
+                <w:rFonts w:ascii="Liberation Sans" w:hAnsi="Liberation Sans" w:eastAsia="DejaVu Sans" w:cs="DejaVu Sans"/>
+                <w:color w:val="auto"/>
+                <w:kern w:val="2"/>
+                <w:sz w:val="24"/>
+                <w:szCs w:val="24"/>
+                <w:lang w:val="da-DK" w:eastAsia="en-US" w:bidi="ar-SA"/>
+                <w14:ligatures w14:val="standardContextual"/>
+              </w:rPr>
+            </w:pPr>
+            <w:r>
+              <w:rPr>
+                <w:rFonts w:eastAsia="DejaVu Sans" w:cs="DejaVu Sans" w:ascii="Liberation Sans" w:hAnsi="Liberation Sans"/>
+                <w:color w:val="auto"/>
+                <w:kern w:val="2"/>
+                <w:sz w:val="24"/>
+                <w:szCs w:val="24"/>
+                <w:lang w:val="da-DK" w:eastAsia="en-US" w:bidi="ar-SA"/>
+                <w14:ligatures w14:val="standardContextual"/>
               </w:rPr>
               <w:t>Data</w:t>
             </w:r>
@@ -1590,18 +1945,29 @@
           <w:p>
             <w:pPr>
               <w:pStyle w:val="TableContents"/>
-              <w:spacing w:before="0" w:after="160"/>
-              <w:rPr>
-                <w:rFonts w:ascii="Liberation Sans" w:hAnsi="Liberation Sans" w:eastAsia="DejaVu Sans" w:cs="DejaVu Sans"/>
-                <w:sz w:val="24"/>
-                <w:szCs w:val="24"/>
-              </w:rPr>
-            </w:pPr>
-            <w:r>
-              <w:rPr>
-                <w:rFonts w:eastAsia="DejaVu Sans" w:cs="DejaVu Sans" w:ascii="Liberation Sans" w:hAnsi="Liberation Sans"/>
-                <w:sz w:val="24"/>
-                <w:szCs w:val="24"/>
+              <w:suppressAutoHyphens w:val="true"/>
+              <w:bidi w:val="0"/>
+              <w:spacing w:lineRule="auto" w:line="259" w:before="0" w:after="160"/>
+              <w:jc w:val="start"/>
+              <w:rPr>
+                <w:rFonts w:ascii="Liberation Sans" w:hAnsi="Liberation Sans" w:eastAsia="DejaVu Sans" w:cs="DejaVu Sans"/>
+                <w:color w:val="auto"/>
+                <w:kern w:val="2"/>
+                <w:sz w:val="24"/>
+                <w:szCs w:val="24"/>
+                <w:lang w:val="da-DK" w:eastAsia="en-US" w:bidi="ar-SA"/>
+                <w14:ligatures w14:val="standardContextual"/>
+              </w:rPr>
+            </w:pPr>
+            <w:r>
+              <w:rPr>
+                <w:rFonts w:eastAsia="DejaVu Sans" w:cs="DejaVu Sans" w:ascii="Liberation Sans" w:hAnsi="Liberation Sans"/>
+                <w:color w:val="auto"/>
+                <w:kern w:val="2"/>
+                <w:sz w:val="24"/>
+                <w:szCs w:val="24"/>
+                <w:lang w:val="da-DK" w:eastAsia="en-US" w:bidi="ar-SA"/>
+                <w14:ligatures w14:val="standardContextual"/>
               </w:rPr>
               <w:t>Data anvendes som grundlag for beslutninger</w:t>
             </w:r>
@@ -1618,18 +1984,29 @@
           <w:p>
             <w:pPr>
               <w:pStyle w:val="TableContents"/>
-              <w:spacing w:before="0" w:after="160"/>
-              <w:rPr>
-                <w:rFonts w:ascii="Liberation Sans" w:hAnsi="Liberation Sans" w:eastAsia="DejaVu Sans" w:cs="DejaVu Sans"/>
-                <w:sz w:val="24"/>
-                <w:szCs w:val="24"/>
-              </w:rPr>
-            </w:pPr>
-            <w:r>
-              <w:rPr>
-                <w:rFonts w:eastAsia="DejaVu Sans" w:cs="DejaVu Sans" w:ascii="Liberation Sans" w:hAnsi="Liberation Sans"/>
-                <w:sz w:val="24"/>
-                <w:szCs w:val="24"/>
+              <w:suppressAutoHyphens w:val="true"/>
+              <w:bidi w:val="0"/>
+              <w:spacing w:lineRule="auto" w:line="259" w:before="0" w:after="160"/>
+              <w:jc w:val="start"/>
+              <w:rPr>
+                <w:rFonts w:ascii="Liberation Sans" w:hAnsi="Liberation Sans" w:eastAsia="DejaVu Sans" w:cs="DejaVu Sans"/>
+                <w:color w:val="auto"/>
+                <w:kern w:val="2"/>
+                <w:sz w:val="24"/>
+                <w:szCs w:val="24"/>
+                <w:lang w:val="da-DK" w:eastAsia="en-US" w:bidi="ar-SA"/>
+                <w14:ligatures w14:val="standardContextual"/>
+              </w:rPr>
+            </w:pPr>
+            <w:r>
+              <w:rPr>
+                <w:rFonts w:eastAsia="DejaVu Sans" w:cs="DejaVu Sans" w:ascii="Liberation Sans" w:hAnsi="Liberation Sans"/>
+                <w:color w:val="auto"/>
+                <w:kern w:val="2"/>
+                <w:sz w:val="24"/>
+                <w:szCs w:val="24"/>
+                <w:lang w:val="da-DK" w:eastAsia="en-US" w:bidi="ar-SA"/>
+                <w14:ligatures w14:val="standardContextual"/>
               </w:rPr>
               <w:t>Data</w:t>
             </w:r>
@@ -1646,20 +2023,31 @@
           <w:p>
             <w:pPr>
               <w:pStyle w:val="TableContents"/>
-              <w:spacing w:before="0" w:after="160"/>
-              <w:rPr>
-                <w:rFonts w:ascii="Liberation Sans" w:hAnsi="Liberation Sans" w:eastAsia="DejaVu Sans" w:cs="DejaVu Sans"/>
-                <w:sz w:val="24"/>
-                <w:szCs w:val="24"/>
-              </w:rPr>
-            </w:pPr>
-            <w:r>
-              <w:rPr>
-                <w:rFonts w:eastAsia="DejaVu Sans" w:cs="DejaVu Sans" w:ascii="Liberation Sans" w:hAnsi="Liberation Sans"/>
-                <w:sz w:val="24"/>
-                <w:szCs w:val="24"/>
-              </w:rPr>
-              <w:t>Systemet skal gemme dagens elpriser i en lokal db på Pi, så styringen kan fortsætte ved kortvarigt internetudfald.</w:t>
+              <w:suppressAutoHyphens w:val="true"/>
+              <w:bidi w:val="0"/>
+              <w:spacing w:lineRule="auto" w:line="259" w:before="0" w:after="160"/>
+              <w:jc w:val="start"/>
+              <w:rPr>
+                <w:rFonts w:ascii="Liberation Sans" w:hAnsi="Liberation Sans" w:eastAsia="DejaVu Sans" w:cs="DejaVu Sans"/>
+                <w:color w:val="auto"/>
+                <w:kern w:val="2"/>
+                <w:sz w:val="24"/>
+                <w:szCs w:val="24"/>
+                <w:lang w:val="da-DK" w:eastAsia="en-US" w:bidi="ar-SA"/>
+                <w14:ligatures w14:val="standardContextual"/>
+              </w:rPr>
+            </w:pPr>
+            <w:r>
+              <w:rPr>
+                <w:rFonts w:eastAsia="DejaVu Sans" w:cs="DejaVu Sans" w:ascii="Liberation Sans" w:hAnsi="Liberation Sans"/>
+                <w:color w:val="auto"/>
+                <w:kern w:val="2"/>
+                <w:sz w:val="24"/>
+                <w:szCs w:val="24"/>
+                <w:lang w:val="da-DK" w:eastAsia="en-US" w:bidi="ar-SA"/>
+                <w14:ligatures w14:val="standardContextual"/>
+              </w:rPr>
+              <w:t>Systemet skal gemme dagens kvarterpriser i den lokale database på Raspberry Pi'en, så styringen kan fortsætte ved kortvarigt internetudfald.</w:t>
             </w:r>
           </w:p>
         </w:tc>
@@ -1674,20 +2062,31 @@
           <w:p>
             <w:pPr>
               <w:pStyle w:val="TableContents"/>
-              <w:spacing w:before="0" w:after="160"/>
-              <w:rPr>
-                <w:rFonts w:ascii="Liberation Sans" w:hAnsi="Liberation Sans" w:eastAsia="DejaVu Sans" w:cs="DejaVu Sans"/>
-                <w:sz w:val="24"/>
-                <w:szCs w:val="24"/>
-              </w:rPr>
-            </w:pPr>
-            <w:r>
-              <w:rPr>
-                <w:rFonts w:eastAsia="DejaVu Sans" w:cs="DejaVu Sans" w:ascii="Liberation Sans" w:hAnsi="Liberation Sans"/>
-                <w:sz w:val="24"/>
-                <w:szCs w:val="24"/>
-              </w:rPr>
-              <w:t>Hvor længe skal data gemmes?</w:t>
+              <w:suppressAutoHyphens w:val="true"/>
+              <w:bidi w:val="0"/>
+              <w:spacing w:lineRule="auto" w:line="259" w:before="0" w:after="160"/>
+              <w:jc w:val="start"/>
+              <w:rPr>
+                <w:rFonts w:ascii="Liberation Sans" w:hAnsi="Liberation Sans" w:eastAsia="DejaVu Sans" w:cs="DejaVu Sans"/>
+                <w:color w:val="auto"/>
+                <w:kern w:val="2"/>
+                <w:sz w:val="24"/>
+                <w:szCs w:val="24"/>
+                <w:lang w:val="da-DK" w:eastAsia="en-US" w:bidi="ar-SA"/>
+                <w14:ligatures w14:val="standardContextual"/>
+              </w:rPr>
+            </w:pPr>
+            <w:r>
+              <w:rPr>
+                <w:rFonts w:eastAsia="DejaVu Sans" w:cs="DejaVu Sans" w:ascii="Liberation Sans" w:hAnsi="Liberation Sans"/>
+                <w:color w:val="auto"/>
+                <w:kern w:val="2"/>
+                <w:sz w:val="24"/>
+                <w:szCs w:val="24"/>
+                <w:lang w:val="da-DK" w:eastAsia="en-US" w:bidi="ar-SA"/>
+                <w14:ligatures w14:val="standardContextual"/>
+              </w:rPr>
+              <w:t>Afklaret: 48 timer</w:t>
             </w:r>
           </w:p>
         </w:tc>
@@ -1705,18 +2104,29 @@
           <w:p>
             <w:pPr>
               <w:pStyle w:val="TableContents"/>
-              <w:spacing w:before="0" w:after="160"/>
-              <w:rPr>
-                <w:rFonts w:ascii="Liberation Sans" w:hAnsi="Liberation Sans" w:eastAsia="DejaVu Sans" w:cs="DejaVu Sans"/>
-                <w:sz w:val="24"/>
-                <w:szCs w:val="24"/>
-              </w:rPr>
-            </w:pPr>
-            <w:r>
-              <w:rPr>
-                <w:rFonts w:eastAsia="DejaVu Sans" w:cs="DejaVu Sans" w:ascii="Liberation Sans" w:hAnsi="Liberation Sans"/>
-                <w:sz w:val="24"/>
-                <w:szCs w:val="24"/>
+              <w:suppressAutoHyphens w:val="true"/>
+              <w:bidi w:val="0"/>
+              <w:spacing w:lineRule="auto" w:line="259" w:before="0" w:after="160"/>
+              <w:jc w:val="start"/>
+              <w:rPr>
+                <w:rFonts w:ascii="Liberation Sans" w:hAnsi="Liberation Sans" w:eastAsia="DejaVu Sans" w:cs="DejaVu Sans"/>
+                <w:color w:val="auto"/>
+                <w:kern w:val="2"/>
+                <w:sz w:val="24"/>
+                <w:szCs w:val="24"/>
+                <w:lang w:val="da-DK" w:eastAsia="en-US" w:bidi="ar-SA"/>
+                <w14:ligatures w14:val="standardContextual"/>
+              </w:rPr>
+            </w:pPr>
+            <w:r>
+              <w:rPr>
+                <w:rFonts w:eastAsia="DejaVu Sans" w:cs="DejaVu Sans" w:ascii="Liberation Sans" w:hAnsi="Liberation Sans"/>
+                <w:color w:val="auto"/>
+                <w:kern w:val="2"/>
+                <w:sz w:val="24"/>
+                <w:szCs w:val="24"/>
+                <w:lang w:val="da-DK" w:eastAsia="en-US" w:bidi="ar-SA"/>
+                <w14:ligatures w14:val="standardContextual"/>
               </w:rPr>
               <w:t>K-009</w:t>
             </w:r>
@@ -1889,18 +2299,29 @@
           <w:p>
             <w:pPr>
               <w:pStyle w:val="TableContents"/>
-              <w:spacing w:before="0" w:after="160"/>
-              <w:rPr>
-                <w:rFonts w:ascii="Liberation Sans" w:hAnsi="Liberation Sans" w:eastAsia="DejaVu Sans" w:cs="DejaVu Sans"/>
-                <w:sz w:val="24"/>
-                <w:szCs w:val="24"/>
-              </w:rPr>
-            </w:pPr>
-            <w:r>
-              <w:rPr>
-                <w:rFonts w:eastAsia="DejaVu Sans" w:cs="DejaVu Sans" w:ascii="Liberation Sans" w:hAnsi="Liberation Sans"/>
-                <w:sz w:val="24"/>
-                <w:szCs w:val="24"/>
+              <w:suppressAutoHyphens w:val="true"/>
+              <w:bidi w:val="0"/>
+              <w:spacing w:lineRule="auto" w:line="259" w:before="0" w:after="160"/>
+              <w:jc w:val="start"/>
+              <w:rPr>
+                <w:rFonts w:ascii="Liberation Sans" w:hAnsi="Liberation Sans" w:eastAsia="DejaVu Sans" w:cs="DejaVu Sans"/>
+                <w:color w:val="auto"/>
+                <w:kern w:val="2"/>
+                <w:sz w:val="24"/>
+                <w:szCs w:val="24"/>
+                <w:lang w:val="da-DK" w:eastAsia="en-US" w:bidi="ar-SA"/>
+                <w14:ligatures w14:val="standardContextual"/>
+              </w:rPr>
+            </w:pPr>
+            <w:r>
+              <w:rPr>
+                <w:rFonts w:eastAsia="DejaVu Sans" w:cs="DejaVu Sans" w:ascii="Liberation Sans" w:hAnsi="Liberation Sans"/>
+                <w:color w:val="auto"/>
+                <w:kern w:val="2"/>
+                <w:sz w:val="24"/>
+                <w:szCs w:val="24"/>
+                <w:lang w:val="da-DK" w:eastAsia="en-US" w:bidi="ar-SA"/>
+                <w14:ligatures w14:val="standardContextual"/>
               </w:rPr>
               <w:t>Hvor længe skal loggen gemmes? Skal kunden kunne se den?</w:t>
             </w:r>
@@ -1920,18 +2341,29 @@
           <w:p>
             <w:pPr>
               <w:pStyle w:val="TableContents"/>
-              <w:spacing w:before="0" w:after="160"/>
-              <w:rPr>
-                <w:rFonts w:ascii="Liberation Sans" w:hAnsi="Liberation Sans" w:eastAsia="DejaVu Sans" w:cs="DejaVu Sans"/>
-                <w:sz w:val="24"/>
-                <w:szCs w:val="24"/>
-              </w:rPr>
-            </w:pPr>
-            <w:r>
-              <w:rPr>
-                <w:rFonts w:eastAsia="DejaVu Sans" w:cs="DejaVu Sans" w:ascii="Liberation Sans" w:hAnsi="Liberation Sans"/>
-                <w:sz w:val="24"/>
-                <w:szCs w:val="24"/>
+              <w:suppressAutoHyphens w:val="true"/>
+              <w:bidi w:val="0"/>
+              <w:spacing w:lineRule="auto" w:line="259" w:before="0" w:after="160"/>
+              <w:jc w:val="start"/>
+              <w:rPr>
+                <w:rFonts w:ascii="Liberation Sans" w:hAnsi="Liberation Sans" w:eastAsia="DejaVu Sans" w:cs="DejaVu Sans"/>
+                <w:color w:val="auto"/>
+                <w:kern w:val="2"/>
+                <w:sz w:val="24"/>
+                <w:szCs w:val="24"/>
+                <w:lang w:val="da-DK" w:eastAsia="en-US" w:bidi="ar-SA"/>
+                <w14:ligatures w14:val="standardContextual"/>
+              </w:rPr>
+            </w:pPr>
+            <w:r>
+              <w:rPr>
+                <w:rFonts w:eastAsia="DejaVu Sans" w:cs="DejaVu Sans" w:ascii="Liberation Sans" w:hAnsi="Liberation Sans"/>
+                <w:color w:val="auto"/>
+                <w:kern w:val="2"/>
+                <w:sz w:val="24"/>
+                <w:szCs w:val="24"/>
+                <w:lang w:val="da-DK" w:eastAsia="en-US" w:bidi="ar-SA"/>
+                <w14:ligatures w14:val="standardContextual"/>
               </w:rPr>
               <w:t>K-010</w:t>
             </w:r>
@@ -2011,7 +2443,7 @@
                 <w:lang w:val="da-DK" w:eastAsia="en-US" w:bidi="ar-SA"/>
                 <w14:ligatures w14:val="standardContextual"/>
               </w:rPr>
-              <w:t>Luftfugtigheden måles og anvendes som grundlag for styringHistorik over luftfugtighedsmålinger</w:t>
+              <w:t>Luftfugtigheden måles og anvendes som grundlag for styring Historik over luftfugtighedsmålinger</w:t>
             </w:r>
           </w:p>
         </w:tc>
@@ -2104,18 +2536,29 @@
           <w:p>
             <w:pPr>
               <w:pStyle w:val="TableContents"/>
-              <w:spacing w:before="0" w:after="160"/>
-              <w:rPr>
-                <w:rFonts w:ascii="Liberation Sans" w:hAnsi="Liberation Sans" w:eastAsia="DejaVu Sans" w:cs="DejaVu Sans"/>
-                <w:sz w:val="24"/>
-                <w:szCs w:val="24"/>
-              </w:rPr>
-            </w:pPr>
-            <w:r>
-              <w:rPr>
-                <w:rFonts w:eastAsia="DejaVu Sans" w:cs="DejaVu Sans" w:ascii="Liberation Sans" w:hAnsi="Liberation Sans"/>
-                <w:sz w:val="24"/>
-                <w:szCs w:val="24"/>
+              <w:suppressAutoHyphens w:val="true"/>
+              <w:bidi w:val="0"/>
+              <w:spacing w:lineRule="auto" w:line="259" w:before="0" w:after="160"/>
+              <w:jc w:val="start"/>
+              <w:rPr>
+                <w:rFonts w:ascii="Liberation Sans" w:hAnsi="Liberation Sans" w:eastAsia="DejaVu Sans" w:cs="DejaVu Sans"/>
+                <w:color w:val="auto"/>
+                <w:kern w:val="2"/>
+                <w:sz w:val="24"/>
+                <w:szCs w:val="24"/>
+                <w:lang w:val="da-DK" w:eastAsia="en-US" w:bidi="ar-SA"/>
+                <w14:ligatures w14:val="standardContextual"/>
+              </w:rPr>
+            </w:pPr>
+            <w:r>
+              <w:rPr>
+                <w:rFonts w:eastAsia="DejaVu Sans" w:cs="DejaVu Sans" w:ascii="Liberation Sans" w:hAnsi="Liberation Sans"/>
+                <w:color w:val="auto"/>
+                <w:kern w:val="2"/>
+                <w:sz w:val="24"/>
+                <w:szCs w:val="24"/>
+                <w:lang w:val="da-DK" w:eastAsia="en-US" w:bidi="ar-SA"/>
+                <w14:ligatures w14:val="standardContextual"/>
               </w:rPr>
               <w:t>Hvor længe skal målingerne gemmes? Skal brugeren kunne se historikken?</w:t>
             </w:r>
@@ -2135,18 +2578,29 @@
           <w:p>
             <w:pPr>
               <w:pStyle w:val="TableContents"/>
-              <w:spacing w:before="0" w:after="160"/>
-              <w:rPr>
-                <w:rFonts w:ascii="Liberation Sans" w:hAnsi="Liberation Sans" w:eastAsia="DejaVu Sans" w:cs="DejaVu Sans"/>
-                <w:sz w:val="24"/>
-                <w:szCs w:val="24"/>
-              </w:rPr>
-            </w:pPr>
-            <w:r>
-              <w:rPr>
-                <w:rFonts w:eastAsia="DejaVu Sans" w:cs="DejaVu Sans" w:ascii="Liberation Sans" w:hAnsi="Liberation Sans"/>
-                <w:sz w:val="24"/>
-                <w:szCs w:val="24"/>
+              <w:suppressAutoHyphens w:val="true"/>
+              <w:bidi w:val="0"/>
+              <w:spacing w:lineRule="auto" w:line="259" w:before="0" w:after="160"/>
+              <w:jc w:val="start"/>
+              <w:rPr>
+                <w:rFonts w:ascii="Liberation Sans" w:hAnsi="Liberation Sans" w:eastAsia="DejaVu Sans" w:cs="DejaVu Sans"/>
+                <w:color w:val="auto"/>
+                <w:kern w:val="2"/>
+                <w:sz w:val="24"/>
+                <w:szCs w:val="24"/>
+                <w:lang w:val="da-DK" w:eastAsia="en-US" w:bidi="ar-SA"/>
+                <w14:ligatures w14:val="standardContextual"/>
+              </w:rPr>
+            </w:pPr>
+            <w:r>
+              <w:rPr>
+                <w:rFonts w:eastAsia="DejaVu Sans" w:cs="DejaVu Sans" w:ascii="Liberation Sans" w:hAnsi="Liberation Sans"/>
+                <w:color w:val="auto"/>
+                <w:kern w:val="2"/>
+                <w:sz w:val="24"/>
+                <w:szCs w:val="24"/>
+                <w:lang w:val="da-DK" w:eastAsia="en-US" w:bidi="ar-SA"/>
+                <w14:ligatures w14:val="standardContextual"/>
               </w:rPr>
               <w:t>K-011</w:t>
             </w:r>
@@ -2163,18 +2617,29 @@
           <w:p>
             <w:pPr>
               <w:pStyle w:val="TableContents"/>
-              <w:spacing w:before="0" w:after="160"/>
-              <w:rPr>
-                <w:rFonts w:ascii="Liberation Sans" w:hAnsi="Liberation Sans" w:eastAsia="DejaVu Sans" w:cs="DejaVu Sans"/>
-                <w:sz w:val="24"/>
-                <w:szCs w:val="24"/>
-              </w:rPr>
-            </w:pPr>
-            <w:r>
-              <w:rPr>
-                <w:rFonts w:eastAsia="DejaVu Sans" w:cs="DejaVu Sans" w:ascii="Liberation Sans" w:hAnsi="Liberation Sans"/>
-                <w:sz w:val="24"/>
-                <w:szCs w:val="24"/>
+              <w:suppressAutoHyphens w:val="true"/>
+              <w:bidi w:val="0"/>
+              <w:spacing w:lineRule="auto" w:line="259" w:before="0" w:after="160"/>
+              <w:jc w:val="start"/>
+              <w:rPr>
+                <w:rFonts w:ascii="Liberation Sans" w:hAnsi="Liberation Sans" w:eastAsia="DejaVu Sans" w:cs="DejaVu Sans"/>
+                <w:color w:val="auto"/>
+                <w:kern w:val="2"/>
+                <w:sz w:val="24"/>
+                <w:szCs w:val="24"/>
+                <w:lang w:val="da-DK" w:eastAsia="en-US" w:bidi="ar-SA"/>
+                <w14:ligatures w14:val="standardContextual"/>
+              </w:rPr>
+            </w:pPr>
+            <w:r>
+              <w:rPr>
+                <w:rFonts w:eastAsia="DejaVu Sans" w:cs="DejaVu Sans" w:ascii="Liberation Sans" w:hAnsi="Liberation Sans"/>
+                <w:color w:val="auto"/>
+                <w:kern w:val="2"/>
+                <w:sz w:val="24"/>
+                <w:szCs w:val="24"/>
+                <w:lang w:val="da-DK" w:eastAsia="en-US" w:bidi="ar-SA"/>
+                <w14:ligatures w14:val="standardContextual"/>
               </w:rPr>
               <w:t>Fejlhåndtering</w:t>
             </w:r>
@@ -2191,18 +2656,29 @@
           <w:p>
             <w:pPr>
               <w:pStyle w:val="TableContents"/>
-              <w:spacing w:before="0" w:after="160"/>
-              <w:rPr>
-                <w:rFonts w:ascii="Liberation Sans" w:hAnsi="Liberation Sans" w:eastAsia="DejaVu Sans" w:cs="DejaVu Sans"/>
-                <w:sz w:val="24"/>
-                <w:szCs w:val="24"/>
-              </w:rPr>
-            </w:pPr>
-            <w:r>
-              <w:rPr>
-                <w:rFonts w:eastAsia="DejaVu Sans" w:cs="DejaVu Sans" w:ascii="Liberation Sans" w:hAnsi="Liberation Sans"/>
-                <w:sz w:val="24"/>
-                <w:szCs w:val="24"/>
+              <w:suppressAutoHyphens w:val="true"/>
+              <w:bidi w:val="0"/>
+              <w:spacing w:lineRule="auto" w:line="259" w:before="0" w:after="160"/>
+              <w:jc w:val="start"/>
+              <w:rPr>
+                <w:rFonts w:ascii="Liberation Sans" w:hAnsi="Liberation Sans" w:eastAsia="DejaVu Sans" w:cs="DejaVu Sans"/>
+                <w:color w:val="auto"/>
+                <w:kern w:val="2"/>
+                <w:sz w:val="24"/>
+                <w:szCs w:val="24"/>
+                <w:lang w:val="da-DK" w:eastAsia="en-US" w:bidi="ar-SA"/>
+                <w14:ligatures w14:val="standardContextual"/>
+              </w:rPr>
+            </w:pPr>
+            <w:r>
+              <w:rPr>
+                <w:rFonts w:eastAsia="DejaVu Sans" w:cs="DejaVu Sans" w:ascii="Liberation Sans" w:hAnsi="Liberation Sans"/>
+                <w:color w:val="auto"/>
+                <w:kern w:val="2"/>
+                <w:sz w:val="24"/>
+                <w:szCs w:val="24"/>
+                <w:lang w:val="da-DK" w:eastAsia="en-US" w:bidi="ar-SA"/>
+                <w14:ligatures w14:val="standardContextual"/>
               </w:rPr>
               <w:t>Utilgængelige elprisdata</w:t>
             </w:r>
@@ -2219,18 +2695,29 @@
           <w:p>
             <w:pPr>
               <w:pStyle w:val="TableContents"/>
-              <w:spacing w:before="0" w:after="160"/>
-              <w:rPr>
-                <w:rFonts w:ascii="Liberation Sans" w:hAnsi="Liberation Sans" w:eastAsia="DejaVu Sans" w:cs="DejaVu Sans"/>
-                <w:sz w:val="24"/>
-                <w:szCs w:val="24"/>
-              </w:rPr>
-            </w:pPr>
-            <w:r>
-              <w:rPr>
-                <w:rFonts w:eastAsia="DejaVu Sans" w:cs="DejaVu Sans" w:ascii="Liberation Sans" w:hAnsi="Liberation Sans"/>
-                <w:sz w:val="24"/>
-                <w:szCs w:val="24"/>
+              <w:suppressAutoHyphens w:val="true"/>
+              <w:bidi w:val="0"/>
+              <w:spacing w:lineRule="auto" w:line="259" w:before="0" w:after="160"/>
+              <w:jc w:val="start"/>
+              <w:rPr>
+                <w:rFonts w:ascii="Liberation Sans" w:hAnsi="Liberation Sans" w:eastAsia="DejaVu Sans" w:cs="DejaVu Sans"/>
+                <w:color w:val="auto"/>
+                <w:kern w:val="2"/>
+                <w:sz w:val="24"/>
+                <w:szCs w:val="24"/>
+                <w:lang w:val="da-DK" w:eastAsia="en-US" w:bidi="ar-SA"/>
+                <w14:ligatures w14:val="standardContextual"/>
+              </w:rPr>
+            </w:pPr>
+            <w:r>
+              <w:rPr>
+                <w:rFonts w:eastAsia="DejaVu Sans" w:cs="DejaVu Sans" w:ascii="Liberation Sans" w:hAnsi="Liberation Sans"/>
+                <w:color w:val="auto"/>
+                <w:kern w:val="2"/>
+                <w:sz w:val="24"/>
+                <w:szCs w:val="24"/>
+                <w:lang w:val="da-DK" w:eastAsia="en-US" w:bidi="ar-SA"/>
+                <w14:ligatures w14:val="standardContextual"/>
               </w:rPr>
               <w:t>Ikke-funktionelt</w:t>
             </w:r>
@@ -2247,20 +2734,31 @@
           <w:p>
             <w:pPr>
               <w:pStyle w:val="TableContents"/>
-              <w:spacing w:before="0" w:after="160"/>
-              <w:rPr>
-                <w:rFonts w:ascii="Liberation Sans" w:hAnsi="Liberation Sans" w:eastAsia="DejaVu Sans" w:cs="DejaVu Sans"/>
-                <w:sz w:val="24"/>
-                <w:szCs w:val="24"/>
-              </w:rPr>
-            </w:pPr>
-            <w:r>
-              <w:rPr>
-                <w:rFonts w:eastAsia="DejaVu Sans" w:cs="DejaVu Sans" w:ascii="Liberation Sans" w:hAnsi="Liberation Sans"/>
-                <w:sz w:val="24"/>
-                <w:szCs w:val="24"/>
-              </w:rPr>
-              <w:t>Hvis der ikke findes gyldige elpriser (der findes en pris for hver time i døgnet), skal systemet kun tænde affugteren, når luftfugtigheden overstiger den kritiske værdi (se K-005).</w:t>
+              <w:suppressAutoHyphens w:val="true"/>
+              <w:bidi w:val="0"/>
+              <w:spacing w:lineRule="auto" w:line="259" w:before="0" w:after="160"/>
+              <w:jc w:val="start"/>
+              <w:rPr>
+                <w:rFonts w:ascii="Liberation Sans" w:hAnsi="Liberation Sans" w:eastAsia="DejaVu Sans" w:cs="DejaVu Sans"/>
+                <w:color w:val="auto"/>
+                <w:kern w:val="2"/>
+                <w:sz w:val="24"/>
+                <w:szCs w:val="24"/>
+                <w:lang w:val="da-DK" w:eastAsia="en-US" w:bidi="ar-SA"/>
+                <w14:ligatures w14:val="standardContextual"/>
+              </w:rPr>
+            </w:pPr>
+            <w:r>
+              <w:rPr>
+                <w:rFonts w:eastAsia="DejaVu Sans" w:cs="DejaVu Sans" w:ascii="Liberation Sans" w:hAnsi="Liberation Sans"/>
+                <w:color w:val="auto"/>
+                <w:kern w:val="2"/>
+                <w:sz w:val="24"/>
+                <w:szCs w:val="24"/>
+                <w:lang w:val="da-DK" w:eastAsia="en-US" w:bidi="ar-SA"/>
+                <w14:ligatures w14:val="standardContextual"/>
+              </w:rPr>
+              <w:t>Hvis der ikke findes gyldige elpriser (der findes en pris for hvert af døgnets 96 kvarterer), skal systemet kun tænde affugteren, når luftfugtigheden overstiger den kritiske grænse(se K-005) og køre, indtil den er under slukgrænsen.</w:t>
             </w:r>
           </w:p>
         </w:tc>
@@ -2275,18 +2773,29 @@
           <w:p>
             <w:pPr>
               <w:pStyle w:val="TableContents"/>
-              <w:spacing w:before="0" w:after="160"/>
-              <w:rPr>
-                <w:rFonts w:ascii="Liberation Sans" w:hAnsi="Liberation Sans" w:eastAsia="DejaVu Sans" w:cs="DejaVu Sans"/>
-                <w:sz w:val="24"/>
-                <w:szCs w:val="24"/>
-              </w:rPr>
-            </w:pPr>
-            <w:r>
-              <w:rPr>
-                <w:rFonts w:eastAsia="DejaVu Sans" w:cs="DejaVu Sans" w:ascii="Liberation Sans" w:hAnsi="Liberation Sans"/>
-                <w:sz w:val="24"/>
-                <w:szCs w:val="24"/>
+              <w:suppressAutoHyphens w:val="true"/>
+              <w:bidi w:val="0"/>
+              <w:spacing w:lineRule="auto" w:line="259" w:before="0" w:after="160"/>
+              <w:jc w:val="start"/>
+              <w:rPr>
+                <w:rFonts w:ascii="Liberation Sans" w:hAnsi="Liberation Sans" w:eastAsia="DejaVu Sans" w:cs="DejaVu Sans"/>
+                <w:color w:val="auto"/>
+                <w:kern w:val="2"/>
+                <w:sz w:val="24"/>
+                <w:szCs w:val="24"/>
+                <w:lang w:val="da-DK" w:eastAsia="en-US" w:bidi="ar-SA"/>
+                <w14:ligatures w14:val="standardContextual"/>
+              </w:rPr>
+            </w:pPr>
+            <w:r>
+              <w:rPr>
+                <w:rFonts w:eastAsia="DejaVu Sans" w:cs="DejaVu Sans" w:ascii="Liberation Sans" w:hAnsi="Liberation Sans"/>
+                <w:color w:val="auto"/>
+                <w:kern w:val="2"/>
+                <w:sz w:val="24"/>
+                <w:szCs w:val="24"/>
+                <w:lang w:val="da-DK" w:eastAsia="en-US" w:bidi="ar-SA"/>
+                <w14:ligatures w14:val="standardContextual"/>
               </w:rPr>
               <w:t>Hvornår skal affugteren slukke igen i denne tilstand? Hvordan vises fejlen for kunden?</w:t>
             </w:r>
@@ -2306,18 +2815,29 @@
           <w:p>
             <w:pPr>
               <w:pStyle w:val="TableContents"/>
-              <w:spacing w:before="0" w:after="160"/>
-              <w:rPr>
-                <w:rFonts w:ascii="Liberation Sans" w:hAnsi="Liberation Sans" w:eastAsia="DejaVu Sans" w:cs="DejaVu Sans"/>
-                <w:sz w:val="24"/>
-                <w:szCs w:val="24"/>
-              </w:rPr>
-            </w:pPr>
-            <w:r>
-              <w:rPr>
-                <w:rFonts w:eastAsia="DejaVu Sans" w:cs="DejaVu Sans" w:ascii="Liberation Sans" w:hAnsi="Liberation Sans"/>
-                <w:sz w:val="24"/>
-                <w:szCs w:val="24"/>
+              <w:suppressAutoHyphens w:val="true"/>
+              <w:bidi w:val="0"/>
+              <w:spacing w:lineRule="auto" w:line="259" w:before="0" w:after="160"/>
+              <w:jc w:val="start"/>
+              <w:rPr>
+                <w:rFonts w:ascii="Liberation Sans" w:hAnsi="Liberation Sans" w:eastAsia="DejaVu Sans" w:cs="DejaVu Sans"/>
+                <w:color w:val="auto"/>
+                <w:kern w:val="2"/>
+                <w:sz w:val="24"/>
+                <w:szCs w:val="24"/>
+                <w:lang w:val="da-DK" w:eastAsia="en-US" w:bidi="ar-SA"/>
+                <w14:ligatures w14:val="standardContextual"/>
+              </w:rPr>
+            </w:pPr>
+            <w:r>
+              <w:rPr>
+                <w:rFonts w:eastAsia="DejaVu Sans" w:cs="DejaVu Sans" w:ascii="Liberation Sans" w:hAnsi="Liberation Sans"/>
+                <w:color w:val="auto"/>
+                <w:kern w:val="2"/>
+                <w:sz w:val="24"/>
+                <w:szCs w:val="24"/>
+                <w:lang w:val="da-DK" w:eastAsia="en-US" w:bidi="ar-SA"/>
+                <w14:ligatures w14:val="standardContextual"/>
               </w:rPr>
               <w:t>K-012</w:t>
             </w:r>
@@ -2334,18 +2854,29 @@
           <w:p>
             <w:pPr>
               <w:pStyle w:val="TableContents"/>
-              <w:spacing w:before="0" w:after="160"/>
-              <w:rPr>
-                <w:rFonts w:ascii="Liberation Sans" w:hAnsi="Liberation Sans" w:eastAsia="DejaVu Sans" w:cs="DejaVu Sans"/>
-                <w:sz w:val="24"/>
-                <w:szCs w:val="24"/>
-              </w:rPr>
-            </w:pPr>
-            <w:r>
-              <w:rPr>
-                <w:rFonts w:eastAsia="DejaVu Sans" w:cs="DejaVu Sans" w:ascii="Liberation Sans" w:hAnsi="Liberation Sans"/>
-                <w:sz w:val="24"/>
-                <w:szCs w:val="24"/>
+              <w:suppressAutoHyphens w:val="true"/>
+              <w:bidi w:val="0"/>
+              <w:spacing w:lineRule="auto" w:line="259" w:before="0" w:after="160"/>
+              <w:jc w:val="start"/>
+              <w:rPr>
+                <w:rFonts w:ascii="Liberation Sans" w:hAnsi="Liberation Sans" w:eastAsia="DejaVu Sans" w:cs="DejaVu Sans"/>
+                <w:color w:val="auto"/>
+                <w:kern w:val="2"/>
+                <w:sz w:val="24"/>
+                <w:szCs w:val="24"/>
+                <w:lang w:val="da-DK" w:eastAsia="en-US" w:bidi="ar-SA"/>
+                <w14:ligatures w14:val="standardContextual"/>
+              </w:rPr>
+            </w:pPr>
+            <w:r>
+              <w:rPr>
+                <w:rFonts w:eastAsia="DejaVu Sans" w:cs="DejaVu Sans" w:ascii="Liberation Sans" w:hAnsi="Liberation Sans"/>
+                <w:color w:val="auto"/>
+                <w:kern w:val="2"/>
+                <w:sz w:val="24"/>
+                <w:szCs w:val="24"/>
+                <w:lang w:val="da-DK" w:eastAsia="en-US" w:bidi="ar-SA"/>
+                <w14:ligatures w14:val="standardContextual"/>
               </w:rPr>
               <w:t>Fejlhåndtering</w:t>
             </w:r>
@@ -2362,18 +2893,29 @@
           <w:p>
             <w:pPr>
               <w:pStyle w:val="TableContents"/>
-              <w:spacing w:before="0" w:after="160"/>
-              <w:rPr>
-                <w:rFonts w:ascii="Liberation Sans" w:hAnsi="Liberation Sans" w:eastAsia="DejaVu Sans" w:cs="DejaVu Sans"/>
-                <w:sz w:val="24"/>
-                <w:szCs w:val="24"/>
-              </w:rPr>
-            </w:pPr>
-            <w:r>
-              <w:rPr>
-                <w:rFonts w:eastAsia="DejaVu Sans" w:cs="DejaVu Sans" w:ascii="Liberation Sans" w:hAnsi="Liberation Sans"/>
-                <w:sz w:val="24"/>
-                <w:szCs w:val="24"/>
+              <w:suppressAutoHyphens w:val="true"/>
+              <w:bidi w:val="0"/>
+              <w:spacing w:lineRule="auto" w:line="259" w:before="0" w:after="160"/>
+              <w:jc w:val="start"/>
+              <w:rPr>
+                <w:rFonts w:ascii="Liberation Sans" w:hAnsi="Liberation Sans" w:eastAsia="DejaVu Sans" w:cs="DejaVu Sans"/>
+                <w:color w:val="auto"/>
+                <w:kern w:val="2"/>
+                <w:sz w:val="24"/>
+                <w:szCs w:val="24"/>
+                <w:lang w:val="da-DK" w:eastAsia="en-US" w:bidi="ar-SA"/>
+                <w14:ligatures w14:val="standardContextual"/>
+              </w:rPr>
+            </w:pPr>
+            <w:r>
+              <w:rPr>
+                <w:rFonts w:eastAsia="DejaVu Sans" w:cs="DejaVu Sans" w:ascii="Liberation Sans" w:hAnsi="Liberation Sans"/>
+                <w:color w:val="auto"/>
+                <w:kern w:val="2"/>
+                <w:sz w:val="24"/>
+                <w:szCs w:val="24"/>
+                <w:lang w:val="da-DK" w:eastAsia="en-US" w:bidi="ar-SA"/>
+                <w14:ligatures w14:val="standardContextual"/>
               </w:rPr>
               <w:t>Hardwarefejl (sensor)</w:t>
             </w:r>
@@ -2390,18 +2932,29 @@
           <w:p>
             <w:pPr>
               <w:pStyle w:val="TableContents"/>
-              <w:spacing w:before="0" w:after="160"/>
-              <w:rPr>
-                <w:rFonts w:ascii="Liberation Sans" w:hAnsi="Liberation Sans" w:eastAsia="DejaVu Sans" w:cs="DejaVu Sans"/>
-                <w:sz w:val="24"/>
-                <w:szCs w:val="24"/>
-              </w:rPr>
-            </w:pPr>
-            <w:r>
-              <w:rPr>
-                <w:rFonts w:eastAsia="DejaVu Sans" w:cs="DejaVu Sans" w:ascii="Liberation Sans" w:hAnsi="Liberation Sans"/>
-                <w:sz w:val="24"/>
-                <w:szCs w:val="24"/>
+              <w:suppressAutoHyphens w:val="true"/>
+              <w:bidi w:val="0"/>
+              <w:spacing w:lineRule="auto" w:line="259" w:before="0" w:after="160"/>
+              <w:jc w:val="start"/>
+              <w:rPr>
+                <w:rFonts w:ascii="Liberation Sans" w:hAnsi="Liberation Sans" w:eastAsia="DejaVu Sans" w:cs="DejaVu Sans"/>
+                <w:color w:val="auto"/>
+                <w:kern w:val="2"/>
+                <w:sz w:val="24"/>
+                <w:szCs w:val="24"/>
+                <w:lang w:val="da-DK" w:eastAsia="en-US" w:bidi="ar-SA"/>
+                <w14:ligatures w14:val="standardContextual"/>
+              </w:rPr>
+            </w:pPr>
+            <w:r>
+              <w:rPr>
+                <w:rFonts w:eastAsia="DejaVu Sans" w:cs="DejaVu Sans" w:ascii="Liberation Sans" w:hAnsi="Liberation Sans"/>
+                <w:color w:val="auto"/>
+                <w:kern w:val="2"/>
+                <w:sz w:val="24"/>
+                <w:szCs w:val="24"/>
+                <w:lang w:val="da-DK" w:eastAsia="en-US" w:bidi="ar-SA"/>
+                <w14:ligatures w14:val="standardContextual"/>
               </w:rPr>
               <w:t>Ikke-funktionelt</w:t>
             </w:r>
@@ -2418,21 +2971,31 @@
           <w:p>
             <w:pPr>
               <w:pStyle w:val="TableContents"/>
-              <w:bidi w:val="0"/>
-              <w:spacing w:lineRule="auto" w:line="259" w:before="0" w:after="160"/>
-              <w:rPr>
-                <w:rFonts w:ascii="Liberation Sans" w:hAnsi="Liberation Sans" w:eastAsia="DejaVu Sans" w:cs="DejaVu Sans"/>
-                <w:sz w:val="24"/>
-                <w:szCs w:val="24"/>
-              </w:rPr>
-            </w:pPr>
-            <w:r>
-              <w:rPr>
-                <w:rFonts w:eastAsia="DejaVu Sans" w:cs="DejaVu Sans" w:ascii="Liberation Sans" w:hAnsi="Liberation Sans"/>
-                <w:sz w:val="24"/>
-                <w:szCs w:val="24"/>
-              </w:rPr>
-              <w:t>Hvis sensoren ikke leverer en måling, eller målingen ligger uden for 0–100 % RH, skal systemet ignorere målingen. Ved [3] fejlmålinger i træk skal systemet gå i sikker tilstand. (forlades når sensoren er i livet)</w:t>
+              <w:suppressAutoHyphens w:val="true"/>
+              <w:bidi w:val="0"/>
+              <w:spacing w:lineRule="auto" w:line="259" w:before="0" w:after="160"/>
+              <w:jc w:val="start"/>
+              <w:rPr>
+                <w:rFonts w:ascii="Liberation Sans" w:hAnsi="Liberation Sans" w:eastAsia="DejaVu Sans" w:cs="DejaVu Sans"/>
+                <w:color w:val="auto"/>
+                <w:kern w:val="2"/>
+                <w:sz w:val="24"/>
+                <w:szCs w:val="24"/>
+                <w:lang w:val="da-DK" w:eastAsia="en-US" w:bidi="ar-SA"/>
+                <w14:ligatures w14:val="standardContextual"/>
+              </w:rPr>
+            </w:pPr>
+            <w:r>
+              <w:rPr>
+                <w:rFonts w:eastAsia="DejaVu Sans" w:cs="DejaVu Sans" w:ascii="Liberation Sans" w:hAnsi="Liberation Sans"/>
+                <w:color w:val="auto"/>
+                <w:kern w:val="2"/>
+                <w:sz w:val="24"/>
+                <w:szCs w:val="24"/>
+                <w:lang w:val="da-DK" w:eastAsia="en-US" w:bidi="ar-SA"/>
+                <w14:ligatures w14:val="standardContextual"/>
+              </w:rPr>
+              <w:t xml:space="preserve">Hvis sensoren ikke leverer en gyldig måling (ingen måling eller en værdi uden for 0–100 % RH), skal systemet forsøge igen op tl 5 gange. Mislykkes alle 5 forsøg, skal affugteren slukkes, fejlen vises på website (K-016), og systemet skal forsøge igen hver 15 minut, indtil sensoren leverer gyldige målinger. </w:t>
             </w:r>
           </w:p>
         </w:tc>
@@ -2447,21 +3010,31 @@
           <w:p>
             <w:pPr>
               <w:pStyle w:val="TableContents"/>
-              <w:bidi w:val="0"/>
-              <w:spacing w:lineRule="auto" w:line="259" w:before="0" w:after="160"/>
-              <w:rPr>
-                <w:rFonts w:ascii="Liberation Sans" w:hAnsi="Liberation Sans" w:eastAsia="DejaVu Sans" w:cs="DejaVu Sans"/>
-                <w:sz w:val="24"/>
-                <w:szCs w:val="24"/>
-              </w:rPr>
-            </w:pPr>
-            <w:r>
-              <w:rPr>
-                <w:rFonts w:eastAsia="DejaVu Sans" w:cs="DejaVu Sans" w:ascii="Liberation Sans" w:hAnsi="Liberation Sans"/>
-                <w:sz w:val="24"/>
-                <w:szCs w:val="24"/>
-              </w:rPr>
-              <w:t>Skal sikker tilstand være tændt eller slukket? Hvordan vises fejlen?</w:t>
+              <w:suppressAutoHyphens w:val="true"/>
+              <w:bidi w:val="0"/>
+              <w:spacing w:lineRule="auto" w:line="259" w:before="0" w:after="160"/>
+              <w:jc w:val="start"/>
+              <w:rPr>
+                <w:rFonts w:ascii="Liberation Sans" w:hAnsi="Liberation Sans" w:eastAsia="DejaVu Sans" w:cs="DejaVu Sans"/>
+                <w:color w:val="auto"/>
+                <w:kern w:val="2"/>
+                <w:sz w:val="24"/>
+                <w:szCs w:val="24"/>
+                <w:lang w:val="da-DK" w:eastAsia="en-US" w:bidi="ar-SA"/>
+                <w14:ligatures w14:val="standardContextual"/>
+              </w:rPr>
+            </w:pPr>
+            <w:r>
+              <w:rPr>
+                <w:rFonts w:eastAsia="DejaVu Sans" w:cs="DejaVu Sans" w:ascii="Liberation Sans" w:hAnsi="Liberation Sans"/>
+                <w:color w:val="auto"/>
+                <w:kern w:val="2"/>
+                <w:sz w:val="24"/>
+                <w:szCs w:val="24"/>
+                <w:lang w:val="da-DK" w:eastAsia="en-US" w:bidi="ar-SA"/>
+                <w14:ligatures w14:val="standardContextual"/>
+              </w:rPr>
+              <w:t>Skal affugteren slukkes ved sensorfejl? Hvordan vises fejlen?</w:t>
             </w:r>
           </w:p>
         </w:tc>
@@ -2479,18 +3052,29 @@
           <w:p>
             <w:pPr>
               <w:pStyle w:val="TableContents"/>
-              <w:spacing w:before="0" w:after="160"/>
-              <w:rPr>
-                <w:rFonts w:ascii="Liberation Sans" w:hAnsi="Liberation Sans" w:eastAsia="DejaVu Sans" w:cs="DejaVu Sans"/>
-                <w:sz w:val="24"/>
-                <w:szCs w:val="24"/>
-              </w:rPr>
-            </w:pPr>
-            <w:r>
-              <w:rPr>
-                <w:rFonts w:eastAsia="DejaVu Sans" w:cs="DejaVu Sans" w:ascii="Liberation Sans" w:hAnsi="Liberation Sans"/>
-                <w:sz w:val="24"/>
-                <w:szCs w:val="24"/>
+              <w:suppressAutoHyphens w:val="true"/>
+              <w:bidi w:val="0"/>
+              <w:spacing w:lineRule="auto" w:line="259" w:before="0" w:after="160"/>
+              <w:jc w:val="start"/>
+              <w:rPr>
+                <w:rFonts w:ascii="Liberation Sans" w:hAnsi="Liberation Sans" w:eastAsia="DejaVu Sans" w:cs="DejaVu Sans"/>
+                <w:color w:val="auto"/>
+                <w:kern w:val="2"/>
+                <w:sz w:val="24"/>
+                <w:szCs w:val="24"/>
+                <w:lang w:val="da-DK" w:eastAsia="en-US" w:bidi="ar-SA"/>
+                <w14:ligatures w14:val="standardContextual"/>
+              </w:rPr>
+            </w:pPr>
+            <w:r>
+              <w:rPr>
+                <w:rFonts w:eastAsia="DejaVu Sans" w:cs="DejaVu Sans" w:ascii="Liberation Sans" w:hAnsi="Liberation Sans"/>
+                <w:color w:val="auto"/>
+                <w:kern w:val="2"/>
+                <w:sz w:val="24"/>
+                <w:szCs w:val="24"/>
+                <w:lang w:val="da-DK" w:eastAsia="en-US" w:bidi="ar-SA"/>
+                <w14:ligatures w14:val="standardContextual"/>
               </w:rPr>
               <w:t>K-013</w:t>
             </w:r>
@@ -2507,18 +3091,29 @@
           <w:p>
             <w:pPr>
               <w:pStyle w:val="TableContents"/>
-              <w:spacing w:before="0" w:after="160"/>
-              <w:rPr>
-                <w:rFonts w:ascii="Liberation Sans" w:hAnsi="Liberation Sans" w:eastAsia="DejaVu Sans" w:cs="DejaVu Sans"/>
-                <w:sz w:val="24"/>
-                <w:szCs w:val="24"/>
-              </w:rPr>
-            </w:pPr>
-            <w:r>
-              <w:rPr>
-                <w:rFonts w:eastAsia="DejaVu Sans" w:cs="DejaVu Sans" w:ascii="Liberation Sans" w:hAnsi="Liberation Sans"/>
-                <w:sz w:val="24"/>
-                <w:szCs w:val="24"/>
+              <w:suppressAutoHyphens w:val="true"/>
+              <w:bidi w:val="0"/>
+              <w:spacing w:lineRule="auto" w:line="259" w:before="0" w:after="160"/>
+              <w:jc w:val="start"/>
+              <w:rPr>
+                <w:rFonts w:ascii="Liberation Sans" w:hAnsi="Liberation Sans" w:eastAsia="DejaVu Sans" w:cs="DejaVu Sans"/>
+                <w:color w:val="auto"/>
+                <w:kern w:val="2"/>
+                <w:sz w:val="24"/>
+                <w:szCs w:val="24"/>
+                <w:lang w:val="da-DK" w:eastAsia="en-US" w:bidi="ar-SA"/>
+                <w14:ligatures w14:val="standardContextual"/>
+              </w:rPr>
+            </w:pPr>
+            <w:r>
+              <w:rPr>
+                <w:rFonts w:eastAsia="DejaVu Sans" w:cs="DejaVu Sans" w:ascii="Liberation Sans" w:hAnsi="Liberation Sans"/>
+                <w:color w:val="auto"/>
+                <w:kern w:val="2"/>
+                <w:sz w:val="24"/>
+                <w:szCs w:val="24"/>
+                <w:lang w:val="da-DK" w:eastAsia="en-US" w:bidi="ar-SA"/>
+                <w14:ligatures w14:val="standardContextual"/>
               </w:rPr>
               <w:t>Fejlhåndtering</w:t>
             </w:r>
@@ -2535,18 +3130,29 @@
           <w:p>
             <w:pPr>
               <w:pStyle w:val="TableContents"/>
-              <w:spacing w:before="0" w:after="160"/>
-              <w:rPr>
-                <w:rFonts w:ascii="Liberation Sans" w:hAnsi="Liberation Sans" w:eastAsia="DejaVu Sans" w:cs="DejaVu Sans"/>
-                <w:sz w:val="24"/>
-                <w:szCs w:val="24"/>
-              </w:rPr>
-            </w:pPr>
-            <w:r>
-              <w:rPr>
-                <w:rFonts w:eastAsia="DejaVu Sans" w:cs="DejaVu Sans" w:ascii="Liberation Sans" w:hAnsi="Liberation Sans"/>
-                <w:sz w:val="24"/>
-                <w:szCs w:val="24"/>
+              <w:suppressAutoHyphens w:val="true"/>
+              <w:bidi w:val="0"/>
+              <w:spacing w:lineRule="auto" w:line="259" w:before="0" w:after="160"/>
+              <w:jc w:val="start"/>
+              <w:rPr>
+                <w:rFonts w:ascii="Liberation Sans" w:hAnsi="Liberation Sans" w:eastAsia="DejaVu Sans" w:cs="DejaVu Sans"/>
+                <w:color w:val="auto"/>
+                <w:kern w:val="2"/>
+                <w:sz w:val="24"/>
+                <w:szCs w:val="24"/>
+                <w:lang w:val="da-DK" w:eastAsia="en-US" w:bidi="ar-SA"/>
+                <w14:ligatures w14:val="standardContextual"/>
+              </w:rPr>
+            </w:pPr>
+            <w:r>
+              <w:rPr>
+                <w:rFonts w:eastAsia="DejaVu Sans" w:cs="DejaVu Sans" w:ascii="Liberation Sans" w:hAnsi="Liberation Sans"/>
+                <w:color w:val="auto"/>
+                <w:kern w:val="2"/>
+                <w:sz w:val="24"/>
+                <w:szCs w:val="24"/>
+                <w:lang w:val="da-DK" w:eastAsia="en-US" w:bidi="ar-SA"/>
+                <w14:ligatures w14:val="standardContextual"/>
               </w:rPr>
               <w:t>Kommunikationsfejl (Shelly/WiFi)</w:t>
             </w:r>
@@ -2563,18 +3169,29 @@
           <w:p>
             <w:pPr>
               <w:pStyle w:val="TableContents"/>
-              <w:spacing w:before="0" w:after="160"/>
-              <w:rPr>
-                <w:rFonts w:ascii="Liberation Sans" w:hAnsi="Liberation Sans" w:eastAsia="DejaVu Sans" w:cs="DejaVu Sans"/>
-                <w:sz w:val="24"/>
-                <w:szCs w:val="24"/>
-              </w:rPr>
-            </w:pPr>
-            <w:r>
-              <w:rPr>
-                <w:rFonts w:eastAsia="DejaVu Sans" w:cs="DejaVu Sans" w:ascii="Liberation Sans" w:hAnsi="Liberation Sans"/>
-                <w:sz w:val="24"/>
-                <w:szCs w:val="24"/>
+              <w:suppressAutoHyphens w:val="true"/>
+              <w:bidi w:val="0"/>
+              <w:spacing w:lineRule="auto" w:line="259" w:before="0" w:after="160"/>
+              <w:jc w:val="start"/>
+              <w:rPr>
+                <w:rFonts w:ascii="Liberation Sans" w:hAnsi="Liberation Sans" w:eastAsia="DejaVu Sans" w:cs="DejaVu Sans"/>
+                <w:color w:val="auto"/>
+                <w:kern w:val="2"/>
+                <w:sz w:val="24"/>
+                <w:szCs w:val="24"/>
+                <w:lang w:val="da-DK" w:eastAsia="en-US" w:bidi="ar-SA"/>
+                <w14:ligatures w14:val="standardContextual"/>
+              </w:rPr>
+            </w:pPr>
+            <w:r>
+              <w:rPr>
+                <w:rFonts w:eastAsia="DejaVu Sans" w:cs="DejaVu Sans" w:ascii="Liberation Sans" w:hAnsi="Liberation Sans"/>
+                <w:color w:val="auto"/>
+                <w:kern w:val="2"/>
+                <w:sz w:val="24"/>
+                <w:szCs w:val="24"/>
+                <w:lang w:val="da-DK" w:eastAsia="en-US" w:bidi="ar-SA"/>
+                <w14:ligatures w14:val="standardContextual"/>
               </w:rPr>
               <w:t>Ikke-funktionelt</w:t>
             </w:r>
@@ -2591,23 +3208,63 @@
           <w:p>
             <w:pPr>
               <w:pStyle w:val="TableContents"/>
-              <w:bidi w:val="0"/>
-              <w:spacing w:lineRule="auto" w:line="259" w:before="0" w:after="160"/>
-              <w:rPr>
-                <w:rFonts w:ascii="Liberation Sans" w:hAnsi="Liberation Sans" w:eastAsia="DejaVu Sans" w:cs="DejaVu Sans"/>
-                <w:sz w:val="24"/>
-                <w:szCs w:val="24"/>
-              </w:rPr>
-            </w:pPr>
-            <w:r>
-              <w:rPr>
-                <w:rFonts w:eastAsia="DejaVu Sans" w:cs="DejaVu Sans" w:ascii="Liberation Sans" w:hAnsi="Liberation Sans"/>
-                <w:sz w:val="24"/>
-                <w:szCs w:val="24"/>
+              <w:suppressAutoHyphens w:val="true"/>
+              <w:bidi w:val="0"/>
+              <w:spacing w:lineRule="auto" w:line="259" w:before="0" w:after="160"/>
+              <w:jc w:val="start"/>
+              <w:rPr>
+                <w:rFonts w:ascii="Liberation Sans" w:hAnsi="Liberation Sans" w:eastAsia="DejaVu Sans" w:cs="DejaVu Sans"/>
+                <w:color w:val="auto"/>
+                <w:kern w:val="2"/>
+                <w:sz w:val="24"/>
+                <w:szCs w:val="24"/>
+                <w:lang w:val="da-DK" w:eastAsia="en-US" w:bidi="ar-SA"/>
+                <w14:ligatures w14:val="standardContextual"/>
+              </w:rPr>
+            </w:pPr>
+            <w:r>
+              <w:rPr>
+                <w:rFonts w:eastAsia="DejaVu Sans" w:cs="DejaVu Sans" w:ascii="Liberation Sans" w:hAnsi="Liberation Sans"/>
+                <w:color w:val="auto"/>
+                <w:kern w:val="2"/>
+                <w:sz w:val="24"/>
+                <w:szCs w:val="24"/>
+                <w:lang w:val="da-DK" w:eastAsia="en-US" w:bidi="ar-SA"/>
+                <w14:ligatures w14:val="standardContextual"/>
               </w:rPr>
               <w:t>Hvis smart plug'en ikke svarer, skal systemet prøve igen med et fast interval og vise en fejl.</w:t>
             </w:r>
           </w:p>
+          <w:p>
+            <w:pPr>
+              <w:pStyle w:val="TableContents"/>
+              <w:suppressAutoHyphens w:val="true"/>
+              <w:bidi w:val="0"/>
+              <w:spacing w:lineRule="auto" w:line="259" w:before="0" w:after="160"/>
+              <w:jc w:val="start"/>
+              <w:rPr>
+                <w:rFonts w:ascii="Liberation Sans" w:hAnsi="Liberation Sans" w:eastAsia="DejaVu Sans" w:cs="DejaVu Sans"/>
+                <w:color w:val="auto"/>
+                <w:kern w:val="2"/>
+                <w:sz w:val="24"/>
+                <w:szCs w:val="24"/>
+                <w:lang w:val="da-DK" w:eastAsia="en-US" w:bidi="ar-SA"/>
+                <w14:ligatures w14:val="standardContextual"/>
+              </w:rPr>
+            </w:pPr>
+            <w:r>
+              <w:rPr>
+                <w:rFonts w:eastAsia="DejaVu Sans" w:cs="DejaVu Sans" w:ascii="Liberation Sans" w:hAnsi="Liberation Sans"/>
+                <w:color w:val="auto"/>
+                <w:kern w:val="2"/>
+                <w:sz w:val="24"/>
+                <w:szCs w:val="24"/>
+                <w:lang w:val="da-DK" w:eastAsia="en-US" w:bidi="ar-SA"/>
+                <w14:ligatures w14:val="standardContextual"/>
+              </w:rPr>
+              <w:t>Systemet skal fortsætte med at måle og gemme luftfugtighed og elpriser, mens fejlen varer.</w:t>
+            </w:r>
+          </w:p>
         </w:tc>
         <w:tc>
           <w:tcPr>
@@ -2620,21 +3277,31 @@
           <w:p>
             <w:pPr>
               <w:pStyle w:val="TableContents"/>
-              <w:bidi w:val="0"/>
-              <w:spacing w:lineRule="auto" w:line="259" w:before="0" w:after="160"/>
-              <w:rPr>
-                <w:rFonts w:ascii="Liberation Sans" w:hAnsi="Liberation Sans" w:eastAsia="DejaVu Sans" w:cs="DejaVu Sans"/>
-                <w:sz w:val="24"/>
-                <w:szCs w:val="24"/>
-              </w:rPr>
-            </w:pPr>
-            <w:r>
-              <w:rPr>
-                <w:rFonts w:eastAsia="DejaVu Sans" w:cs="DejaVu Sans" w:ascii="Liberation Sans" w:hAnsi="Liberation Sans"/>
-                <w:sz w:val="24"/>
-                <w:szCs w:val="24"/>
-              </w:rPr>
-              <w:t>Hvor ofte skal der prøves igen? Hvordan vises fejlen?</w:t>
+              <w:suppressAutoHyphens w:val="true"/>
+              <w:bidi w:val="0"/>
+              <w:spacing w:lineRule="auto" w:line="259" w:before="0" w:after="160"/>
+              <w:jc w:val="start"/>
+              <w:rPr>
+                <w:rFonts w:ascii="Liberation Sans" w:hAnsi="Liberation Sans" w:eastAsia="DejaVu Sans" w:cs="DejaVu Sans"/>
+                <w:color w:val="auto"/>
+                <w:kern w:val="2"/>
+                <w:sz w:val="24"/>
+                <w:szCs w:val="24"/>
+                <w:lang w:val="da-DK" w:eastAsia="en-US" w:bidi="ar-SA"/>
+                <w14:ligatures w14:val="standardContextual"/>
+              </w:rPr>
+            </w:pPr>
+            <w:r>
+              <w:rPr>
+                <w:rFonts w:eastAsia="DejaVu Sans" w:cs="DejaVu Sans" w:ascii="Liberation Sans" w:hAnsi="Liberation Sans"/>
+                <w:color w:val="auto"/>
+                <w:kern w:val="2"/>
+                <w:sz w:val="24"/>
+                <w:szCs w:val="24"/>
+                <w:lang w:val="da-DK" w:eastAsia="en-US" w:bidi="ar-SA"/>
+                <w14:ligatures w14:val="standardContextual"/>
+              </w:rPr>
+              <w:t>Afklaret: fejlen vises på websiden, og logningen fortsætter.</w:t>
             </w:r>
           </w:p>
         </w:tc>
@@ -2652,18 +3319,29 @@
           <w:p>
             <w:pPr>
               <w:pStyle w:val="TableContents"/>
-              <w:spacing w:before="0" w:after="160"/>
-              <w:rPr>
-                <w:rFonts w:ascii="Liberation Sans" w:hAnsi="Liberation Sans" w:eastAsia="DejaVu Sans" w:cs="DejaVu Sans"/>
-                <w:sz w:val="24"/>
-                <w:szCs w:val="24"/>
-              </w:rPr>
-            </w:pPr>
-            <w:r>
-              <w:rPr>
-                <w:rFonts w:eastAsia="DejaVu Sans" w:cs="DejaVu Sans" w:ascii="Liberation Sans" w:hAnsi="Liberation Sans"/>
-                <w:sz w:val="24"/>
-                <w:szCs w:val="24"/>
+              <w:suppressAutoHyphens w:val="true"/>
+              <w:bidi w:val="0"/>
+              <w:spacing w:lineRule="auto" w:line="259" w:before="0" w:after="160"/>
+              <w:jc w:val="start"/>
+              <w:rPr>
+                <w:rFonts w:ascii="Liberation Sans" w:hAnsi="Liberation Sans" w:eastAsia="DejaVu Sans" w:cs="DejaVu Sans"/>
+                <w:color w:val="auto"/>
+                <w:kern w:val="2"/>
+                <w:sz w:val="24"/>
+                <w:szCs w:val="24"/>
+                <w:lang w:val="da-DK" w:eastAsia="en-US" w:bidi="ar-SA"/>
+                <w14:ligatures w14:val="standardContextual"/>
+              </w:rPr>
+            </w:pPr>
+            <w:r>
+              <w:rPr>
+                <w:rFonts w:eastAsia="DejaVu Sans" w:cs="DejaVu Sans" w:ascii="Liberation Sans" w:hAnsi="Liberation Sans"/>
+                <w:color w:val="auto"/>
+                <w:kern w:val="2"/>
+                <w:sz w:val="24"/>
+                <w:szCs w:val="24"/>
+                <w:lang w:val="da-DK" w:eastAsia="en-US" w:bidi="ar-SA"/>
+                <w14:ligatures w14:val="standardContextual"/>
               </w:rPr>
               <w:t>K-014</w:t>
             </w:r>
@@ -2680,18 +3358,29 @@
           <w:p>
             <w:pPr>
               <w:pStyle w:val="TableContents"/>
-              <w:spacing w:before="0" w:after="160"/>
-              <w:rPr>
-                <w:rFonts w:ascii="Liberation Sans" w:hAnsi="Liberation Sans" w:eastAsia="DejaVu Sans" w:cs="DejaVu Sans"/>
-                <w:sz w:val="24"/>
-                <w:szCs w:val="24"/>
-              </w:rPr>
-            </w:pPr>
-            <w:r>
-              <w:rPr>
-                <w:rFonts w:eastAsia="DejaVu Sans" w:cs="DejaVu Sans" w:ascii="Liberation Sans" w:hAnsi="Liberation Sans"/>
-                <w:sz w:val="24"/>
-                <w:szCs w:val="24"/>
+              <w:suppressAutoHyphens w:val="true"/>
+              <w:bidi w:val="0"/>
+              <w:spacing w:lineRule="auto" w:line="259" w:before="0" w:after="160"/>
+              <w:jc w:val="start"/>
+              <w:rPr>
+                <w:rFonts w:ascii="Liberation Sans" w:hAnsi="Liberation Sans" w:eastAsia="DejaVu Sans" w:cs="DejaVu Sans"/>
+                <w:color w:val="auto"/>
+                <w:kern w:val="2"/>
+                <w:sz w:val="24"/>
+                <w:szCs w:val="24"/>
+                <w:lang w:val="da-DK" w:eastAsia="en-US" w:bidi="ar-SA"/>
+                <w14:ligatures w14:val="standardContextual"/>
+              </w:rPr>
+            </w:pPr>
+            <w:r>
+              <w:rPr>
+                <w:rFonts w:eastAsia="DejaVu Sans" w:cs="DejaVu Sans" w:ascii="Liberation Sans" w:hAnsi="Liberation Sans"/>
+                <w:color w:val="auto"/>
+                <w:kern w:val="2"/>
+                <w:sz w:val="24"/>
+                <w:szCs w:val="24"/>
+                <w:lang w:val="da-DK" w:eastAsia="en-US" w:bidi="ar-SA"/>
+                <w14:ligatures w14:val="standardContextual"/>
               </w:rPr>
               <w:t>Fejlhåndtering</w:t>
             </w:r>
@@ -2810,7 +3499,7 @@
                 <w:lang w:val="da-DK" w:eastAsia="en-US" w:bidi="ar-SA"/>
                 <w14:ligatures w14:val="standardContextual"/>
               </w:rPr>
-              <w:t>Efter en strømafbrydelse skal systemet starte automatisk, genindlæse indstillingerne fra databasen og fortsætte styringen uden brugerens hjælp.</w:t>
+              <w:t>Efter en strømafbrydelse skal systemet starte automatisk, genindlæse indstillingerne fra databasen og fortsætte styringen kontrollere sensoren, hente elpriser, vente på minimumsintervallet (K-006)uden brugerens hjælp.</w:t>
             </w:r>
           </w:p>
         </w:tc>
@@ -2868,18 +3557,29 @@
           <w:p>
             <w:pPr>
               <w:pStyle w:val="TableContents"/>
-              <w:spacing w:before="0" w:after="160"/>
-              <w:rPr>
-                <w:rFonts w:ascii="Liberation Sans" w:hAnsi="Liberation Sans" w:eastAsia="DejaVu Sans" w:cs="DejaVu Sans"/>
-                <w:sz w:val="24"/>
-                <w:szCs w:val="24"/>
-              </w:rPr>
-            </w:pPr>
-            <w:r>
-              <w:rPr>
-                <w:rFonts w:eastAsia="DejaVu Sans" w:cs="DejaVu Sans" w:ascii="Liberation Sans" w:hAnsi="Liberation Sans"/>
-                <w:sz w:val="24"/>
-                <w:szCs w:val="24"/>
+              <w:suppressAutoHyphens w:val="true"/>
+              <w:bidi w:val="0"/>
+              <w:spacing w:lineRule="auto" w:line="259" w:before="0" w:after="160"/>
+              <w:jc w:val="start"/>
+              <w:rPr>
+                <w:rFonts w:ascii="Liberation Sans" w:hAnsi="Liberation Sans" w:eastAsia="DejaVu Sans" w:cs="DejaVu Sans"/>
+                <w:color w:val="auto"/>
+                <w:kern w:val="2"/>
+                <w:sz w:val="24"/>
+                <w:szCs w:val="24"/>
+                <w:lang w:val="da-DK" w:eastAsia="en-US" w:bidi="ar-SA"/>
+                <w14:ligatures w14:val="standardContextual"/>
+              </w:rPr>
+            </w:pPr>
+            <w:r>
+              <w:rPr>
+                <w:rFonts w:eastAsia="DejaVu Sans" w:cs="DejaVu Sans" w:ascii="Liberation Sans" w:hAnsi="Liberation Sans"/>
+                <w:color w:val="auto"/>
+                <w:kern w:val="2"/>
+                <w:sz w:val="24"/>
+                <w:szCs w:val="24"/>
+                <w:lang w:val="da-DK" w:eastAsia="en-US" w:bidi="ar-SA"/>
+                <w14:ligatures w14:val="standardContextual"/>
               </w:rPr>
               <w:t>K-015</w:t>
             </w:r>
@@ -2896,18 +3596,29 @@
           <w:p>
             <w:pPr>
               <w:pStyle w:val="TableContents"/>
-              <w:spacing w:before="0" w:after="160"/>
-              <w:rPr>
-                <w:rFonts w:ascii="Liberation Sans" w:hAnsi="Liberation Sans" w:eastAsia="DejaVu Sans" w:cs="DejaVu Sans"/>
-                <w:sz w:val="24"/>
-                <w:szCs w:val="24"/>
-              </w:rPr>
-            </w:pPr>
-            <w:r>
-              <w:rPr>
-                <w:rFonts w:eastAsia="DejaVu Sans" w:cs="DejaVu Sans" w:ascii="Liberation Sans" w:hAnsi="Liberation Sans"/>
-                <w:sz w:val="24"/>
-                <w:szCs w:val="24"/>
+              <w:suppressAutoHyphens w:val="true"/>
+              <w:bidi w:val="0"/>
+              <w:spacing w:lineRule="auto" w:line="259" w:before="0" w:after="160"/>
+              <w:jc w:val="start"/>
+              <w:rPr>
+                <w:rFonts w:ascii="Liberation Sans" w:hAnsi="Liberation Sans" w:eastAsia="DejaVu Sans" w:cs="DejaVu Sans"/>
+                <w:color w:val="auto"/>
+                <w:kern w:val="2"/>
+                <w:sz w:val="24"/>
+                <w:szCs w:val="24"/>
+                <w:lang w:val="da-DK" w:eastAsia="en-US" w:bidi="ar-SA"/>
+                <w14:ligatures w14:val="standardContextual"/>
+              </w:rPr>
+            </w:pPr>
+            <w:r>
+              <w:rPr>
+                <w:rFonts w:eastAsia="DejaVu Sans" w:cs="DejaVu Sans" w:ascii="Liberation Sans" w:hAnsi="Liberation Sans"/>
+                <w:color w:val="auto"/>
+                <w:kern w:val="2"/>
+                <w:sz w:val="24"/>
+                <w:szCs w:val="24"/>
+                <w:lang w:val="da-DK" w:eastAsia="en-US" w:bidi="ar-SA"/>
+                <w14:ligatures w14:val="standardContextual"/>
               </w:rPr>
               <w:t>Fejlhåndtering</w:t>
             </w:r>
@@ -2948,7 +3659,7 @@
                 <w:lang w:val="da-DK" w:eastAsia="en-US" w:bidi="ar-SA"/>
                 <w14:ligatures w14:val="standardContextual"/>
               </w:rPr>
-              <w:t>Pi’en går i stå</w:t>
+              <w:t>Programmet går i stå</w:t>
             </w:r>
           </w:p>
         </w:tc>
@@ -3026,7 +3737,7 @@
                 <w:lang w:val="da-DK" w:eastAsia="en-US" w:bidi="ar-SA"/>
                 <w14:ligatures w14:val="standardContextual"/>
               </w:rPr>
-              <w:t>Hvis programmet går i stå, skal mikrocontrolleren genstarte automatisk (watchdog).</w:t>
+              <w:t>Hvis programmet går i stå, skal det genstartes automatisk.Programmet skal køre som en systemtjeneste (systemd), der automatisk genstarter programmet, hvis det stopper, og starter det ved opstart af Raspberry Pi'en.</w:t>
             </w:r>
           </w:p>
         </w:tc>
@@ -3065,7 +3776,7 @@
                 <w:lang w:val="da-DK" w:eastAsia="en-US" w:bidi="ar-SA"/>
                 <w14:ligatures w14:val="standardContextual"/>
               </w:rPr>
-              <w:t>Hvor lang tid må der gå, før den genstarter?</w:t>
+              <w:t>Hvor lang tid må der gå, før det genstarter?</w:t>
             </w:r>
           </w:p>
         </w:tc>
@@ -3083,19 +3794,29 @@
           <w:p>
             <w:pPr>
               <w:pStyle w:val="TableContents"/>
-              <w:bidi w:val="0"/>
-              <w:spacing w:before="0" w:after="160"/>
-              <w:rPr>
-                <w:rFonts w:ascii="Liberation Sans" w:hAnsi="Liberation Sans" w:eastAsia="DejaVu Sans" w:cs="DejaVu Sans"/>
-                <w:sz w:val="24"/>
-                <w:szCs w:val="24"/>
-              </w:rPr>
-            </w:pPr>
-            <w:r>
-              <w:rPr>
-                <w:rFonts w:eastAsia="DejaVu Sans" w:cs="DejaVu Sans" w:ascii="Liberation Sans" w:hAnsi="Liberation Sans"/>
-                <w:sz w:val="24"/>
-                <w:szCs w:val="24"/>
+              <w:suppressAutoHyphens w:val="true"/>
+              <w:bidi w:val="0"/>
+              <w:spacing w:lineRule="auto" w:line="259" w:before="0" w:after="160"/>
+              <w:jc w:val="start"/>
+              <w:rPr>
+                <w:rFonts w:ascii="Liberation Sans" w:hAnsi="Liberation Sans" w:eastAsia="DejaVu Sans" w:cs="DejaVu Sans"/>
+                <w:color w:val="auto"/>
+                <w:kern w:val="2"/>
+                <w:sz w:val="24"/>
+                <w:szCs w:val="24"/>
+                <w:lang w:val="da-DK" w:eastAsia="en-US" w:bidi="ar-SA"/>
+                <w14:ligatures w14:val="standardContextual"/>
+              </w:rPr>
+            </w:pPr>
+            <w:r>
+              <w:rPr>
+                <w:rFonts w:eastAsia="DejaVu Sans" w:cs="DejaVu Sans" w:ascii="Liberation Sans" w:hAnsi="Liberation Sans"/>
+                <w:color w:val="auto"/>
+                <w:kern w:val="2"/>
+                <w:sz w:val="24"/>
+                <w:szCs w:val="24"/>
+                <w:lang w:val="da-DK" w:eastAsia="en-US" w:bidi="ar-SA"/>
+                <w14:ligatures w14:val="standardContextual"/>
               </w:rPr>
               <w:t>K-016</w:t>
             </w:r>
@@ -3112,18 +3833,29 @@
           <w:p>
             <w:pPr>
               <w:pStyle w:val="TableContents"/>
-              <w:spacing w:before="0" w:after="160"/>
-              <w:rPr>
-                <w:rFonts w:ascii="Liberation Sans" w:hAnsi="Liberation Sans" w:eastAsia="DejaVu Sans" w:cs="DejaVu Sans"/>
-                <w:sz w:val="24"/>
-                <w:szCs w:val="24"/>
-              </w:rPr>
-            </w:pPr>
-            <w:r>
-              <w:rPr>
-                <w:rFonts w:eastAsia="DejaVu Sans" w:cs="DejaVu Sans" w:ascii="Liberation Sans" w:hAnsi="Liberation Sans"/>
-                <w:sz w:val="24"/>
-                <w:szCs w:val="24"/>
+              <w:suppressAutoHyphens w:val="true"/>
+              <w:bidi w:val="0"/>
+              <w:spacing w:lineRule="auto" w:line="259" w:before="0" w:after="160"/>
+              <w:jc w:val="start"/>
+              <w:rPr>
+                <w:rFonts w:ascii="Liberation Sans" w:hAnsi="Liberation Sans" w:eastAsia="DejaVu Sans" w:cs="DejaVu Sans"/>
+                <w:color w:val="auto"/>
+                <w:kern w:val="2"/>
+                <w:sz w:val="24"/>
+                <w:szCs w:val="24"/>
+                <w:lang w:val="da-DK" w:eastAsia="en-US" w:bidi="ar-SA"/>
+                <w14:ligatures w14:val="standardContextual"/>
+              </w:rPr>
+            </w:pPr>
+            <w:r>
+              <w:rPr>
+                <w:rFonts w:eastAsia="DejaVu Sans" w:cs="DejaVu Sans" w:ascii="Liberation Sans" w:hAnsi="Liberation Sans"/>
+                <w:color w:val="auto"/>
+                <w:kern w:val="2"/>
+                <w:sz w:val="24"/>
+                <w:szCs w:val="24"/>
+                <w:lang w:val="da-DK" w:eastAsia="en-US" w:bidi="ar-SA"/>
+                <w14:ligatures w14:val="standardContextual"/>
               </w:rPr>
               <w:t>Overvågning</w:t>
             </w:r>
@@ -3242,7 +3974,7 @@
                 <w:lang w:val="da-DK" w:eastAsia="en-US" w:bidi="ar-SA"/>
                 <w14:ligatures w14:val="standardContextual"/>
               </w:rPr>
-              <w:t>Systemet skal på en lokal webside vise aktuel luftfugtighed, om affugteren er tændt eller slukket, aktuel driftstilstand (normal, kritisk, sikker tilstand, uden elpriser), dagens billigste periode og aktive fejl.</w:t>
+              <w:t>Systemet skal på en lokal webside vise aktuel luftfugtighed, om affugteren er tændt eller slukket, aktuel driftstilstand (normal, kritisk, dark time, sensorfejl, uden elpriser), dagens prisgrænse og billige kvarterer samt aktive fejl.</w:t>
             </w:r>
           </w:p>
         </w:tc>
@@ -3299,18 +4031,29 @@
           <w:p>
             <w:pPr>
               <w:pStyle w:val="TableContents"/>
-              <w:spacing w:before="0" w:after="160"/>
-              <w:rPr>
-                <w:rFonts w:ascii="Liberation Sans" w:hAnsi="Liberation Sans" w:eastAsia="DejaVu Sans" w:cs="DejaVu Sans"/>
-                <w:sz w:val="24"/>
-                <w:szCs w:val="24"/>
-              </w:rPr>
-            </w:pPr>
-            <w:r>
-              <w:rPr>
-                <w:rFonts w:eastAsia="DejaVu Sans" w:cs="DejaVu Sans" w:ascii="Liberation Sans" w:hAnsi="Liberation Sans"/>
-                <w:sz w:val="24"/>
-                <w:szCs w:val="24"/>
+              <w:suppressAutoHyphens w:val="true"/>
+              <w:bidi w:val="0"/>
+              <w:spacing w:lineRule="auto" w:line="259" w:before="0" w:after="160"/>
+              <w:jc w:val="start"/>
+              <w:rPr>
+                <w:rFonts w:ascii="Liberation Sans" w:hAnsi="Liberation Sans" w:eastAsia="DejaVu Sans" w:cs="DejaVu Sans"/>
+                <w:color w:val="auto"/>
+                <w:kern w:val="2"/>
+                <w:sz w:val="24"/>
+                <w:szCs w:val="24"/>
+                <w:lang w:val="da-DK" w:eastAsia="en-US" w:bidi="ar-SA"/>
+                <w14:ligatures w14:val="standardContextual"/>
+              </w:rPr>
+            </w:pPr>
+            <w:r>
+              <w:rPr>
+                <w:rFonts w:eastAsia="DejaVu Sans" w:cs="DejaVu Sans" w:ascii="Liberation Sans" w:hAnsi="Liberation Sans"/>
+                <w:color w:val="auto"/>
+                <w:kern w:val="2"/>
+                <w:sz w:val="24"/>
+                <w:szCs w:val="24"/>
+                <w:lang w:val="da-DK" w:eastAsia="en-US" w:bidi="ar-SA"/>
+                <w14:ligatures w14:val="standardContextual"/>
               </w:rPr>
               <w:t>K-017</w:t>
             </w:r>
@@ -3327,18 +4070,29 @@
           <w:p>
             <w:pPr>
               <w:pStyle w:val="TableContents"/>
-              <w:spacing w:before="0" w:after="160"/>
-              <w:rPr>
-                <w:rFonts w:ascii="Liberation Sans" w:hAnsi="Liberation Sans" w:eastAsia="DejaVu Sans" w:cs="DejaVu Sans"/>
-                <w:sz w:val="24"/>
-                <w:szCs w:val="24"/>
-              </w:rPr>
-            </w:pPr>
-            <w:r>
-              <w:rPr>
-                <w:rFonts w:eastAsia="DejaVu Sans" w:cs="DejaVu Sans" w:ascii="Liberation Sans" w:hAnsi="Liberation Sans"/>
-                <w:sz w:val="24"/>
-                <w:szCs w:val="24"/>
+              <w:suppressAutoHyphens w:val="true"/>
+              <w:bidi w:val="0"/>
+              <w:spacing w:lineRule="auto" w:line="259" w:before="0" w:after="160"/>
+              <w:jc w:val="start"/>
+              <w:rPr>
+                <w:rFonts w:ascii="Liberation Sans" w:hAnsi="Liberation Sans" w:eastAsia="DejaVu Sans" w:cs="DejaVu Sans"/>
+                <w:color w:val="auto"/>
+                <w:kern w:val="2"/>
+                <w:sz w:val="24"/>
+                <w:szCs w:val="24"/>
+                <w:lang w:val="da-DK" w:eastAsia="en-US" w:bidi="ar-SA"/>
+                <w14:ligatures w14:val="standardContextual"/>
+              </w:rPr>
+            </w:pPr>
+            <w:r>
+              <w:rPr>
+                <w:rFonts w:eastAsia="DejaVu Sans" w:cs="DejaVu Sans" w:ascii="Liberation Sans" w:hAnsi="Liberation Sans"/>
+                <w:color w:val="auto"/>
+                <w:kern w:val="2"/>
+                <w:sz w:val="24"/>
+                <w:szCs w:val="24"/>
+                <w:lang w:val="da-DK" w:eastAsia="en-US" w:bidi="ar-SA"/>
+                <w14:ligatures w14:val="standardContextual"/>
               </w:rPr>
               <w:t>Driftssikkerhed</w:t>
             </w:r>
@@ -3507,6 +4261,273 @@
           <w:tcPr>
             <w:tcW w:w="805" w:type="dxa"/>
             <w:tcBorders>
+              <w:bottom w:val="single" w:sz="4" w:space="0" w:color="999999"/>
+            </w:tcBorders>
+            <w:shd w:fill="EEEEEE" w:val="clear"/>
+          </w:tcPr>
+          <w:p>
+            <w:pPr>
+              <w:pStyle w:val="TableContents"/>
+              <w:suppressAutoHyphens w:val="true"/>
+              <w:bidi w:val="0"/>
+              <w:spacing w:lineRule="auto" w:line="259" w:before="0" w:after="160"/>
+              <w:jc w:val="start"/>
+              <w:rPr>
+                <w:rFonts w:ascii="Liberation Sans" w:hAnsi="Liberation Sans" w:eastAsia="DejaVu Sans" w:cs="DejaVu Sans"/>
+                <w:color w:val="auto"/>
+                <w:kern w:val="2"/>
+                <w:sz w:val="24"/>
+                <w:szCs w:val="24"/>
+                <w:lang w:val="da-DK" w:eastAsia="en-US" w:bidi="ar-SA"/>
+                <w14:ligatures w14:val="standardContextual"/>
+              </w:rPr>
+            </w:pPr>
+            <w:r>
+              <w:rPr>
+                <w:rFonts w:eastAsia="DejaVu Sans" w:cs="DejaVu Sans" w:ascii="Liberation Sans" w:hAnsi="Liberation Sans"/>
+                <w:color w:val="auto"/>
+                <w:kern w:val="2"/>
+                <w:sz w:val="24"/>
+                <w:szCs w:val="24"/>
+                <w:lang w:val="da-DK" w:eastAsia="en-US" w:bidi="ar-SA"/>
+                <w14:ligatures w14:val="standardContextual"/>
+              </w:rPr>
+              <w:t>K-018</w:t>
+            </w:r>
+          </w:p>
+        </w:tc>
+        <w:tc>
+          <w:tcPr>
+            <w:tcW w:w="1256" w:type="dxa"/>
+            <w:tcBorders>
+              <w:bottom w:val="single" w:sz="4" w:space="0" w:color="999999"/>
+            </w:tcBorders>
+            <w:shd w:fill="EEEEEE" w:val="clear"/>
+          </w:tcPr>
+          <w:p>
+            <w:pPr>
+              <w:pStyle w:val="TableContents"/>
+              <w:suppressAutoHyphens w:val="true"/>
+              <w:bidi w:val="0"/>
+              <w:spacing w:lineRule="auto" w:line="259" w:before="0" w:after="160"/>
+              <w:jc w:val="start"/>
+              <w:rPr>
+                <w:rFonts w:ascii="Liberation Sans" w:hAnsi="Liberation Sans" w:eastAsia="DejaVu Sans" w:cs="DejaVu Sans"/>
+                <w:color w:val="auto"/>
+                <w:kern w:val="2"/>
+                <w:sz w:val="24"/>
+                <w:szCs w:val="24"/>
+                <w:lang w:val="da-DK" w:eastAsia="en-US" w:bidi="ar-SA"/>
+                <w14:ligatures w14:val="standardContextual"/>
+              </w:rPr>
+            </w:pPr>
+            <w:r>
+              <w:rPr>
+                <w:rFonts w:eastAsia="DejaVu Sans" w:cs="DejaVu Sans" w:ascii="Liberation Sans" w:hAnsi="Liberation Sans"/>
+                <w:color w:val="auto"/>
+                <w:kern w:val="2"/>
+                <w:sz w:val="24"/>
+                <w:szCs w:val="24"/>
+                <w:lang w:val="da-DK" w:eastAsia="en-US" w:bidi="ar-SA"/>
+                <w14:ligatures w14:val="standardContextual"/>
+              </w:rPr>
+              <w:t>Styring</w:t>
+            </w:r>
+          </w:p>
+        </w:tc>
+        <w:tc>
+          <w:tcPr>
+            <w:tcW w:w="3078" w:type="dxa"/>
+            <w:tcBorders>
+              <w:bottom w:val="single" w:sz="4" w:space="0" w:color="999999"/>
+            </w:tcBorders>
+            <w:shd w:fill="EEEEEE" w:val="clear"/>
+          </w:tcPr>
+          <w:p>
+            <w:pPr>
+              <w:pStyle w:val="TableContents"/>
+              <w:suppressAutoHyphens w:val="true"/>
+              <w:bidi w:val="0"/>
+              <w:spacing w:lineRule="auto" w:line="259" w:before="0" w:after="160"/>
+              <w:jc w:val="start"/>
+              <w:rPr>
+                <w:rFonts w:ascii="Liberation Sans" w:hAnsi="Liberation Sans" w:eastAsia="DejaVu Sans" w:cs="DejaVu Sans"/>
+                <w:color w:val="auto"/>
+                <w:kern w:val="2"/>
+                <w:sz w:val="24"/>
+                <w:szCs w:val="24"/>
+                <w:lang w:val="da-DK" w:eastAsia="en-US" w:bidi="ar-SA"/>
+                <w14:ligatures w14:val="standardContextual"/>
+              </w:rPr>
+            </w:pPr>
+            <w:r>
+              <w:rPr>
+                <w:rFonts w:eastAsia="DejaVu Sans" w:cs="DejaVu Sans" w:ascii="Liberation Sans" w:hAnsi="Liberation Sans"/>
+                <w:color w:val="auto"/>
+                <w:kern w:val="2"/>
+                <w:sz w:val="24"/>
+                <w:szCs w:val="24"/>
+                <w:lang w:val="da-DK" w:eastAsia="en-US" w:bidi="ar-SA"/>
+                <w14:ligatures w14:val="standardContextual"/>
+              </w:rPr>
+              <w:t>Dark time: igen drift om natten af hensyn til støj</w:t>
+            </w:r>
+          </w:p>
+        </w:tc>
+        <w:tc>
+          <w:tcPr>
+            <w:tcW w:w="1351" w:type="dxa"/>
+            <w:tcBorders>
+              <w:bottom w:val="single" w:sz="4" w:space="0" w:color="999999"/>
+            </w:tcBorders>
+            <w:shd w:fill="EEEEEE" w:val="clear"/>
+          </w:tcPr>
+          <w:p>
+            <w:pPr>
+              <w:pStyle w:val="TableContents"/>
+              <w:suppressAutoHyphens w:val="true"/>
+              <w:bidi w:val="0"/>
+              <w:spacing w:lineRule="auto" w:line="259" w:before="0" w:after="160"/>
+              <w:jc w:val="start"/>
+              <w:rPr>
+                <w:rFonts w:ascii="Liberation Sans" w:hAnsi="Liberation Sans" w:eastAsia="DejaVu Sans" w:cs="DejaVu Sans"/>
+                <w:color w:val="auto"/>
+                <w:kern w:val="2"/>
+                <w:sz w:val="24"/>
+                <w:szCs w:val="24"/>
+                <w:lang w:val="da-DK" w:eastAsia="en-US" w:bidi="ar-SA"/>
+                <w14:ligatures w14:val="standardContextual"/>
+              </w:rPr>
+            </w:pPr>
+            <w:r>
+              <w:rPr>
+                <w:rFonts w:eastAsia="DejaVu Sans" w:cs="DejaVu Sans" w:ascii="Liberation Sans" w:hAnsi="Liberation Sans"/>
+                <w:color w:val="auto"/>
+                <w:kern w:val="2"/>
+                <w:sz w:val="24"/>
+                <w:szCs w:val="24"/>
+                <w:lang w:val="da-DK" w:eastAsia="en-US" w:bidi="ar-SA"/>
+                <w14:ligatures w14:val="standardContextual"/>
+              </w:rPr>
+              <w:t>Funktionelt</w:t>
+            </w:r>
+          </w:p>
+        </w:tc>
+        <w:tc>
+          <w:tcPr>
+            <w:tcW w:w="4669" w:type="dxa"/>
+            <w:tcBorders>
+              <w:bottom w:val="single" w:sz="4" w:space="0" w:color="999999"/>
+            </w:tcBorders>
+            <w:shd w:fill="EEEEEE" w:val="clear"/>
+          </w:tcPr>
+          <w:p>
+            <w:pPr>
+              <w:pStyle w:val="TableContents"/>
+              <w:suppressAutoHyphens w:val="true"/>
+              <w:bidi w:val="0"/>
+              <w:spacing w:lineRule="auto" w:line="259" w:before="0" w:after="160"/>
+              <w:jc w:val="start"/>
+              <w:rPr>
+                <w:rFonts w:ascii="Liberation Sans" w:hAnsi="Liberation Sans" w:eastAsia="DejaVu Sans" w:cs="DejaVu Sans"/>
+                <w:color w:val="auto"/>
+                <w:kern w:val="2"/>
+                <w:sz w:val="24"/>
+                <w:szCs w:val="24"/>
+                <w:lang w:val="da-DK" w:eastAsia="en-US" w:bidi="ar-SA"/>
+                <w14:ligatures w14:val="standardContextual"/>
+              </w:rPr>
+            </w:pPr>
+            <w:r>
+              <w:rPr>
+                <w:rFonts w:eastAsia="DejaVu Sans" w:cs="DejaVu Sans" w:ascii="Liberation Sans" w:hAnsi="Liberation Sans"/>
+                <w:color w:val="auto"/>
+                <w:kern w:val="2"/>
+                <w:sz w:val="24"/>
+                <w:szCs w:val="24"/>
+                <w:lang w:val="da-DK" w:eastAsia="en-US" w:bidi="ar-SA"/>
+                <w14:ligatures w14:val="standardContextual"/>
+              </w:rPr>
+              <w:t>Affugteren må ikke være tændt mellem kl. 22.00 og 06.00 (dark time), heller ikke når luftfugtigheden overstiger den kritiske grænse. Kører affugteren kl. 22.00, slukkes den.</w:t>
+            </w:r>
+          </w:p>
+          <w:p>
+            <w:pPr>
+              <w:pStyle w:val="TableContents"/>
+              <w:suppressAutoHyphens w:val="true"/>
+              <w:bidi w:val="0"/>
+              <w:spacing w:lineRule="auto" w:line="259" w:before="0" w:after="160"/>
+              <w:jc w:val="start"/>
+              <w:rPr>
+                <w:rFonts w:ascii="Liberation Sans" w:hAnsi="Liberation Sans" w:eastAsia="DejaVu Sans" w:cs="DejaVu Sans"/>
+                <w:color w:val="auto"/>
+                <w:kern w:val="2"/>
+                <w:sz w:val="24"/>
+                <w:szCs w:val="24"/>
+                <w:lang w:val="da-DK" w:eastAsia="en-US" w:bidi="ar-SA"/>
+                <w14:ligatures w14:val="standardContextual"/>
+              </w:rPr>
+            </w:pPr>
+            <w:r>
+              <w:rPr>
+                <w:rFonts w:eastAsia="DejaVu Sans" w:cs="DejaVu Sans" w:ascii="Liberation Sans" w:hAnsi="Liberation Sans"/>
+                <w:color w:val="auto"/>
+                <w:kern w:val="2"/>
+                <w:sz w:val="24"/>
+                <w:szCs w:val="24"/>
+                <w:lang w:val="da-DK" w:eastAsia="en-US" w:bidi="ar-SA"/>
+                <w14:ligatures w14:val="standardContextual"/>
+              </w:rPr>
+              <w:t>K-018 har forrang for alle regler, der tænder affugteren (K-004, K-005, K-011).</w:t>
+            </w:r>
+          </w:p>
+        </w:tc>
+        <w:tc>
+          <w:tcPr>
+            <w:tcW w:w="2799" w:type="dxa"/>
+            <w:tcBorders>
+              <w:bottom w:val="single" w:sz="4" w:space="0" w:color="999999"/>
+            </w:tcBorders>
+            <w:shd w:fill="EEEEEE" w:val="clear"/>
+          </w:tcPr>
+          <w:p>
+            <w:pPr>
+              <w:pStyle w:val="TableContents"/>
+              <w:suppressAutoHyphens w:val="true"/>
+              <w:bidi w:val="0"/>
+              <w:spacing w:lineRule="auto" w:line="259" w:before="0" w:after="160"/>
+              <w:jc w:val="start"/>
+              <w:rPr>
+                <w:rFonts w:ascii="Liberation Sans" w:hAnsi="Liberation Sans" w:eastAsia="DejaVu Sans" w:cs="DejaVu Sans"/>
+                <w:color w:val="auto"/>
+                <w:kern w:val="2"/>
+                <w:sz w:val="24"/>
+                <w:szCs w:val="24"/>
+                <w:lang w:val="da-DK" w:eastAsia="en-US" w:bidi="ar-SA"/>
+                <w14:ligatures w14:val="standardContextual"/>
+              </w:rPr>
+            </w:pPr>
+            <w:r>
+              <w:rPr>
+                <w:rFonts w:eastAsia="DejaVu Sans" w:cs="DejaVu Sans" w:ascii="Liberation Sans" w:hAnsi="Liberation Sans"/>
+                <w:color w:val="auto"/>
+                <w:kern w:val="2"/>
+                <w:sz w:val="24"/>
+                <w:szCs w:val="24"/>
+                <w:lang w:val="da-DK" w:eastAsia="en-US" w:bidi="ar-SA"/>
+                <w14:ligatures w14:val="standardContextual"/>
+              </w:rPr>
+              <w:t>Skal tidsrummet kunne ændres af brugeren?</w:t>
+            </w:r>
+          </w:p>
+        </w:tc>
+      </w:tr>
+      <w:tr>
+        <w:trPr/>
+        <w:tc>
+          <w:tcPr>
+            <w:tcW w:w="805" w:type="dxa"/>
+            <w:tcBorders>
               <w:bottom w:val="single" w:sz="12" w:space="0" w:color="000000"/>
             </w:tcBorders>
             <w:shd w:fill="FFFFFF" w:val="clear"/>
@@ -3514,18 +4535,29 @@
           <w:p>
             <w:pPr>
               <w:pStyle w:val="TableContents"/>
-              <w:spacing w:before="0" w:after="160"/>
-              <w:rPr>
-                <w:rFonts w:ascii="Liberation Sans" w:hAnsi="Liberation Sans" w:eastAsia="DejaVu Sans" w:cs="DejaVu Sans"/>
-                <w:sz w:val="24"/>
-                <w:szCs w:val="24"/>
-              </w:rPr>
-            </w:pPr>
-            <w:r>
-              <w:rPr>
-                <w:rFonts w:eastAsia="DejaVu Sans" w:cs="DejaVu Sans" w:ascii="Liberation Sans" w:hAnsi="Liberation Sans"/>
-                <w:sz w:val="24"/>
-                <w:szCs w:val="24"/>
+              <w:suppressAutoHyphens w:val="true"/>
+              <w:bidi w:val="0"/>
+              <w:spacing w:lineRule="auto" w:line="259" w:before="0" w:after="160"/>
+              <w:jc w:val="start"/>
+              <w:rPr>
+                <w:rFonts w:ascii="Liberation Sans" w:hAnsi="Liberation Sans" w:eastAsia="DejaVu Sans" w:cs="DejaVu Sans"/>
+                <w:color w:val="auto"/>
+                <w:kern w:val="2"/>
+                <w:sz w:val="24"/>
+                <w:szCs w:val="24"/>
+                <w:lang w:val="da-DK" w:eastAsia="en-US" w:bidi="ar-SA"/>
+                <w14:ligatures w14:val="standardContextual"/>
+              </w:rPr>
+            </w:pPr>
+            <w:r>
+              <w:rPr>
+                <w:rFonts w:eastAsia="DejaVu Sans" w:cs="DejaVu Sans" w:ascii="Liberation Sans" w:hAnsi="Liberation Sans"/>
+                <w:color w:val="auto"/>
+                <w:kern w:val="2"/>
+                <w:sz w:val="24"/>
+                <w:szCs w:val="24"/>
+                <w:lang w:val="da-DK" w:eastAsia="en-US" w:bidi="ar-SA"/>
+                <w14:ligatures w14:val="standardContextual"/>
               </w:rPr>
             </w:r>
           </w:p>
@@ -3541,18 +4573,29 @@
           <w:p>
             <w:pPr>
               <w:pStyle w:val="TableContents"/>
-              <w:spacing w:before="0" w:after="160"/>
-              <w:rPr>
-                <w:rFonts w:ascii="Liberation Sans" w:hAnsi="Liberation Sans" w:eastAsia="DejaVu Sans" w:cs="DejaVu Sans"/>
-                <w:sz w:val="24"/>
-                <w:szCs w:val="24"/>
-              </w:rPr>
-            </w:pPr>
-            <w:r>
-              <w:rPr>
-                <w:rFonts w:eastAsia="DejaVu Sans" w:cs="DejaVu Sans" w:ascii="Liberation Sans" w:hAnsi="Liberation Sans"/>
-                <w:sz w:val="24"/>
-                <w:szCs w:val="24"/>
+              <w:suppressAutoHyphens w:val="true"/>
+              <w:bidi w:val="0"/>
+              <w:spacing w:lineRule="auto" w:line="259" w:before="0" w:after="160"/>
+              <w:jc w:val="start"/>
+              <w:rPr>
+                <w:rFonts w:ascii="Liberation Sans" w:hAnsi="Liberation Sans" w:eastAsia="DejaVu Sans" w:cs="DejaVu Sans"/>
+                <w:color w:val="auto"/>
+                <w:kern w:val="2"/>
+                <w:sz w:val="24"/>
+                <w:szCs w:val="24"/>
+                <w:lang w:val="da-DK" w:eastAsia="en-US" w:bidi="ar-SA"/>
+                <w14:ligatures w14:val="standardContextual"/>
+              </w:rPr>
+            </w:pPr>
+            <w:r>
+              <w:rPr>
+                <w:rFonts w:eastAsia="DejaVu Sans" w:cs="DejaVu Sans" w:ascii="Liberation Sans" w:hAnsi="Liberation Sans"/>
+                <w:color w:val="auto"/>
+                <w:kern w:val="2"/>
+                <w:sz w:val="24"/>
+                <w:szCs w:val="24"/>
+                <w:lang w:val="da-DK" w:eastAsia="en-US" w:bidi="ar-SA"/>
+                <w14:ligatures w14:val="standardContextual"/>
               </w:rPr>
             </w:r>
           </w:p>
@@ -3568,18 +4611,29 @@
           <w:p>
             <w:pPr>
               <w:pStyle w:val="TableContents"/>
-              <w:spacing w:before="0" w:after="160"/>
-              <w:rPr>
-                <w:rFonts w:ascii="Liberation Sans" w:hAnsi="Liberation Sans" w:eastAsia="DejaVu Sans" w:cs="DejaVu Sans"/>
-                <w:sz w:val="24"/>
-                <w:szCs w:val="24"/>
-              </w:rPr>
-            </w:pPr>
-            <w:r>
-              <w:rPr>
-                <w:rFonts w:eastAsia="DejaVu Sans" w:cs="DejaVu Sans" w:ascii="Liberation Sans" w:hAnsi="Liberation Sans"/>
-                <w:sz w:val="24"/>
-                <w:szCs w:val="24"/>
+              <w:suppressAutoHyphens w:val="true"/>
+              <w:bidi w:val="0"/>
+              <w:spacing w:lineRule="auto" w:line="259" w:before="0" w:after="160"/>
+              <w:jc w:val="start"/>
+              <w:rPr>
+                <w:rFonts w:ascii="Liberation Sans" w:hAnsi="Liberation Sans" w:eastAsia="DejaVu Sans" w:cs="DejaVu Sans"/>
+                <w:color w:val="auto"/>
+                <w:kern w:val="2"/>
+                <w:sz w:val="24"/>
+                <w:szCs w:val="24"/>
+                <w:lang w:val="da-DK" w:eastAsia="en-US" w:bidi="ar-SA"/>
+                <w14:ligatures w14:val="standardContextual"/>
+              </w:rPr>
+            </w:pPr>
+            <w:r>
+              <w:rPr>
+                <w:rFonts w:eastAsia="DejaVu Sans" w:cs="DejaVu Sans" w:ascii="Liberation Sans" w:hAnsi="Liberation Sans"/>
+                <w:color w:val="auto"/>
+                <w:kern w:val="2"/>
+                <w:sz w:val="24"/>
+                <w:szCs w:val="24"/>
+                <w:lang w:val="da-DK" w:eastAsia="en-US" w:bidi="ar-SA"/>
+                <w14:ligatures w14:val="standardContextual"/>
               </w:rPr>
             </w:r>
           </w:p>
@@ -3595,18 +4649,29 @@
           <w:p>
             <w:pPr>
               <w:pStyle w:val="TableContents"/>
-              <w:spacing w:before="0" w:after="160"/>
-              <w:rPr>
-                <w:rFonts w:ascii="Liberation Sans" w:hAnsi="Liberation Sans" w:eastAsia="DejaVu Sans" w:cs="DejaVu Sans"/>
-                <w:sz w:val="24"/>
-                <w:szCs w:val="24"/>
-              </w:rPr>
-            </w:pPr>
-            <w:r>
-              <w:rPr>
-                <w:rFonts w:eastAsia="DejaVu Sans" w:cs="DejaVu Sans" w:ascii="Liberation Sans" w:hAnsi="Liberation Sans"/>
-                <w:sz w:val="24"/>
-                <w:szCs w:val="24"/>
+              <w:suppressAutoHyphens w:val="true"/>
+              <w:bidi w:val="0"/>
+              <w:spacing w:lineRule="auto" w:line="259" w:before="0" w:after="160"/>
+              <w:jc w:val="start"/>
+              <w:rPr>
+                <w:rFonts w:ascii="Liberation Sans" w:hAnsi="Liberation Sans" w:eastAsia="DejaVu Sans" w:cs="DejaVu Sans"/>
+                <w:color w:val="auto"/>
+                <w:kern w:val="2"/>
+                <w:sz w:val="24"/>
+                <w:szCs w:val="24"/>
+                <w:lang w:val="da-DK" w:eastAsia="en-US" w:bidi="ar-SA"/>
+                <w14:ligatures w14:val="standardContextual"/>
+              </w:rPr>
+            </w:pPr>
+            <w:r>
+              <w:rPr>
+                <w:rFonts w:eastAsia="DejaVu Sans" w:cs="DejaVu Sans" w:ascii="Liberation Sans" w:hAnsi="Liberation Sans"/>
+                <w:color w:val="auto"/>
+                <w:kern w:val="2"/>
+                <w:sz w:val="24"/>
+                <w:szCs w:val="24"/>
+                <w:lang w:val="da-DK" w:eastAsia="en-US" w:bidi="ar-SA"/>
+                <w14:ligatures w14:val="standardContextual"/>
               </w:rPr>
             </w:r>
           </w:p>
@@ -3622,18 +4687,29 @@
           <w:p>
             <w:pPr>
               <w:pStyle w:val="TableContents"/>
-              <w:spacing w:before="0" w:after="160"/>
-              <w:rPr>
-                <w:rFonts w:ascii="Liberation Sans" w:hAnsi="Liberation Sans" w:eastAsia="DejaVu Sans" w:cs="DejaVu Sans"/>
-                <w:sz w:val="24"/>
-                <w:szCs w:val="24"/>
-              </w:rPr>
-            </w:pPr>
-            <w:r>
-              <w:rPr>
-                <w:rFonts w:eastAsia="DejaVu Sans" w:cs="DejaVu Sans" w:ascii="Liberation Sans" w:hAnsi="Liberation Sans"/>
-                <w:sz w:val="24"/>
-                <w:szCs w:val="24"/>
+              <w:suppressAutoHyphens w:val="true"/>
+              <w:bidi w:val="0"/>
+              <w:spacing w:lineRule="auto" w:line="259" w:before="0" w:after="160"/>
+              <w:jc w:val="start"/>
+              <w:rPr>
+                <w:rFonts w:ascii="Liberation Sans" w:hAnsi="Liberation Sans" w:eastAsia="DejaVu Sans" w:cs="DejaVu Sans"/>
+                <w:color w:val="auto"/>
+                <w:kern w:val="2"/>
+                <w:sz w:val="24"/>
+                <w:szCs w:val="24"/>
+                <w:lang w:val="da-DK" w:eastAsia="en-US" w:bidi="ar-SA"/>
+                <w14:ligatures w14:val="standardContextual"/>
+              </w:rPr>
+            </w:pPr>
+            <w:r>
+              <w:rPr>
+                <w:rFonts w:eastAsia="DejaVu Sans" w:cs="DejaVu Sans" w:ascii="Liberation Sans" w:hAnsi="Liberation Sans"/>
+                <w:color w:val="auto"/>
+                <w:kern w:val="2"/>
+                <w:sz w:val="24"/>
+                <w:szCs w:val="24"/>
+                <w:lang w:val="da-DK" w:eastAsia="en-US" w:bidi="ar-SA"/>
+                <w14:ligatures w14:val="standardContextual"/>
               </w:rPr>
             </w:r>
           </w:p>
@@ -3649,18 +4725,29 @@
           <w:p>
             <w:pPr>
               <w:pStyle w:val="TableContents"/>
-              <w:spacing w:before="0" w:after="160"/>
-              <w:rPr>
-                <w:rFonts w:ascii="Liberation Sans" w:hAnsi="Liberation Sans" w:eastAsia="DejaVu Sans" w:cs="DejaVu Sans"/>
-                <w:sz w:val="24"/>
-                <w:szCs w:val="24"/>
-              </w:rPr>
-            </w:pPr>
-            <w:r>
-              <w:rPr>
-                <w:rFonts w:eastAsia="DejaVu Sans" w:cs="DejaVu Sans" w:ascii="Liberation Sans" w:hAnsi="Liberation Sans"/>
-                <w:sz w:val="24"/>
-                <w:szCs w:val="24"/>
+              <w:suppressAutoHyphens w:val="true"/>
+              <w:bidi w:val="0"/>
+              <w:spacing w:lineRule="auto" w:line="259" w:before="0" w:after="160"/>
+              <w:jc w:val="start"/>
+              <w:rPr>
+                <w:rFonts w:ascii="Liberation Sans" w:hAnsi="Liberation Sans" w:eastAsia="DejaVu Sans" w:cs="DejaVu Sans"/>
+                <w:color w:val="auto"/>
+                <w:kern w:val="2"/>
+                <w:sz w:val="24"/>
+                <w:szCs w:val="24"/>
+                <w:lang w:val="da-DK" w:eastAsia="en-US" w:bidi="ar-SA"/>
+                <w14:ligatures w14:val="standardContextual"/>
+              </w:rPr>
+            </w:pPr>
+            <w:r>
+              <w:rPr>
+                <w:rFonts w:eastAsia="DejaVu Sans" w:cs="DejaVu Sans" w:ascii="Liberation Sans" w:hAnsi="Liberation Sans"/>
+                <w:color w:val="auto"/>
+                <w:kern w:val="2"/>
+                <w:sz w:val="24"/>
+                <w:szCs w:val="24"/>
+                <w:lang w:val="da-DK" w:eastAsia="en-US" w:bidi="ar-SA"/>
+                <w14:ligatures w14:val="standardContextual"/>
               </w:rPr>
             </w:r>
           </w:p>

</xml_diff>